<commit_message>
Added github repo link to title page
</commit_message>
<xml_diff>
--- a/SEN_381_Project_Miletone_1.docx
+++ b/SEN_381_Project_Miletone_1.docx
@@ -5,6 +5,7 @@
     <w:sdt>
       <w:sdtPr>
         <w:rPr>
+          <w:rFonts w:eastAsiaTheme="minorHAnsi"/>
           <w:color w:val="156082" w:themeColor="accent1"/>
           <w:kern w:val="2"/>
           <w:sz w:val="24"/>
@@ -430,19 +431,7 @@
                                   <w:rPr>
                                     <w:color w:val="156082" w:themeColor="accent1"/>
                                   </w:rPr>
-                                  <w:t>PA</w:t>
-                                </w:r>
-                                <w:r>
-                                  <w:rPr>
-                                    <w:color w:val="156082" w:themeColor="accent1"/>
-                                  </w:rPr>
-                                  <w:t>U</w:t>
-                                </w:r>
-                                <w:r>
-                                  <w:rPr>
-                                    <w:color w:val="156082" w:themeColor="accent1"/>
-                                  </w:rPr>
-                                  <w:t>L EDWARD VAN ZYL 601731</w:t>
+                                  <w:t>PAUL EDWARD VAN ZYL 601731</w:t>
                                 </w:r>
                               </w:p>
                               <w:p>
@@ -459,6 +448,35 @@
                                   </w:rPr>
                                   <w:t>REGARDT OSLER 601626</w:t>
                                 </w:r>
+                              </w:p>
+                              <w:p>
+                                <w:pPr>
+                                  <w:pStyle w:val="NoSpacing"/>
+                                  <w:jc w:val="center"/>
+                                  <w:rPr>
+                                    <w:color w:val="156082" w:themeColor="accent1"/>
+                                  </w:rPr>
+                                </w:pPr>
+                                <w:hyperlink r:id="rId7" w:history="1">
+                                  <w:r>
+                                    <w:rPr>
+                                      <w:rStyle w:val="Hyperlink"/>
+                                    </w:rPr>
+                                    <w:t>Git</w:t>
+                                  </w:r>
+                                  <w:r>
+                                    <w:rPr>
+                                      <w:rStyle w:val="Hyperlink"/>
+                                    </w:rPr>
+                                    <w:t>H</w:t>
+                                  </w:r>
+                                  <w:r>
+                                    <w:rPr>
+                                      <w:rStyle w:val="Hyperlink"/>
+                                    </w:rPr>
+                                    <w:t>ub Repo</w:t>
+                                  </w:r>
+                                </w:hyperlink>
                               </w:p>
                             </w:txbxContent>
                           </wps:txbx>
@@ -614,19 +632,7 @@
                             <w:rPr>
                               <w:color w:val="156082" w:themeColor="accent1"/>
                             </w:rPr>
-                            <w:t>PA</w:t>
-                          </w:r>
-                          <w:r>
-                            <w:rPr>
-                              <w:color w:val="156082" w:themeColor="accent1"/>
-                            </w:rPr>
-                            <w:t>U</w:t>
-                          </w:r>
-                          <w:r>
-                            <w:rPr>
-                              <w:color w:val="156082" w:themeColor="accent1"/>
-                            </w:rPr>
-                            <w:t>L EDWARD VAN ZYL 601731</w:t>
+                            <w:t>PAUL EDWARD VAN ZYL 601731</w:t>
                           </w:r>
                         </w:p>
                         <w:p>
@@ -644,6 +650,35 @@
                             <w:t>REGARDT OSLER 601626</w:t>
                           </w:r>
                         </w:p>
+                        <w:p>
+                          <w:pPr>
+                            <w:pStyle w:val="NoSpacing"/>
+                            <w:jc w:val="center"/>
+                            <w:rPr>
+                              <w:color w:val="156082" w:themeColor="accent1"/>
+                            </w:rPr>
+                          </w:pPr>
+                          <w:hyperlink r:id="rId8" w:history="1">
+                            <w:r>
+                              <w:rPr>
+                                <w:rStyle w:val="Hyperlink"/>
+                              </w:rPr>
+                              <w:t>Git</w:t>
+                            </w:r>
+                            <w:r>
+                              <w:rPr>
+                                <w:rStyle w:val="Hyperlink"/>
+                              </w:rPr>
+                              <w:t>H</w:t>
+                            </w:r>
+                            <w:r>
+                              <w:rPr>
+                                <w:rStyle w:val="Hyperlink"/>
+                              </w:rPr>
+                              <w:t>ub Repo</w:t>
+                            </w:r>
+                          </w:hyperlink>
+                        </w:p>
                       </w:txbxContent>
                     </v:textbox>
                     <w10:wrap type="square" anchorx="margin" anchory="page"/>
@@ -660,6 +695,15 @@
     </w:sdt>
     <w:sdt>
       <w:sdtPr>
+        <w:rPr>
+          <w:rFonts w:asciiTheme="minorHAnsi" w:eastAsiaTheme="minorHAnsi" w:hAnsiTheme="minorHAnsi" w:cstheme="minorBidi"/>
+          <w:color w:val="auto"/>
+          <w:kern w:val="2"/>
+          <w:sz w:val="24"/>
+          <w:szCs w:val="24"/>
+          <w:lang w:val="en-ZA"/>
+          <w14:ligatures w14:val="standardContextual"/>
+        </w:rPr>
         <w:id w:val="142165682"/>
         <w:docPartObj>
           <w:docPartGallery w:val="Table of Contents"/>
@@ -668,16 +712,9 @@
       </w:sdtPr>
       <w:sdtEndPr>
         <w:rPr>
-          <w:rFonts w:asciiTheme="minorHAnsi" w:eastAsiaTheme="minorHAnsi" w:hAnsiTheme="minorHAnsi" w:cstheme="minorBidi"/>
           <w:b/>
           <w:bCs/>
           <w:noProof/>
-          <w:color w:val="auto"/>
-          <w:kern w:val="2"/>
-          <w:sz w:val="24"/>
-          <w:szCs w:val="24"/>
-          <w:lang w:val="en-ZA"/>
-          <w14:ligatures w14:val="standardContextual"/>
         </w:rPr>
       </w:sdtEndPr>
       <w:sdtContent>
@@ -690,32 +727,17 @@
           </w:r>
         </w:p>
         <w:p>
-          <w:r>
-            <w:fldChar w:fldCharType="begin"/>
-          </w:r>
-          <w:r>
-            <w:instrText xml:space="preserve"> TOC \o "1-3" \h \z \u </w:instrText>
-          </w:r>
-          <w:r>
-            <w:fldChar w:fldCharType="separate"/>
-          </w:r>
-          <w:r>
-            <w:rPr>
-              <w:b/>
-              <w:bCs/>
-              <w:noProof/>
-              <w:lang w:val="en-US"/>
-            </w:rPr>
-            <w:t>No table of contents entries found.</w:t>
-          </w:r>
-          <w:r>
-            <w:rPr>
-              <w:b/>
-              <w:bCs/>
-              <w:noProof/>
-            </w:rPr>
-            <w:fldChar w:fldCharType="end"/>
-          </w:r>
+          <w:fldSimple w:instr=" TOC \o &quot;1-3&quot; \h \z \u ">
+            <w:r>
+              <w:rPr>
+                <w:b/>
+                <w:bCs/>
+                <w:noProof/>
+                <w:lang w:val="en-US"/>
+              </w:rPr>
+              <w:t>No table of contents entries found.</w:t>
+            </w:r>
+          </w:fldSimple>
         </w:p>
       </w:sdtContent>
     </w:sdt>
@@ -1796,6 +1818,41 @@
       <w14:ligatures w14:val="none"/>
     </w:rPr>
   </w:style>
+  <w:style w:type="character" w:styleId="Hyperlink">
+    <w:name w:val="Hyperlink"/>
+    <w:basedOn w:val="DefaultParagraphFont"/>
+    <w:uiPriority w:val="99"/>
+    <w:unhideWhenUsed/>
+    <w:rsid w:val="00A20548"/>
+    <w:rPr>
+      <w:color w:val="467886" w:themeColor="hyperlink"/>
+      <w:u w:val="single"/>
+    </w:rPr>
+  </w:style>
+  <w:style w:type="character" w:styleId="UnresolvedMention">
+    <w:name w:val="Unresolved Mention"/>
+    <w:basedOn w:val="DefaultParagraphFont"/>
+    <w:uiPriority w:val="99"/>
+    <w:semiHidden/>
+    <w:unhideWhenUsed/>
+    <w:rsid w:val="00A20548"/>
+    <w:rPr>
+      <w:color w:val="605E5C"/>
+      <w:shd w:val="clear" w:color="auto" w:fill="E1DFDD"/>
+    </w:rPr>
+  </w:style>
+  <w:style w:type="character" w:styleId="FollowedHyperlink">
+    <w:name w:val="FollowedHyperlink"/>
+    <w:basedOn w:val="DefaultParagraphFont"/>
+    <w:uiPriority w:val="99"/>
+    <w:semiHidden/>
+    <w:unhideWhenUsed/>
+    <w:rsid w:val="00A20548"/>
+    <w:rPr>
+      <w:color w:val="96607D" w:themeColor="followedHyperlink"/>
+      <w:u w:val="single"/>
+    </w:rPr>
+  </w:style>
 </w:styles>
 </file>
 
@@ -1879,7 +1936,6 @@
     <w:sig w:usb0="20000287" w:usb1="00000003" w:usb2="00000000" w:usb3="00000000" w:csb0="0000019F" w:csb1="00000000"/>
   </w:font>
   <w:font w:name="Times New Roman">
-    <w:altName w:val="Times New Roman PSMT"/>
     <w:panose1 w:val="02020603050405020304"/>
     <w:charset w:val="00"/>
     <w:family w:val="roman"/>
@@ -1911,7 +1967,9 @@
   </w:compat>
   <w:rsids>
     <w:rsidRoot w:val="006C106A"/>
+    <w:rsid w:val="006B59FC"/>
     <w:rsid w:val="006C106A"/>
+    <w:rsid w:val="00B13C9E"/>
     <w:rsid w:val="00E3330B"/>
     <w:rsid w:val="00ED1F7E"/>
   </w:rsids>

</xml_diff>

<commit_message>
Add FR, NFR, and RTM tables (Acceptance Criteria pending)
- Adds Functional Requirements table (FR-001 to FR-017) with ID, requirement description, source/stakeholder, and priority
- Adds Non-Functional Requirements table (NFR-001 to NFR-008)
- Adds Initial RTM structure tracing source -> requirement

TODO: Acceptance Criteria not yet populated for FRs or NFRs
Refs: PED v1.0, M1 Requirements & Traceability section
</commit_message>
<xml_diff>
--- a/SEN_381_Project_Miletone_1.docx
+++ b/SEN_381_Project_Miletone_1.docx
@@ -55,7 +55,7 @@
                         <pic:cNvPicPr/>
                       </pic:nvPicPr>
                       <pic:blipFill>
-                        <a:blip r:embed="rId5" cstate="print">
+                        <a:blip r:embed="rId8" cstate="print">
                           <a:duotone>
                             <a:schemeClr val="accent1">
                               <a:shade val="45000"/>
@@ -216,7 +216,7 @@
                         <pic:cNvPicPr/>
                       </pic:nvPicPr>
                       <pic:blipFill>
-                        <a:blip r:embed="rId6" cstate="print">
+                        <a:blip r:embed="rId9" cstate="print">
                           <a:duotone>
                             <a:schemeClr val="accent1">
                               <a:shade val="45000"/>
@@ -457,24 +457,12 @@
                                     <w:color w:val="156082" w:themeColor="accent1"/>
                                   </w:rPr>
                                 </w:pPr>
-                                <w:hyperlink r:id="rId7" w:history="1">
+                                <w:hyperlink r:id="rId10" w:history="1">
                                   <w:r>
                                     <w:rPr>
                                       <w:rStyle w:val="Hyperlink"/>
                                     </w:rPr>
-                                    <w:t>Git</w:t>
-                                  </w:r>
-                                  <w:r>
-                                    <w:rPr>
-                                      <w:rStyle w:val="Hyperlink"/>
-                                    </w:rPr>
-                                    <w:t>H</w:t>
-                                  </w:r>
-                                  <w:r>
-                                    <w:rPr>
-                                      <w:rStyle w:val="Hyperlink"/>
-                                    </w:rPr>
-                                    <w:t>ub Repo</w:t>
+                                    <w:t>GitHub Repo</w:t>
                                   </w:r>
                                 </w:hyperlink>
                               </w:p>
@@ -658,7 +646,7 @@
                               <w:color w:val="156082" w:themeColor="accent1"/>
                             </w:rPr>
                           </w:pPr>
-                          <w:hyperlink r:id="rId8" w:history="1">
+                          <w:hyperlink r:id="rId11" w:history="1">
                             <w:r>
                               <w:rPr>
                                 <w:rStyle w:val="Hyperlink"/>
@@ -782,6 +770,1848 @@
     </w:p>
     <w:p>
       <w:pPr>
+        <w:pStyle w:val="Heading2"/>
+      </w:pPr>
+      <w:r>
+        <w:t>Functional</w:t>
+      </w:r>
+      <w:r>
+        <w:t xml:space="preserve"> Requirements (FRs)</w:t>
+      </w:r>
+    </w:p>
+    <w:p>
+      <w:r>
+        <w:t xml:space="preserve">Each </w:t>
+      </w:r>
+      <w:r>
+        <w:t xml:space="preserve">FR below maps to exactly one of the three capability groups in the </w:t>
+      </w:r>
+      <w:r>
+        <w:t>SEN381 Master Brief document under section 3</w:t>
+      </w:r>
+      <w:r>
+        <w:t xml:space="preserve"> namely Requester, Staff and Management</w:t>
+      </w:r>
+      <w:r>
+        <w:t xml:space="preserve"> and a </w:t>
+      </w:r>
+      <w:r>
+        <w:t xml:space="preserve">cross-cutting access control requirement. This </w:t>
+      </w:r>
+      <w:r>
+        <w:t xml:space="preserve">access control requirement exists because sections 4 and 16 of the same master brief document </w:t>
+      </w:r>
+      <w:r>
+        <w:t>treats security as a lifecycle-wide constraint and not just as an afterthought</w:t>
+      </w:r>
+      <w:r>
+        <w:t xml:space="preserve"> and because a request-management platform handling </w:t>
+      </w:r>
+      <w:r>
+        <w:t>potentially</w:t>
+      </w:r>
+      <w:r>
+        <w:t xml:space="preserve"> sensitive information </w:t>
+      </w:r>
+      <w:r>
+        <w:t>cannot be meaningfully evaluated without knowing who is allowed to view</w:t>
+      </w:r>
+      <w:r>
+        <w:t xml:space="preserve"> or act on each FR below.</w:t>
+      </w:r>
+    </w:p>
+    <w:p>
+      <w:r>
+        <w:t>The question, “Does the platform lose its core value proposition without this?”</w:t>
+      </w:r>
+      <w:r>
+        <w:t xml:space="preserve"> was used to determine priorities. </w:t>
+      </w:r>
+      <w:r>
+        <w:t>It is necessary for a requester, staff or manager</w:t>
+      </w:r>
+      <w:r>
+        <w:t xml:space="preserve"> to have everything they need to finish the basic request lifecycle namely submit -</w:t>
+      </w:r>
+      <w:r>
+        <w:t>-</w:t>
+      </w:r>
+      <w:r>
+        <w:t>&gt;</w:t>
+      </w:r>
+      <w:r>
+        <w:t xml:space="preserve"> assign --&gt; action --&gt; resolve --&gt; report. Filtering, over</w:t>
+      </w:r>
+      <w:r>
+        <w:t>due flagging and grouping are examples of convenience features that enhance</w:t>
+      </w:r>
+      <w:r>
+        <w:t xml:space="preserve"> the experience but are not </w:t>
+      </w:r>
+      <w:r>
+        <w:t>essential</w:t>
+      </w:r>
+      <w:r>
+        <w:t xml:space="preserve">. The team could still </w:t>
+      </w:r>
+      <w:r>
+        <w:t xml:space="preserve">present a functional platform without these, but they provide significant </w:t>
+      </w:r>
+      <w:r>
+        <w:t>stakeholder value at a low cost.</w:t>
+      </w:r>
+    </w:p>
+    <w:tbl>
+      <w:tblPr>
+        <w:tblStyle w:val="GridTable2"/>
+        <w:tblW w:w="0" w:type="auto"/>
+        <w:tblLook w:val="04A0" w:firstRow="1" w:lastRow="0" w:firstColumn="1" w:lastColumn="0" w:noHBand="0" w:noVBand="1"/>
+      </w:tblPr>
+      <w:tblGrid>
+        <w:gridCol w:w="993"/>
+        <w:gridCol w:w="2613"/>
+        <w:gridCol w:w="1803"/>
+        <w:gridCol w:w="1112"/>
+      </w:tblGrid>
+      <w:tr>
+        <w:trPr>
+          <w:cnfStyle w:val="100000000000" w:firstRow="1" w:lastRow="0" w:firstColumn="0" w:lastColumn="0" w:oddVBand="0" w:evenVBand="0" w:oddHBand="0" w:evenHBand="0" w:firstRowFirstColumn="0" w:firstRowLastColumn="0" w:lastRowFirstColumn="0" w:lastRowLastColumn="0"/>
+        </w:trPr>
+        <w:tc>
+          <w:tcPr>
+            <w:cnfStyle w:val="001000000000" w:firstRow="0" w:lastRow="0" w:firstColumn="1" w:lastColumn="0" w:oddVBand="0" w:evenVBand="0" w:oddHBand="0" w:evenHBand="0" w:firstRowFirstColumn="0" w:firstRowLastColumn="0" w:lastRowFirstColumn="0" w:lastRowLastColumn="0"/>
+            <w:tcW w:w="993" w:type="dxa"/>
+          </w:tcPr>
+          <w:p>
+            <w:r>
+              <w:t>ID</w:t>
+            </w:r>
+          </w:p>
+        </w:tc>
+        <w:tc>
+          <w:tcPr>
+            <w:tcW w:w="2613" w:type="dxa"/>
+          </w:tcPr>
+          <w:p>
+            <w:pPr>
+              <w:cnfStyle w:val="100000000000" w:firstRow="1" w:lastRow="0" w:firstColumn="0" w:lastColumn="0" w:oddVBand="0" w:evenVBand="0" w:oddHBand="0" w:evenHBand="0" w:firstRowFirstColumn="0" w:firstRowLastColumn="0" w:lastRowFirstColumn="0" w:lastRowLastColumn="0"/>
+            </w:pPr>
+            <w:r>
+              <w:t>Requirement</w:t>
+            </w:r>
+          </w:p>
+        </w:tc>
+        <w:tc>
+          <w:tcPr>
+            <w:tcW w:w="1803" w:type="dxa"/>
+          </w:tcPr>
+          <w:p>
+            <w:pPr>
+              <w:cnfStyle w:val="100000000000" w:firstRow="1" w:lastRow="0" w:firstColumn="0" w:lastColumn="0" w:oddVBand="0" w:evenVBand="0" w:oddHBand="0" w:evenHBand="0" w:firstRowFirstColumn="0" w:firstRowLastColumn="0" w:lastRowFirstColumn="0" w:lastRowLastColumn="0"/>
+            </w:pPr>
+            <w:r>
+              <w:t>Source/ Stakeholder</w:t>
+            </w:r>
+          </w:p>
+        </w:tc>
+        <w:tc>
+          <w:tcPr>
+            <w:tcW w:w="1112" w:type="dxa"/>
+          </w:tcPr>
+          <w:p>
+            <w:pPr>
+              <w:cnfStyle w:val="100000000000" w:firstRow="1" w:lastRow="0" w:firstColumn="0" w:lastColumn="0" w:oddVBand="0" w:evenVBand="0" w:oddHBand="0" w:evenHBand="0" w:firstRowFirstColumn="0" w:firstRowLastColumn="0" w:lastRowFirstColumn="0" w:lastRowLastColumn="0"/>
+            </w:pPr>
+            <w:r>
+              <w:t>Priority</w:t>
+            </w:r>
+          </w:p>
+        </w:tc>
+      </w:tr>
+      <w:tr>
+        <w:trPr>
+          <w:cnfStyle w:val="000000100000" w:firstRow="0" w:lastRow="0" w:firstColumn="0" w:lastColumn="0" w:oddVBand="0" w:evenVBand="0" w:oddHBand="1" w:evenHBand="0" w:firstRowFirstColumn="0" w:firstRowLastColumn="0" w:lastRowFirstColumn="0" w:lastRowLastColumn="0"/>
+        </w:trPr>
+        <w:tc>
+          <w:tcPr>
+            <w:cnfStyle w:val="001000000000" w:firstRow="0" w:lastRow="0" w:firstColumn="1" w:lastColumn="0" w:oddVBand="0" w:evenVBand="0" w:oddHBand="0" w:evenHBand="0" w:firstRowFirstColumn="0" w:firstRowLastColumn="0" w:lastRowFirstColumn="0" w:lastRowLastColumn="0"/>
+            <w:tcW w:w="993" w:type="dxa"/>
+          </w:tcPr>
+          <w:p>
+            <w:r>
+              <w:t>FR-001</w:t>
+            </w:r>
+          </w:p>
+        </w:tc>
+        <w:tc>
+          <w:tcPr>
+            <w:tcW w:w="2613" w:type="dxa"/>
+          </w:tcPr>
+          <w:p>
+            <w:pPr>
+              <w:cnfStyle w:val="000000100000" w:firstRow="0" w:lastRow="0" w:firstColumn="0" w:lastColumn="0" w:oddVBand="0" w:evenVBand="0" w:oddHBand="1" w:evenHBand="0" w:firstRowFirstColumn="0" w:firstRowLastColumn="0" w:lastRowFirstColumn="0" w:lastRowLastColumn="0"/>
+            </w:pPr>
+            <w:r>
+              <w:t>When a requester submits a new service, the system must at least record the category, description, location and requester’s contact information.</w:t>
+            </w:r>
+          </w:p>
+        </w:tc>
+        <w:tc>
+          <w:tcPr>
+            <w:tcW w:w="1803" w:type="dxa"/>
+          </w:tcPr>
+          <w:p>
+            <w:pPr>
+              <w:cnfStyle w:val="000000100000" w:firstRow="0" w:lastRow="0" w:firstColumn="0" w:lastColumn="0" w:oddVBand="0" w:evenVBand="0" w:oddHBand="1" w:evenHBand="0" w:firstRowFirstColumn="0" w:firstRowLastColumn="0" w:lastRowFirstColumn="0" w:lastRowLastColumn="0"/>
+            </w:pPr>
+            <w:r>
+              <w:t>Requester</w:t>
+            </w:r>
+          </w:p>
+        </w:tc>
+        <w:tc>
+          <w:tcPr>
+            <w:tcW w:w="1112" w:type="dxa"/>
+          </w:tcPr>
+          <w:p>
+            <w:pPr>
+              <w:cnfStyle w:val="000000100000" w:firstRow="0" w:lastRow="0" w:firstColumn="0" w:lastColumn="0" w:oddVBand="0" w:evenVBand="0" w:oddHBand="1" w:evenHBand="0" w:firstRowFirstColumn="0" w:firstRowLastColumn="0" w:lastRowFirstColumn="0" w:lastRowLastColumn="0"/>
+            </w:pPr>
+            <w:r>
+              <w:t>Must</w:t>
+            </w:r>
+          </w:p>
+        </w:tc>
+      </w:tr>
+      <w:tr>
+        <w:tc>
+          <w:tcPr>
+            <w:cnfStyle w:val="001000000000" w:firstRow="0" w:lastRow="0" w:firstColumn="1" w:lastColumn="0" w:oddVBand="0" w:evenVBand="0" w:oddHBand="0" w:evenHBand="0" w:firstRowFirstColumn="0" w:firstRowLastColumn="0" w:lastRowFirstColumn="0" w:lastRowLastColumn="0"/>
+            <w:tcW w:w="993" w:type="dxa"/>
+          </w:tcPr>
+          <w:p>
+            <w:r>
+              <w:t>FR-002</w:t>
+            </w:r>
+          </w:p>
+        </w:tc>
+        <w:tc>
+          <w:tcPr>
+            <w:tcW w:w="2613" w:type="dxa"/>
+          </w:tcPr>
+          <w:p>
+            <w:pPr>
+              <w:cnfStyle w:val="000000000000" w:firstRow="0" w:lastRow="0" w:firstColumn="0" w:lastColumn="0" w:oddVBand="0" w:evenVBand="0" w:oddHBand="0" w:evenHBand="0" w:firstRowFirstColumn="0" w:firstRowLastColumn="0" w:lastRowFirstColumn="0" w:lastRowLastColumn="0"/>
+            </w:pPr>
+            <w:r>
+              <w:t>The system should require the requester to choose a category from a predetermined, controlled list.</w:t>
+            </w:r>
+          </w:p>
+        </w:tc>
+        <w:tc>
+          <w:tcPr>
+            <w:tcW w:w="1803" w:type="dxa"/>
+          </w:tcPr>
+          <w:p>
+            <w:pPr>
+              <w:cnfStyle w:val="000000000000" w:firstRow="0" w:lastRow="0" w:firstColumn="0" w:lastColumn="0" w:oddVBand="0" w:evenVBand="0" w:oddHBand="0" w:evenHBand="0" w:firstRowFirstColumn="0" w:firstRowLastColumn="0" w:lastRowFirstColumn="0" w:lastRowLastColumn="0"/>
+            </w:pPr>
+            <w:r>
+              <w:t>Requester</w:t>
+            </w:r>
+          </w:p>
+        </w:tc>
+        <w:tc>
+          <w:tcPr>
+            <w:tcW w:w="1112" w:type="dxa"/>
+          </w:tcPr>
+          <w:p>
+            <w:pPr>
+              <w:cnfStyle w:val="000000000000" w:firstRow="0" w:lastRow="0" w:firstColumn="0" w:lastColumn="0" w:oddVBand="0" w:evenVBand="0" w:oddHBand="0" w:evenHBand="0" w:firstRowFirstColumn="0" w:firstRowLastColumn="0" w:lastRowFirstColumn="0" w:lastRowLastColumn="0"/>
+            </w:pPr>
+            <w:r>
+              <w:t>Must</w:t>
+            </w:r>
+          </w:p>
+        </w:tc>
+      </w:tr>
+      <w:tr>
+        <w:trPr>
+          <w:cnfStyle w:val="000000100000" w:firstRow="0" w:lastRow="0" w:firstColumn="0" w:lastColumn="0" w:oddVBand="0" w:evenVBand="0" w:oddHBand="1" w:evenHBand="0" w:firstRowFirstColumn="0" w:firstRowLastColumn="0" w:lastRowFirstColumn="0" w:lastRowLastColumn="0"/>
+        </w:trPr>
+        <w:tc>
+          <w:tcPr>
+            <w:cnfStyle w:val="001000000000" w:firstRow="0" w:lastRow="0" w:firstColumn="1" w:lastColumn="0" w:oddVBand="0" w:evenVBand="0" w:oddHBand="0" w:evenHBand="0" w:firstRowFirstColumn="0" w:firstRowLastColumn="0" w:lastRowFirstColumn="0" w:lastRowLastColumn="0"/>
+            <w:tcW w:w="993" w:type="dxa"/>
+          </w:tcPr>
+          <w:p>
+            <w:r>
+              <w:lastRenderedPageBreak/>
+              <w:t>FR-003</w:t>
+            </w:r>
+          </w:p>
+        </w:tc>
+        <w:tc>
+          <w:tcPr>
+            <w:tcW w:w="2613" w:type="dxa"/>
+          </w:tcPr>
+          <w:p>
+            <w:pPr>
+              <w:cnfStyle w:val="000000100000" w:firstRow="0" w:lastRow="0" w:firstColumn="0" w:lastColumn="0" w:oddVBand="0" w:evenVBand="0" w:oddHBand="1" w:evenHBand="0" w:firstRowFirstColumn="0" w:firstRowLastColumn="0" w:lastRowFirstColumn="0" w:lastRowLastColumn="0"/>
+            </w:pPr>
+            <w:r>
+              <w:t>A requester should be able to see the status of every request they have submitted through the system.</w:t>
+            </w:r>
+          </w:p>
+        </w:tc>
+        <w:tc>
+          <w:tcPr>
+            <w:tcW w:w="1803" w:type="dxa"/>
+          </w:tcPr>
+          <w:p>
+            <w:pPr>
+              <w:cnfStyle w:val="000000100000" w:firstRow="0" w:lastRow="0" w:firstColumn="0" w:lastColumn="0" w:oddVBand="0" w:evenVBand="0" w:oddHBand="1" w:evenHBand="0" w:firstRowFirstColumn="0" w:firstRowLastColumn="0" w:lastRowFirstColumn="0" w:lastRowLastColumn="0"/>
+            </w:pPr>
+            <w:r>
+              <w:t>Requester</w:t>
+            </w:r>
+          </w:p>
+        </w:tc>
+        <w:tc>
+          <w:tcPr>
+            <w:tcW w:w="1112" w:type="dxa"/>
+          </w:tcPr>
+          <w:p>
+            <w:pPr>
+              <w:cnfStyle w:val="000000100000" w:firstRow="0" w:lastRow="0" w:firstColumn="0" w:lastColumn="0" w:oddVBand="0" w:evenVBand="0" w:oddHBand="1" w:evenHBand="0" w:firstRowFirstColumn="0" w:firstRowLastColumn="0" w:lastRowFirstColumn="0" w:lastRowLastColumn="0"/>
+            </w:pPr>
+            <w:r>
+              <w:t>Must</w:t>
+            </w:r>
+          </w:p>
+        </w:tc>
+      </w:tr>
+      <w:tr>
+        <w:tc>
+          <w:tcPr>
+            <w:cnfStyle w:val="001000000000" w:firstRow="0" w:lastRow="0" w:firstColumn="1" w:lastColumn="0" w:oddVBand="0" w:evenVBand="0" w:oddHBand="0" w:evenHBand="0" w:firstRowFirstColumn="0" w:firstRowLastColumn="0" w:lastRowFirstColumn="0" w:lastRowLastColumn="0"/>
+            <w:tcW w:w="993" w:type="dxa"/>
+          </w:tcPr>
+          <w:p>
+            <w:r>
+              <w:t>FR-004</w:t>
+            </w:r>
+          </w:p>
+        </w:tc>
+        <w:tc>
+          <w:tcPr>
+            <w:tcW w:w="2613" w:type="dxa"/>
+          </w:tcPr>
+          <w:p>
+            <w:pPr>
+              <w:cnfStyle w:val="000000000000" w:firstRow="0" w:lastRow="0" w:firstColumn="0" w:lastColumn="0" w:oddVBand="0" w:evenVBand="0" w:oddHBand="0" w:evenHBand="0" w:firstRowFirstColumn="0" w:firstRowLastColumn="0" w:lastRowFirstColumn="0" w:lastRowLastColumn="0"/>
+            </w:pPr>
+            <w:r>
+              <w:t>A requester should be able to view a list or history of all the requests they have made in the past.</w:t>
+            </w:r>
+          </w:p>
+        </w:tc>
+        <w:tc>
+          <w:tcPr>
+            <w:tcW w:w="1803" w:type="dxa"/>
+          </w:tcPr>
+          <w:p>
+            <w:pPr>
+              <w:cnfStyle w:val="000000000000" w:firstRow="0" w:lastRow="0" w:firstColumn="0" w:lastColumn="0" w:oddVBand="0" w:evenVBand="0" w:oddHBand="0" w:evenHBand="0" w:firstRowFirstColumn="0" w:firstRowLastColumn="0" w:lastRowFirstColumn="0" w:lastRowLastColumn="0"/>
+            </w:pPr>
+            <w:r>
+              <w:t>Requester</w:t>
+            </w:r>
+          </w:p>
+        </w:tc>
+        <w:tc>
+          <w:tcPr>
+            <w:tcW w:w="1112" w:type="dxa"/>
+          </w:tcPr>
+          <w:p>
+            <w:pPr>
+              <w:cnfStyle w:val="000000000000" w:firstRow="0" w:lastRow="0" w:firstColumn="0" w:lastColumn="0" w:oddVBand="0" w:evenVBand="0" w:oddHBand="0" w:evenHBand="0" w:firstRowFirstColumn="0" w:firstRowLastColumn="0" w:lastRowFirstColumn="0" w:lastRowLastColumn="0"/>
+            </w:pPr>
+            <w:r>
+              <w:t>Must</w:t>
+            </w:r>
+          </w:p>
+        </w:tc>
+      </w:tr>
+      <w:tr>
+        <w:trPr>
+          <w:cnfStyle w:val="000000100000" w:firstRow="0" w:lastRow="0" w:firstColumn="0" w:lastColumn="0" w:oddVBand="0" w:evenVBand="0" w:oddHBand="1" w:evenHBand="0" w:firstRowFirstColumn="0" w:firstRowLastColumn="0" w:lastRowFirstColumn="0" w:lastRowLastColumn="0"/>
+        </w:trPr>
+        <w:tc>
+          <w:tcPr>
+            <w:cnfStyle w:val="001000000000" w:firstRow="0" w:lastRow="0" w:firstColumn="1" w:lastColumn="0" w:oddVBand="0" w:evenVBand="0" w:oddHBand="0" w:evenHBand="0" w:firstRowFirstColumn="0" w:firstRowLastColumn="0" w:lastRowFirstColumn="0" w:lastRowLastColumn="0"/>
+            <w:tcW w:w="993" w:type="dxa"/>
+          </w:tcPr>
+          <w:p>
+            <w:r>
+              <w:t>FR-005</w:t>
+            </w:r>
+          </w:p>
+        </w:tc>
+        <w:tc>
+          <w:tcPr>
+            <w:tcW w:w="2613" w:type="dxa"/>
+          </w:tcPr>
+          <w:p>
+            <w:pPr>
+              <w:cnfStyle w:val="000000100000" w:firstRow="0" w:lastRow="0" w:firstColumn="0" w:lastColumn="0" w:oddVBand="0" w:evenVBand="0" w:oddHBand="1" w:evenHBand="0" w:firstRowFirstColumn="0" w:firstRowLastColumn="0" w:lastRowFirstColumn="0" w:lastRowLastColumn="0"/>
+            </w:pPr>
+            <w:r>
+              <w:t>When a request is approved, denied, amended or finished the system must alert the requester or provide them with other relevant feedback.</w:t>
+            </w:r>
+          </w:p>
+        </w:tc>
+        <w:tc>
+          <w:tcPr>
+            <w:tcW w:w="1803" w:type="dxa"/>
+          </w:tcPr>
+          <w:p>
+            <w:pPr>
+              <w:cnfStyle w:val="000000100000" w:firstRow="0" w:lastRow="0" w:firstColumn="0" w:lastColumn="0" w:oddVBand="0" w:evenVBand="0" w:oddHBand="1" w:evenHBand="0" w:firstRowFirstColumn="0" w:firstRowLastColumn="0" w:lastRowFirstColumn="0" w:lastRowLastColumn="0"/>
+            </w:pPr>
+            <w:r>
+              <w:t>Requester</w:t>
+            </w:r>
+          </w:p>
+        </w:tc>
+        <w:tc>
+          <w:tcPr>
+            <w:tcW w:w="1112" w:type="dxa"/>
+          </w:tcPr>
+          <w:p>
+            <w:pPr>
+              <w:cnfStyle w:val="000000100000" w:firstRow="0" w:lastRow="0" w:firstColumn="0" w:lastColumn="0" w:oddVBand="0" w:evenVBand="0" w:oddHBand="1" w:evenHBand="0" w:firstRowFirstColumn="0" w:firstRowLastColumn="0" w:lastRowFirstColumn="0" w:lastRowLastColumn="0"/>
+            </w:pPr>
+            <w:r>
+              <w:t>Must</w:t>
+            </w:r>
+          </w:p>
+        </w:tc>
+      </w:tr>
+      <w:tr>
+        <w:tc>
+          <w:tcPr>
+            <w:cnfStyle w:val="001000000000" w:firstRow="0" w:lastRow="0" w:firstColumn="1" w:lastColumn="0" w:oddVBand="0" w:evenVBand="0" w:oddHBand="0" w:evenHBand="0" w:firstRowFirstColumn="0" w:firstRowLastColumn="0" w:lastRowFirstColumn="0" w:lastRowLastColumn="0"/>
+            <w:tcW w:w="993" w:type="dxa"/>
+          </w:tcPr>
+          <w:p>
+            <w:r>
+              <w:t>FR-006</w:t>
+            </w:r>
+          </w:p>
+        </w:tc>
+        <w:tc>
+          <w:tcPr>
+            <w:tcW w:w="2613" w:type="dxa"/>
+          </w:tcPr>
+          <w:p>
+            <w:pPr>
+              <w:cnfStyle w:val="000000000000" w:firstRow="0" w:lastRow="0" w:firstColumn="0" w:lastColumn="0" w:oddVBand="0" w:evenVBand="0" w:oddHBand="0" w:evenHBand="0" w:firstRowFirstColumn="0" w:firstRowLastColumn="0" w:lastRowFirstColumn="0" w:lastRowLastColumn="0"/>
+            </w:pPr>
+            <w:r>
+              <w:t>Only authenticated, authorised users should be able to read and respond to service requests in accordance with their roles.</w:t>
+            </w:r>
+          </w:p>
+        </w:tc>
+        <w:tc>
+          <w:tcPr>
+            <w:tcW w:w="1803" w:type="dxa"/>
+          </w:tcPr>
+          <w:p>
+            <w:pPr>
+              <w:cnfStyle w:val="000000000000" w:firstRow="0" w:lastRow="0" w:firstColumn="0" w:lastColumn="0" w:oddVBand="0" w:evenVBand="0" w:oddHBand="0" w:evenHBand="0" w:firstRowFirstColumn="0" w:firstRowLastColumn="0" w:lastRowFirstColumn="0" w:lastRowLastColumn="0"/>
+            </w:pPr>
+            <w:r>
+              <w:t>Security Constraint</w:t>
+            </w:r>
+          </w:p>
+        </w:tc>
+        <w:tc>
+          <w:tcPr>
+            <w:tcW w:w="1112" w:type="dxa"/>
+          </w:tcPr>
+          <w:p>
+            <w:pPr>
+              <w:cnfStyle w:val="000000000000" w:firstRow="0" w:lastRow="0" w:firstColumn="0" w:lastColumn="0" w:oddVBand="0" w:evenVBand="0" w:oddHBand="0" w:evenHBand="0" w:firstRowFirstColumn="0" w:firstRowLastColumn="0" w:lastRowFirstColumn="0" w:lastRowLastColumn="0"/>
+            </w:pPr>
+            <w:r>
+              <w:t>Must</w:t>
+            </w:r>
+          </w:p>
+        </w:tc>
+      </w:tr>
+      <w:tr>
+        <w:trPr>
+          <w:cnfStyle w:val="000000100000" w:firstRow="0" w:lastRow="0" w:firstColumn="0" w:lastColumn="0" w:oddVBand="0" w:evenVBand="0" w:oddHBand="1" w:evenHBand="0" w:firstRowFirstColumn="0" w:firstRowLastColumn="0" w:lastRowFirstColumn="0" w:lastRowLastColumn="0"/>
+        </w:trPr>
+        <w:tc>
+          <w:tcPr>
+            <w:cnfStyle w:val="001000000000" w:firstRow="0" w:lastRow="0" w:firstColumn="1" w:lastColumn="0" w:oddVBand="0" w:evenVBand="0" w:oddHBand="0" w:evenHBand="0" w:firstRowFirstColumn="0" w:firstRowLastColumn="0" w:lastRowFirstColumn="0" w:lastRowLastColumn="0"/>
+            <w:tcW w:w="993" w:type="dxa"/>
+          </w:tcPr>
+          <w:p>
+            <w:r>
+              <w:t>FR-007</w:t>
+            </w:r>
+          </w:p>
+        </w:tc>
+        <w:tc>
+          <w:tcPr>
+            <w:tcW w:w="2613" w:type="dxa"/>
+          </w:tcPr>
+          <w:p>
+            <w:pPr>
+              <w:cnfStyle w:val="000000100000" w:firstRow="0" w:lastRow="0" w:firstColumn="0" w:lastColumn="0" w:oddVBand="0" w:evenVBand="0" w:oddHBand="1" w:evenHBand="0" w:firstRowFirstColumn="0" w:firstRowLastColumn="0" w:lastRowFirstColumn="0" w:lastRowLastColumn="0"/>
+            </w:pPr>
+            <w:r>
+              <w:t>The system should permit authorised staff to access service requests that are specific to them.</w:t>
+            </w:r>
+          </w:p>
+        </w:tc>
+        <w:tc>
+          <w:tcPr>
+            <w:tcW w:w="1803" w:type="dxa"/>
+          </w:tcPr>
+          <w:p>
+            <w:pPr>
+              <w:cnfStyle w:val="000000100000" w:firstRow="0" w:lastRow="0" w:firstColumn="0" w:lastColumn="0" w:oddVBand="0" w:evenVBand="0" w:oddHBand="1" w:evenHBand="0" w:firstRowFirstColumn="0" w:firstRowLastColumn="0" w:lastRowFirstColumn="0" w:lastRowLastColumn="0"/>
+            </w:pPr>
+            <w:r>
+              <w:t>Staff</w:t>
+            </w:r>
+          </w:p>
+        </w:tc>
+        <w:tc>
+          <w:tcPr>
+            <w:tcW w:w="1112" w:type="dxa"/>
+          </w:tcPr>
+          <w:p>
+            <w:pPr>
+              <w:cnfStyle w:val="000000100000" w:firstRow="0" w:lastRow="0" w:firstColumn="0" w:lastColumn="0" w:oddVBand="0" w:evenVBand="0" w:oddHBand="1" w:evenHBand="0" w:firstRowFirstColumn="0" w:firstRowLastColumn="0" w:lastRowFirstColumn="0" w:lastRowLastColumn="0"/>
+            </w:pPr>
+            <w:r>
+              <w:t>Must</w:t>
+            </w:r>
+          </w:p>
+        </w:tc>
+      </w:tr>
+      <w:tr>
+        <w:tc>
+          <w:tcPr>
+            <w:cnfStyle w:val="001000000000" w:firstRow="0" w:lastRow="0" w:firstColumn="1" w:lastColumn="0" w:oddVBand="0" w:evenVBand="0" w:oddHBand="0" w:evenHBand="0" w:firstRowFirstColumn="0" w:firstRowLastColumn="0" w:lastRowFirstColumn="0" w:lastRowLastColumn="0"/>
+            <w:tcW w:w="993" w:type="dxa"/>
+          </w:tcPr>
+          <w:p>
+            <w:r>
+              <w:t>FR-008</w:t>
+            </w:r>
+          </w:p>
+        </w:tc>
+        <w:tc>
+          <w:tcPr>
+            <w:tcW w:w="2613" w:type="dxa"/>
+          </w:tcPr>
+          <w:p>
+            <w:pPr>
+              <w:cnfStyle w:val="000000000000" w:firstRow="0" w:lastRow="0" w:firstColumn="0" w:lastColumn="0" w:oddVBand="0" w:evenVBand="0" w:oddHBand="0" w:evenHBand="0" w:firstRowFirstColumn="0" w:firstRowLastColumn="0" w:lastRowFirstColumn="0" w:lastRowLastColumn="0"/>
+            </w:pPr>
+            <w:r>
+              <w:t>Staff should be able to search, filter or arrange requests using practical criteria.</w:t>
+            </w:r>
+          </w:p>
+        </w:tc>
+        <w:tc>
+          <w:tcPr>
+            <w:tcW w:w="1803" w:type="dxa"/>
+          </w:tcPr>
+          <w:p>
+            <w:pPr>
+              <w:cnfStyle w:val="000000000000" w:firstRow="0" w:lastRow="0" w:firstColumn="0" w:lastColumn="0" w:oddVBand="0" w:evenVBand="0" w:oddHBand="0" w:evenHBand="0" w:firstRowFirstColumn="0" w:firstRowLastColumn="0" w:lastRowFirstColumn="0" w:lastRowLastColumn="0"/>
+            </w:pPr>
+            <w:r>
+              <w:t>Staff</w:t>
+            </w:r>
+          </w:p>
+        </w:tc>
+        <w:tc>
+          <w:tcPr>
+            <w:tcW w:w="1112" w:type="dxa"/>
+          </w:tcPr>
+          <w:p>
+            <w:pPr>
+              <w:cnfStyle w:val="000000000000" w:firstRow="0" w:lastRow="0" w:firstColumn="0" w:lastColumn="0" w:oddVBand="0" w:evenVBand="0" w:oddHBand="0" w:evenHBand="0" w:firstRowFirstColumn="0" w:firstRowLastColumn="0" w:lastRowFirstColumn="0" w:lastRowLastColumn="0"/>
+            </w:pPr>
+            <w:r>
+              <w:t>Should</w:t>
+            </w:r>
+          </w:p>
+        </w:tc>
+      </w:tr>
+      <w:tr>
+        <w:trPr>
+          <w:cnfStyle w:val="000000100000" w:firstRow="0" w:lastRow="0" w:firstColumn="0" w:lastColumn="0" w:oddVBand="0" w:evenVBand="0" w:oddHBand="1" w:evenHBand="0" w:firstRowFirstColumn="0" w:firstRowLastColumn="0" w:lastRowFirstColumn="0" w:lastRowLastColumn="0"/>
+        </w:trPr>
+        <w:tc>
+          <w:tcPr>
+            <w:cnfStyle w:val="001000000000" w:firstRow="0" w:lastRow="0" w:firstColumn="1" w:lastColumn="0" w:oddVBand="0" w:evenVBand="0" w:oddHBand="0" w:evenHBand="0" w:firstRowFirstColumn="0" w:firstRowLastColumn="0" w:lastRowFirstColumn="0" w:lastRowLastColumn="0"/>
+            <w:tcW w:w="993" w:type="dxa"/>
+          </w:tcPr>
+          <w:p>
+            <w:r>
+              <w:t>FR-009</w:t>
+            </w:r>
+          </w:p>
+        </w:tc>
+        <w:tc>
+          <w:tcPr>
+            <w:tcW w:w="2613" w:type="dxa"/>
+          </w:tcPr>
+          <w:p>
+            <w:pPr>
+              <w:cnfStyle w:val="000000100000" w:firstRow="0" w:lastRow="0" w:firstColumn="0" w:lastColumn="0" w:oddVBand="0" w:evenVBand="0" w:oddHBand="1" w:evenHBand="0" w:firstRowFirstColumn="0" w:firstRowLastColumn="0" w:lastRowFirstColumn="0" w:lastRowLastColumn="0"/>
+            </w:pPr>
+            <w:r>
+              <w:t>The system should enable staff to see every element of a particular request, including the requester’s submitted information and the requester’s action history.</w:t>
+            </w:r>
+          </w:p>
+        </w:tc>
+        <w:tc>
+          <w:tcPr>
+            <w:tcW w:w="1803" w:type="dxa"/>
+          </w:tcPr>
+          <w:p>
+            <w:pPr>
+              <w:cnfStyle w:val="000000100000" w:firstRow="0" w:lastRow="0" w:firstColumn="0" w:lastColumn="0" w:oddVBand="0" w:evenVBand="0" w:oddHBand="1" w:evenHBand="0" w:firstRowFirstColumn="0" w:firstRowLastColumn="0" w:lastRowFirstColumn="0" w:lastRowLastColumn="0"/>
+            </w:pPr>
+            <w:r>
+              <w:t>Staff</w:t>
+            </w:r>
+          </w:p>
+        </w:tc>
+        <w:tc>
+          <w:tcPr>
+            <w:tcW w:w="1112" w:type="dxa"/>
+          </w:tcPr>
+          <w:p>
+            <w:pPr>
+              <w:cnfStyle w:val="000000100000" w:firstRow="0" w:lastRow="0" w:firstColumn="0" w:lastColumn="0" w:oddVBand="0" w:evenVBand="0" w:oddHBand="1" w:evenHBand="0" w:firstRowFirstColumn="0" w:firstRowLastColumn="0" w:lastRowFirstColumn="0" w:lastRowLastColumn="0"/>
+            </w:pPr>
+            <w:r>
+              <w:t>Must</w:t>
+            </w:r>
+          </w:p>
+        </w:tc>
+      </w:tr>
+      <w:tr>
+        <w:tc>
+          <w:tcPr>
+            <w:cnfStyle w:val="001000000000" w:firstRow="0" w:lastRow="0" w:firstColumn="1" w:lastColumn="0" w:oddVBand="0" w:evenVBand="0" w:oddHBand="0" w:evenHBand="0" w:firstRowFirstColumn="0" w:firstRowLastColumn="0" w:lastRowFirstColumn="0" w:lastRowLastColumn="0"/>
+            <w:tcW w:w="993" w:type="dxa"/>
+          </w:tcPr>
+          <w:p>
+            <w:r>
+              <w:t>FR-010</w:t>
+            </w:r>
+          </w:p>
+        </w:tc>
+        <w:tc>
+          <w:tcPr>
+            <w:tcW w:w="2613" w:type="dxa"/>
+          </w:tcPr>
+          <w:p>
+            <w:pPr>
+              <w:cnfStyle w:val="000000000000" w:firstRow="0" w:lastRow="0" w:firstColumn="0" w:lastColumn="0" w:oddVBand="0" w:evenVBand="0" w:oddHBand="0" w:evenHBand="0" w:firstRowFirstColumn="0" w:firstRowLastColumn="0" w:lastRowFirstColumn="0" w:lastRowLastColumn="0"/>
+            </w:pPr>
+            <w:r>
+              <w:t xml:space="preserve">The system will should enable staff to either take responsibility for a request or allocate it to </w:t>
+            </w:r>
+            <w:r>
+              <w:lastRenderedPageBreak/>
+              <w:t>themselves or another permitted staff member.</w:t>
+            </w:r>
+          </w:p>
+        </w:tc>
+        <w:tc>
+          <w:tcPr>
+            <w:tcW w:w="1803" w:type="dxa"/>
+          </w:tcPr>
+          <w:p>
+            <w:pPr>
+              <w:cnfStyle w:val="000000000000" w:firstRow="0" w:lastRow="0" w:firstColumn="0" w:lastColumn="0" w:oddVBand="0" w:evenVBand="0" w:oddHBand="0" w:evenHBand="0" w:firstRowFirstColumn="0" w:firstRowLastColumn="0" w:lastRowFirstColumn="0" w:lastRowLastColumn="0"/>
+            </w:pPr>
+            <w:r>
+              <w:lastRenderedPageBreak/>
+              <w:t>Staff</w:t>
+            </w:r>
+          </w:p>
+        </w:tc>
+        <w:tc>
+          <w:tcPr>
+            <w:tcW w:w="1112" w:type="dxa"/>
+          </w:tcPr>
+          <w:p>
+            <w:pPr>
+              <w:cnfStyle w:val="000000000000" w:firstRow="0" w:lastRow="0" w:firstColumn="0" w:lastColumn="0" w:oddVBand="0" w:evenVBand="0" w:oddHBand="0" w:evenHBand="0" w:firstRowFirstColumn="0" w:firstRowLastColumn="0" w:lastRowFirstColumn="0" w:lastRowLastColumn="0"/>
+            </w:pPr>
+            <w:r>
+              <w:t>Must</w:t>
+            </w:r>
+          </w:p>
+        </w:tc>
+      </w:tr>
+      <w:tr>
+        <w:trPr>
+          <w:cnfStyle w:val="000000100000" w:firstRow="0" w:lastRow="0" w:firstColumn="0" w:lastColumn="0" w:oddVBand="0" w:evenVBand="0" w:oddHBand="1" w:evenHBand="0" w:firstRowFirstColumn="0" w:firstRowLastColumn="0" w:lastRowFirstColumn="0" w:lastRowLastColumn="0"/>
+        </w:trPr>
+        <w:tc>
+          <w:tcPr>
+            <w:cnfStyle w:val="001000000000" w:firstRow="0" w:lastRow="0" w:firstColumn="1" w:lastColumn="0" w:oddVBand="0" w:evenVBand="0" w:oddHBand="0" w:evenHBand="0" w:firstRowFirstColumn="0" w:firstRowLastColumn="0" w:lastRowFirstColumn="0" w:lastRowLastColumn="0"/>
+            <w:tcW w:w="993" w:type="dxa"/>
+          </w:tcPr>
+          <w:p>
+            <w:r>
+              <w:t>FR-011</w:t>
+            </w:r>
+          </w:p>
+        </w:tc>
+        <w:tc>
+          <w:tcPr>
+            <w:tcW w:w="2613" w:type="dxa"/>
+          </w:tcPr>
+          <w:p>
+            <w:pPr>
+              <w:cnfStyle w:val="000000100000" w:firstRow="0" w:lastRow="0" w:firstColumn="0" w:lastColumn="0" w:oddVBand="0" w:evenVBand="0" w:oddHBand="1" w:evenHBand="0" w:firstRowFirstColumn="0" w:firstRowLastColumn="0" w:lastRowFirstColumn="0" w:lastRowLastColumn="0"/>
+            </w:pPr>
+            <w:r>
+              <w:t>Only a limited number of legitimate transactions should let staff change a request’s status.</w:t>
+            </w:r>
+          </w:p>
+        </w:tc>
+        <w:tc>
+          <w:tcPr>
+            <w:tcW w:w="1803" w:type="dxa"/>
+          </w:tcPr>
+          <w:p>
+            <w:pPr>
+              <w:cnfStyle w:val="000000100000" w:firstRow="0" w:lastRow="0" w:firstColumn="0" w:lastColumn="0" w:oddVBand="0" w:evenVBand="0" w:oddHBand="1" w:evenHBand="0" w:firstRowFirstColumn="0" w:firstRowLastColumn="0" w:lastRowFirstColumn="0" w:lastRowLastColumn="0"/>
+            </w:pPr>
+            <w:r>
+              <w:t>Staff</w:t>
+            </w:r>
+          </w:p>
+        </w:tc>
+        <w:tc>
+          <w:tcPr>
+            <w:tcW w:w="1112" w:type="dxa"/>
+          </w:tcPr>
+          <w:p>
+            <w:pPr>
+              <w:cnfStyle w:val="000000100000" w:firstRow="0" w:lastRow="0" w:firstColumn="0" w:lastColumn="0" w:oddVBand="0" w:evenVBand="0" w:oddHBand="1" w:evenHBand="0" w:firstRowFirstColumn="0" w:firstRowLastColumn="0" w:lastRowFirstColumn="0" w:lastRowLastColumn="0"/>
+            </w:pPr>
+            <w:r>
+              <w:t>Must</w:t>
+            </w:r>
+          </w:p>
+        </w:tc>
+      </w:tr>
+      <w:tr>
+        <w:tc>
+          <w:tcPr>
+            <w:cnfStyle w:val="001000000000" w:firstRow="0" w:lastRow="0" w:firstColumn="1" w:lastColumn="0" w:oddVBand="0" w:evenVBand="0" w:oddHBand="0" w:evenHBand="0" w:firstRowFirstColumn="0" w:firstRowLastColumn="0" w:lastRowFirstColumn="0" w:lastRowLastColumn="0"/>
+            <w:tcW w:w="993" w:type="dxa"/>
+          </w:tcPr>
+          <w:p>
+            <w:r>
+              <w:t>FR-012</w:t>
+            </w:r>
+          </w:p>
+        </w:tc>
+        <w:tc>
+          <w:tcPr>
+            <w:tcW w:w="2613" w:type="dxa"/>
+          </w:tcPr>
+          <w:p>
+            <w:pPr>
+              <w:cnfStyle w:val="000000000000" w:firstRow="0" w:lastRow="0" w:firstColumn="0" w:lastColumn="0" w:oddVBand="0" w:evenVBand="0" w:oddHBand="0" w:evenHBand="0" w:firstRowFirstColumn="0" w:firstRowLastColumn="0" w:lastRowFirstColumn="0" w:lastRowLastColumn="0"/>
+            </w:pPr>
+            <w:r>
+              <w:t>Staff members should be able to document actions, remarks or resolution notes in response to a request using the system.</w:t>
+            </w:r>
+          </w:p>
+        </w:tc>
+        <w:tc>
+          <w:tcPr>
+            <w:tcW w:w="1803" w:type="dxa"/>
+          </w:tcPr>
+          <w:p>
+            <w:pPr>
+              <w:cnfStyle w:val="000000000000" w:firstRow="0" w:lastRow="0" w:firstColumn="0" w:lastColumn="0" w:oddVBand="0" w:evenVBand="0" w:oddHBand="0" w:evenHBand="0" w:firstRowFirstColumn="0" w:firstRowLastColumn="0" w:lastRowFirstColumn="0" w:lastRowLastColumn="0"/>
+            </w:pPr>
+            <w:r>
+              <w:t>Staff</w:t>
+            </w:r>
+          </w:p>
+        </w:tc>
+        <w:tc>
+          <w:tcPr>
+            <w:tcW w:w="1112" w:type="dxa"/>
+          </w:tcPr>
+          <w:p>
+            <w:pPr>
+              <w:cnfStyle w:val="000000000000" w:firstRow="0" w:lastRow="0" w:firstColumn="0" w:lastColumn="0" w:oddVBand="0" w:evenVBand="0" w:oddHBand="0" w:evenHBand="0" w:firstRowFirstColumn="0" w:firstRowLastColumn="0" w:lastRowFirstColumn="0" w:lastRowLastColumn="0"/>
+            </w:pPr>
+            <w:r>
+              <w:t>Must</w:t>
+            </w:r>
+          </w:p>
+        </w:tc>
+      </w:tr>
+      <w:tr>
+        <w:trPr>
+          <w:cnfStyle w:val="000000100000" w:firstRow="0" w:lastRow="0" w:firstColumn="0" w:lastColumn="0" w:oddVBand="0" w:evenVBand="0" w:oddHBand="1" w:evenHBand="0" w:firstRowFirstColumn="0" w:firstRowLastColumn="0" w:lastRowFirstColumn="0" w:lastRowLastColumn="0"/>
+        </w:trPr>
+        <w:tc>
+          <w:tcPr>
+            <w:cnfStyle w:val="001000000000" w:firstRow="0" w:lastRow="0" w:firstColumn="1" w:lastColumn="0" w:oddVBand="0" w:evenVBand="0" w:oddHBand="0" w:evenHBand="0" w:firstRowFirstColumn="0" w:firstRowLastColumn="0" w:lastRowFirstColumn="0" w:lastRowLastColumn="0"/>
+            <w:tcW w:w="993" w:type="dxa"/>
+          </w:tcPr>
+          <w:p>
+            <w:r>
+              <w:t>FR-013</w:t>
+            </w:r>
+          </w:p>
+        </w:tc>
+        <w:tc>
+          <w:tcPr>
+            <w:tcW w:w="2613" w:type="dxa"/>
+          </w:tcPr>
+          <w:p>
+            <w:pPr>
+              <w:cnfStyle w:val="000000100000" w:firstRow="0" w:lastRow="0" w:firstColumn="0" w:lastColumn="0" w:oddVBand="0" w:evenVBand="0" w:oddHBand="1" w:evenHBand="0" w:firstRowFirstColumn="0" w:firstRowLastColumn="0" w:lastRowFirstColumn="0" w:lastRowLastColumn="0"/>
+            </w:pPr>
+            <w:r>
+              <w:t>Authorised staff should be able to close or resolve a request through the system.</w:t>
+            </w:r>
+          </w:p>
+        </w:tc>
+        <w:tc>
+          <w:tcPr>
+            <w:tcW w:w="1803" w:type="dxa"/>
+          </w:tcPr>
+          <w:p>
+            <w:pPr>
+              <w:cnfStyle w:val="000000100000" w:firstRow="0" w:lastRow="0" w:firstColumn="0" w:lastColumn="0" w:oddVBand="0" w:evenVBand="0" w:oddHBand="1" w:evenHBand="0" w:firstRowFirstColumn="0" w:firstRowLastColumn="0" w:lastRowFirstColumn="0" w:lastRowLastColumn="0"/>
+            </w:pPr>
+            <w:r>
+              <w:t>Staff</w:t>
+            </w:r>
+          </w:p>
+        </w:tc>
+        <w:tc>
+          <w:tcPr>
+            <w:tcW w:w="1112" w:type="dxa"/>
+          </w:tcPr>
+          <w:p>
+            <w:pPr>
+              <w:cnfStyle w:val="000000100000" w:firstRow="0" w:lastRow="0" w:firstColumn="0" w:lastColumn="0" w:oddVBand="0" w:evenVBand="0" w:oddHBand="1" w:evenHBand="0" w:firstRowFirstColumn="0" w:firstRowLastColumn="0" w:lastRowFirstColumn="0" w:lastRowLastColumn="0"/>
+            </w:pPr>
+            <w:r>
+              <w:t>Must</w:t>
+            </w:r>
+          </w:p>
+        </w:tc>
+      </w:tr>
+      <w:tr>
+        <w:tc>
+          <w:tcPr>
+            <w:cnfStyle w:val="001000000000" w:firstRow="0" w:lastRow="0" w:firstColumn="1" w:lastColumn="0" w:oddVBand="0" w:evenVBand="0" w:oddHBand="0" w:evenHBand="0" w:firstRowFirstColumn="0" w:firstRowLastColumn="0" w:lastRowFirstColumn="0" w:lastRowLastColumn="0"/>
+            <w:tcW w:w="993" w:type="dxa"/>
+          </w:tcPr>
+          <w:p>
+            <w:r>
+              <w:t>FR-014</w:t>
+            </w:r>
+          </w:p>
+        </w:tc>
+        <w:tc>
+          <w:tcPr>
+            <w:tcW w:w="2613" w:type="dxa"/>
+          </w:tcPr>
+          <w:p>
+            <w:pPr>
+              <w:cnfStyle w:val="000000000000" w:firstRow="0" w:lastRow="0" w:firstColumn="0" w:lastColumn="0" w:oddVBand="0" w:evenVBand="0" w:oddHBand="0" w:evenHBand="0" w:firstRowFirstColumn="0" w:firstRowLastColumn="0" w:lastRowFirstColumn="0" w:lastRowLastColumn="0"/>
+            </w:pPr>
+            <w:r>
+              <w:t>Managers should be able to view aggregate servi</w:t>
+            </w:r>
+            <w:r>
+              <w:t>ce activity data across requests.</w:t>
+            </w:r>
+          </w:p>
+        </w:tc>
+        <w:tc>
+          <w:tcPr>
+            <w:tcW w:w="1803" w:type="dxa"/>
+          </w:tcPr>
+          <w:p>
+            <w:pPr>
+              <w:cnfStyle w:val="000000000000" w:firstRow="0" w:lastRow="0" w:firstColumn="0" w:lastColumn="0" w:oddVBand="0" w:evenVBand="0" w:oddHBand="0" w:evenHBand="0" w:firstRowFirstColumn="0" w:firstRowLastColumn="0" w:lastRowFirstColumn="0" w:lastRowLastColumn="0"/>
+            </w:pPr>
+            <w:r>
+              <w:t>Manager</w:t>
+            </w:r>
+          </w:p>
+        </w:tc>
+        <w:tc>
+          <w:tcPr>
+            <w:tcW w:w="1112" w:type="dxa"/>
+          </w:tcPr>
+          <w:p>
+            <w:pPr>
+              <w:cnfStyle w:val="000000000000" w:firstRow="0" w:lastRow="0" w:firstColumn="0" w:lastColumn="0" w:oddVBand="0" w:evenVBand="0" w:oddHBand="0" w:evenHBand="0" w:firstRowFirstColumn="0" w:firstRowLastColumn="0" w:lastRowFirstColumn="0" w:lastRowLastColumn="0"/>
+            </w:pPr>
+            <w:r>
+              <w:t>Must</w:t>
+            </w:r>
+          </w:p>
+        </w:tc>
+      </w:tr>
+      <w:tr>
+        <w:trPr>
+          <w:cnfStyle w:val="000000100000" w:firstRow="0" w:lastRow="0" w:firstColumn="0" w:lastColumn="0" w:oddVBand="0" w:evenVBand="0" w:oddHBand="1" w:evenHBand="0" w:firstRowFirstColumn="0" w:firstRowLastColumn="0" w:lastRowFirstColumn="0" w:lastRowLastColumn="0"/>
+        </w:trPr>
+        <w:tc>
+          <w:tcPr>
+            <w:cnfStyle w:val="001000000000" w:firstRow="0" w:lastRow="0" w:firstColumn="1" w:lastColumn="0" w:oddVBand="0" w:evenVBand="0" w:oddHBand="0" w:evenHBand="0" w:firstRowFirstColumn="0" w:firstRowLastColumn="0" w:lastRowFirstColumn="0" w:lastRowLastColumn="0"/>
+            <w:tcW w:w="993" w:type="dxa"/>
+          </w:tcPr>
+          <w:p>
+            <w:r>
+              <w:t>FR-015</w:t>
+            </w:r>
+          </w:p>
+        </w:tc>
+        <w:tc>
+          <w:tcPr>
+            <w:tcW w:w="2613" w:type="dxa"/>
+          </w:tcPr>
+          <w:p>
+            <w:pPr>
+              <w:cnfStyle w:val="000000100000" w:firstRow="0" w:lastRow="0" w:firstColumn="0" w:lastColumn="0" w:oddVBand="0" w:evenVBand="0" w:oddHBand="1" w:evenHBand="0" w:firstRowFirstColumn="0" w:firstRowLastColumn="0" w:lastRowFirstColumn="0" w:lastRowLastColumn="0"/>
+            </w:pPr>
+            <w:r>
+              <w:t>Based on a predetermined age/SLA threshold, the system should enable managers to identify past-due requests.</w:t>
+            </w:r>
+          </w:p>
+        </w:tc>
+        <w:tc>
+          <w:tcPr>
+            <w:tcW w:w="1803" w:type="dxa"/>
+          </w:tcPr>
+          <w:p>
+            <w:pPr>
+              <w:cnfStyle w:val="000000100000" w:firstRow="0" w:lastRow="0" w:firstColumn="0" w:lastColumn="0" w:oddVBand="0" w:evenVBand="0" w:oddHBand="1" w:evenHBand="0" w:firstRowFirstColumn="0" w:firstRowLastColumn="0" w:lastRowFirstColumn="0" w:lastRowLastColumn="0"/>
+            </w:pPr>
+            <w:r>
+              <w:t>Manager</w:t>
+            </w:r>
+          </w:p>
+        </w:tc>
+        <w:tc>
+          <w:tcPr>
+            <w:tcW w:w="1112" w:type="dxa"/>
+          </w:tcPr>
+          <w:p>
+            <w:pPr>
+              <w:cnfStyle w:val="000000100000" w:firstRow="0" w:lastRow="0" w:firstColumn="0" w:lastColumn="0" w:oddVBand="0" w:evenVBand="0" w:oddHBand="1" w:evenHBand="0" w:firstRowFirstColumn="0" w:firstRowLastColumn="0" w:lastRowFirstColumn="0" w:lastRowLastColumn="0"/>
+            </w:pPr>
+            <w:r>
+              <w:t>Should</w:t>
+            </w:r>
+          </w:p>
+        </w:tc>
+      </w:tr>
+      <w:tr>
+        <w:tc>
+          <w:tcPr>
+            <w:cnfStyle w:val="001000000000" w:firstRow="0" w:lastRow="0" w:firstColumn="1" w:lastColumn="0" w:oddVBand="0" w:evenVBand="0" w:oddHBand="0" w:evenHBand="0" w:firstRowFirstColumn="0" w:firstRowLastColumn="0" w:lastRowFirstColumn="0" w:lastRowLastColumn="0"/>
+            <w:tcW w:w="993" w:type="dxa"/>
+          </w:tcPr>
+          <w:p>
+            <w:r>
+              <w:t>FR-016</w:t>
+            </w:r>
+          </w:p>
+        </w:tc>
+        <w:tc>
+          <w:tcPr>
+            <w:tcW w:w="2613" w:type="dxa"/>
+          </w:tcPr>
+          <w:p>
+            <w:pPr>
+              <w:cnfStyle w:val="000000000000" w:firstRow="0" w:lastRow="0" w:firstColumn="0" w:lastColumn="0" w:oddVBand="0" w:evenVBand="0" w:oddHBand="0" w:evenHBand="0" w:firstRowFirstColumn="0" w:firstRowLastColumn="0" w:lastRowFirstColumn="0" w:lastRowLastColumn="0"/>
+            </w:pPr>
+            <w:r>
+              <w:t>Managers should be able to view requests filtere</w:t>
+            </w:r>
+            <w:r>
+              <w:t xml:space="preserve">d or aggregated by category, status or other appropriate </w:t>
+            </w:r>
+            <w:r>
+              <w:t>parameters.</w:t>
+            </w:r>
+          </w:p>
+        </w:tc>
+        <w:tc>
+          <w:tcPr>
+            <w:tcW w:w="1803" w:type="dxa"/>
+          </w:tcPr>
+          <w:p>
+            <w:pPr>
+              <w:cnfStyle w:val="000000000000" w:firstRow="0" w:lastRow="0" w:firstColumn="0" w:lastColumn="0" w:oddVBand="0" w:evenVBand="0" w:oddHBand="0" w:evenHBand="0" w:firstRowFirstColumn="0" w:firstRowLastColumn="0" w:lastRowFirstColumn="0" w:lastRowLastColumn="0"/>
+            </w:pPr>
+            <w:r>
+              <w:t>Manager</w:t>
+            </w:r>
+          </w:p>
+        </w:tc>
+        <w:tc>
+          <w:tcPr>
+            <w:tcW w:w="1112" w:type="dxa"/>
+          </w:tcPr>
+          <w:p>
+            <w:pPr>
+              <w:cnfStyle w:val="000000000000" w:firstRow="0" w:lastRow="0" w:firstColumn="0" w:lastColumn="0" w:oddVBand="0" w:evenVBand="0" w:oddHBand="0" w:evenHBand="0" w:firstRowFirstColumn="0" w:firstRowLastColumn="0" w:lastRowFirstColumn="0" w:lastRowLastColumn="0"/>
+            </w:pPr>
+            <w:r>
+              <w:t>Should</w:t>
+            </w:r>
+          </w:p>
+        </w:tc>
+      </w:tr>
+      <w:tr>
+        <w:trPr>
+          <w:cnfStyle w:val="000000100000" w:firstRow="0" w:lastRow="0" w:firstColumn="0" w:lastColumn="0" w:oddVBand="0" w:evenVBand="0" w:oddHBand="1" w:evenHBand="0" w:firstRowFirstColumn="0" w:firstRowLastColumn="0" w:lastRowFirstColumn="0" w:lastRowLastColumn="0"/>
+        </w:trPr>
+        <w:tc>
+          <w:tcPr>
+            <w:cnfStyle w:val="001000000000" w:firstRow="0" w:lastRow="0" w:firstColumn="1" w:lastColumn="0" w:oddVBand="0" w:evenVBand="0" w:oddHBand="0" w:evenHBand="0" w:firstRowFirstColumn="0" w:firstRowLastColumn="0" w:lastRowFirstColumn="0" w:lastRowLastColumn="0"/>
+            <w:tcW w:w="993" w:type="dxa"/>
+          </w:tcPr>
+          <w:p>
+            <w:r>
+              <w:t>FR-017</w:t>
+            </w:r>
+          </w:p>
+        </w:tc>
+        <w:tc>
+          <w:tcPr>
+            <w:tcW w:w="2613" w:type="dxa"/>
+          </w:tcPr>
+          <w:p>
+            <w:pPr>
+              <w:cnfStyle w:val="000000100000" w:firstRow="0" w:lastRow="0" w:firstColumn="0" w:lastColumn="0" w:oddVBand="0" w:evenVBand="0" w:oddHBand="1" w:evenHBand="0" w:firstRowFirstColumn="0" w:firstRowLastColumn="0" w:lastRowFirstColumn="0" w:lastRowLastColumn="0"/>
+            </w:pPr>
+            <w:r>
+              <w:t>In order to facilitate accountability and service-performance analysis, the system should give managers sufficient request-level and aggregated data.</w:t>
+            </w:r>
+          </w:p>
+        </w:tc>
+        <w:tc>
+          <w:tcPr>
+            <w:tcW w:w="1803" w:type="dxa"/>
+          </w:tcPr>
+          <w:p>
+            <w:pPr>
+              <w:cnfStyle w:val="000000100000" w:firstRow="0" w:lastRow="0" w:firstColumn="0" w:lastColumn="0" w:oddVBand="0" w:evenVBand="0" w:oddHBand="1" w:evenHBand="0" w:firstRowFirstColumn="0" w:firstRowLastColumn="0" w:lastRowFirstColumn="0" w:lastRowLastColumn="0"/>
+            </w:pPr>
+            <w:r>
+              <w:t>Manager</w:t>
+            </w:r>
+          </w:p>
+        </w:tc>
+        <w:tc>
+          <w:tcPr>
+            <w:tcW w:w="1112" w:type="dxa"/>
+          </w:tcPr>
+          <w:p>
+            <w:pPr>
+              <w:cnfStyle w:val="000000100000" w:firstRow="0" w:lastRow="0" w:firstColumn="0" w:lastColumn="0" w:oddVBand="0" w:evenVBand="0" w:oddHBand="1" w:evenHBand="0" w:firstRowFirstColumn="0" w:firstRowLastColumn="0" w:lastRowFirstColumn="0" w:lastRowLastColumn="0"/>
+            </w:pPr>
+            <w:r>
+              <w:t>Should</w:t>
+            </w:r>
+          </w:p>
+        </w:tc>
+      </w:tr>
+    </w:tbl>
+    <w:p/>
+    <w:p>
+      <w:pPr>
+        <w:pStyle w:val="Heading2"/>
+      </w:pPr>
+      <w:r>
+        <w:t>Non-Functional Requirements (NFRs):</w:t>
+      </w:r>
+    </w:p>
+    <w:p>
+      <w:r>
+        <w:t xml:space="preserve">Even though this milestone is not yet permitted to make </w:t>
+      </w:r>
+      <w:r>
+        <w:t xml:space="preserve">architectural and construction decisions, milestones 1 discreetly begins </w:t>
+      </w:r>
+      <w:r>
+        <w:t xml:space="preserve">to restrict those decisions in NFRs (section 5, </w:t>
+      </w:r>
+      <w:r>
+        <w:lastRenderedPageBreak/>
+        <w:t xml:space="preserve">Explicit Milestone 1 </w:t>
+      </w:r>
+      <w:r>
+        <w:t>Boundaries, Master Brief document). Each o</w:t>
+      </w:r>
+      <w:r>
+        <w:t xml:space="preserve">f </w:t>
+      </w:r>
+      <w:r>
+        <w:t xml:space="preserve">the NFRs listed below can be traced either directly </w:t>
+      </w:r>
+      <w:r>
+        <w:t xml:space="preserve">to a specific pain point in the business requirements or </w:t>
+      </w:r>
+      <w:r>
+        <w:t xml:space="preserve">to an explicit restriction in the Master Brief (section 4). </w:t>
+      </w:r>
+    </w:p>
+    <w:p>
+      <w:r>
+        <w:t>All</w:t>
+      </w:r>
+      <w:r>
+        <w:t xml:space="preserve"> the NFRs in</w:t>
+      </w:r>
+      <w:r>
+        <w:t xml:space="preserve"> this section are constructed so that they may eventually be prove</w:t>
+      </w:r>
+      <w:r>
+        <w:t>n</w:t>
+      </w:r>
+      <w:r>
+        <w:t xml:space="preserve"> true or false using evi</w:t>
+      </w:r>
+      <w:r>
+        <w:t>dence rather than claims.</w:t>
+      </w:r>
+    </w:p>
+    <w:tbl>
+      <w:tblPr>
+        <w:tblStyle w:val="GridTable2"/>
+        <w:tblW w:w="0" w:type="auto"/>
+        <w:tblLook w:val="04A0" w:firstRow="1" w:lastRow="0" w:firstColumn="1" w:lastColumn="0" w:noHBand="0" w:noVBand="1"/>
+      </w:tblPr>
+      <w:tblGrid>
+        <w:gridCol w:w="793"/>
+        <w:gridCol w:w="1742"/>
+        <w:gridCol w:w="1754"/>
+        <w:gridCol w:w="2150"/>
+        <w:gridCol w:w="1024"/>
+      </w:tblGrid>
+      <w:tr>
+        <w:trPr>
+          <w:cnfStyle w:val="100000000000" w:firstRow="1" w:lastRow="0" w:firstColumn="0" w:lastColumn="0" w:oddVBand="0" w:evenVBand="0" w:oddHBand="0" w:evenHBand="0" w:firstRowFirstColumn="0" w:firstRowLastColumn="0" w:lastRowFirstColumn="0" w:lastRowLastColumn="0"/>
+        </w:trPr>
+        <w:tc>
+          <w:tcPr>
+            <w:cnfStyle w:val="001000000000" w:firstRow="0" w:lastRow="0" w:firstColumn="1" w:lastColumn="0" w:oddVBand="0" w:evenVBand="0" w:oddHBand="0" w:evenHBand="0" w:firstRowFirstColumn="0" w:firstRowLastColumn="0" w:lastRowFirstColumn="0" w:lastRowLastColumn="0"/>
+            <w:tcW w:w="793" w:type="dxa"/>
+          </w:tcPr>
+          <w:p>
+            <w:r>
+              <w:t>ID</w:t>
+            </w:r>
+          </w:p>
+        </w:tc>
+        <w:tc>
+          <w:tcPr>
+            <w:tcW w:w="1742" w:type="dxa"/>
+          </w:tcPr>
+          <w:p>
+            <w:pPr>
+              <w:cnfStyle w:val="100000000000" w:firstRow="1" w:lastRow="0" w:firstColumn="0" w:lastColumn="0" w:oddVBand="0" w:evenVBand="0" w:oddHBand="0" w:evenHBand="0" w:firstRowFirstColumn="0" w:firstRowLastColumn="0" w:lastRowFirstColumn="0" w:lastRowLastColumn="0"/>
+            </w:pPr>
+            <w:r>
+              <w:t>Category</w:t>
+            </w:r>
+          </w:p>
+        </w:tc>
+        <w:tc>
+          <w:tcPr>
+            <w:tcW w:w="1637" w:type="dxa"/>
+          </w:tcPr>
+          <w:p>
+            <w:pPr>
+              <w:cnfStyle w:val="100000000000" w:firstRow="1" w:lastRow="0" w:firstColumn="0" w:lastColumn="0" w:oddVBand="0" w:evenVBand="0" w:oddHBand="0" w:evenHBand="0" w:firstRowFirstColumn="0" w:firstRowLastColumn="0" w:lastRowFirstColumn="0" w:lastRowLastColumn="0"/>
+            </w:pPr>
+            <w:r>
+              <w:t>Requirement</w:t>
+            </w:r>
+          </w:p>
+        </w:tc>
+        <w:tc>
+          <w:tcPr>
+            <w:tcW w:w="2150" w:type="dxa"/>
+          </w:tcPr>
+          <w:p>
+            <w:pPr>
+              <w:cnfStyle w:val="100000000000" w:firstRow="1" w:lastRow="0" w:firstColumn="0" w:lastColumn="0" w:oddVBand="0" w:evenVBand="0" w:oddHBand="0" w:evenHBand="0" w:firstRowFirstColumn="0" w:firstRowLastColumn="0" w:lastRowFirstColumn="0" w:lastRowLastColumn="0"/>
+            </w:pPr>
+            <w:r>
+              <w:t>Source/ Stakeholder</w:t>
+            </w:r>
+          </w:p>
+        </w:tc>
+        <w:tc>
+          <w:tcPr>
+            <w:tcW w:w="1024" w:type="dxa"/>
+          </w:tcPr>
+          <w:p>
+            <w:pPr>
+              <w:cnfStyle w:val="100000000000" w:firstRow="1" w:lastRow="0" w:firstColumn="0" w:lastColumn="0" w:oddVBand="0" w:evenVBand="0" w:oddHBand="0" w:evenHBand="0" w:firstRowFirstColumn="0" w:firstRowLastColumn="0" w:lastRowFirstColumn="0" w:lastRowLastColumn="0"/>
+            </w:pPr>
+            <w:r>
+              <w:t>Priority</w:t>
+            </w:r>
+          </w:p>
+        </w:tc>
+      </w:tr>
+      <w:tr>
+        <w:trPr>
+          <w:cnfStyle w:val="000000100000" w:firstRow="0" w:lastRow="0" w:firstColumn="0" w:lastColumn="0" w:oddVBand="0" w:evenVBand="0" w:oddHBand="1" w:evenHBand="0" w:firstRowFirstColumn="0" w:firstRowLastColumn="0" w:lastRowFirstColumn="0" w:lastRowLastColumn="0"/>
+        </w:trPr>
+        <w:tc>
+          <w:tcPr>
+            <w:cnfStyle w:val="001000000000" w:firstRow="0" w:lastRow="0" w:firstColumn="1" w:lastColumn="0" w:oddVBand="0" w:evenVBand="0" w:oddHBand="0" w:evenHBand="0" w:firstRowFirstColumn="0" w:firstRowLastColumn="0" w:lastRowFirstColumn="0" w:lastRowLastColumn="0"/>
+            <w:tcW w:w="793" w:type="dxa"/>
+          </w:tcPr>
+          <w:p>
+            <w:r>
+              <w:t>NFR-001</w:t>
+            </w:r>
+          </w:p>
+        </w:tc>
+        <w:tc>
+          <w:tcPr>
+            <w:tcW w:w="1742" w:type="dxa"/>
+          </w:tcPr>
+          <w:p>
+            <w:pPr>
+              <w:cnfStyle w:val="000000100000" w:firstRow="0" w:lastRow="0" w:firstColumn="0" w:lastColumn="0" w:oddVBand="0" w:evenVBand="0" w:oddHBand="1" w:evenHBand="0" w:firstRowFirstColumn="0" w:firstRowLastColumn="0" w:lastRowFirstColumn="0" w:lastRowLastColumn="0"/>
+            </w:pPr>
+            <w:r>
+              <w:t>Usability</w:t>
+            </w:r>
+          </w:p>
+        </w:tc>
+        <w:tc>
+          <w:tcPr>
+            <w:tcW w:w="1637" w:type="dxa"/>
+          </w:tcPr>
+          <w:p>
+            <w:pPr>
+              <w:cnfStyle w:val="000000100000" w:firstRow="0" w:lastRow="0" w:firstColumn="0" w:lastColumn="0" w:oddVBand="0" w:evenVBand="0" w:oddHBand="1" w:evenHBand="0" w:firstRowFirstColumn="0" w:firstRowLastColumn="0" w:lastRowFirstColumn="0" w:lastRowLastColumn="0"/>
+            </w:pPr>
+            <w:r>
+              <w:t>A valid service request can be submitted by a first-time requester withou</w:t>
+            </w:r>
+            <w:r>
+              <w:t>t outside assistance.</w:t>
+            </w:r>
+          </w:p>
+        </w:tc>
+        <w:tc>
+          <w:tcPr>
+            <w:tcW w:w="2150" w:type="dxa"/>
+          </w:tcPr>
+          <w:p>
+            <w:pPr>
+              <w:cnfStyle w:val="000000100000" w:firstRow="0" w:lastRow="0" w:firstColumn="0" w:lastColumn="0" w:oddVBand="0" w:evenVBand="0" w:oddHBand="1" w:evenHBand="0" w:firstRowFirstColumn="0" w:firstRowLastColumn="0" w:lastRowFirstColumn="0" w:lastRowLastColumn="0"/>
+            </w:pPr>
+            <w:r>
+              <w:t>Requester/ business need</w:t>
+            </w:r>
+          </w:p>
+        </w:tc>
+        <w:tc>
+          <w:tcPr>
+            <w:tcW w:w="1024" w:type="dxa"/>
+          </w:tcPr>
+          <w:p>
+            <w:pPr>
+              <w:cnfStyle w:val="000000100000" w:firstRow="0" w:lastRow="0" w:firstColumn="0" w:lastColumn="0" w:oddVBand="0" w:evenVBand="0" w:oddHBand="1" w:evenHBand="0" w:firstRowFirstColumn="0" w:firstRowLastColumn="0" w:lastRowFirstColumn="0" w:lastRowLastColumn="0"/>
+            </w:pPr>
+            <w:r>
+              <w:t>Must</w:t>
+            </w:r>
+          </w:p>
+        </w:tc>
+      </w:tr>
+      <w:tr>
+        <w:tc>
+          <w:tcPr>
+            <w:cnfStyle w:val="001000000000" w:firstRow="0" w:lastRow="0" w:firstColumn="1" w:lastColumn="0" w:oddVBand="0" w:evenVBand="0" w:oddHBand="0" w:evenHBand="0" w:firstRowFirstColumn="0" w:firstRowLastColumn="0" w:lastRowFirstColumn="0" w:lastRowLastColumn="0"/>
+            <w:tcW w:w="793" w:type="dxa"/>
+          </w:tcPr>
+          <w:p>
+            <w:r>
+              <w:t>NFR-002</w:t>
+            </w:r>
+          </w:p>
+        </w:tc>
+        <w:tc>
+          <w:tcPr>
+            <w:tcW w:w="1742" w:type="dxa"/>
+          </w:tcPr>
+          <w:p>
+            <w:pPr>
+              <w:cnfStyle w:val="000000000000" w:firstRow="0" w:lastRow="0" w:firstColumn="0" w:lastColumn="0" w:oddVBand="0" w:evenVBand="0" w:oddHBand="0" w:evenHBand="0" w:firstRowFirstColumn="0" w:firstRowLastColumn="0" w:lastRowFirstColumn="0" w:lastRowLastColumn="0"/>
+            </w:pPr>
+            <w:r>
+              <w:t>Performance</w:t>
+            </w:r>
+          </w:p>
+        </w:tc>
+        <w:tc>
+          <w:tcPr>
+            <w:tcW w:w="1637" w:type="dxa"/>
+          </w:tcPr>
+          <w:p>
+            <w:pPr>
+              <w:cnfStyle w:val="000000000000" w:firstRow="0" w:lastRow="0" w:firstColumn="0" w:lastColumn="0" w:oddVBand="0" w:evenVBand="0" w:oddHBand="0" w:evenHBand="0" w:firstRowFirstColumn="0" w:firstRowLastColumn="0" w:lastRowFirstColumn="0" w:lastRowLastColumn="0"/>
+            </w:pPr>
+            <w:r>
+              <w:t xml:space="preserve">Under typica demand, the request list view must return results to staff within a </w:t>
+            </w:r>
+            <w:r>
+              <w:t>predetermined response time.</w:t>
+            </w:r>
+          </w:p>
+        </w:tc>
+        <w:tc>
+          <w:tcPr>
+            <w:tcW w:w="2150" w:type="dxa"/>
+          </w:tcPr>
+          <w:p>
+            <w:pPr>
+              <w:cnfStyle w:val="000000000000" w:firstRow="0" w:lastRow="0" w:firstColumn="0" w:lastColumn="0" w:oddVBand="0" w:evenVBand="0" w:oddHBand="0" w:evenHBand="0" w:firstRowFirstColumn="0" w:firstRowLastColumn="0" w:lastRowFirstColumn="0" w:lastRowLastColumn="0"/>
+            </w:pPr>
+            <w:r>
+              <w:t>Constraint</w:t>
+            </w:r>
+          </w:p>
+        </w:tc>
+        <w:tc>
+          <w:tcPr>
+            <w:tcW w:w="1024" w:type="dxa"/>
+          </w:tcPr>
+          <w:p>
+            <w:pPr>
+              <w:cnfStyle w:val="000000000000" w:firstRow="0" w:lastRow="0" w:firstColumn="0" w:lastColumn="0" w:oddVBand="0" w:evenVBand="0" w:oddHBand="0" w:evenHBand="0" w:firstRowFirstColumn="0" w:firstRowLastColumn="0" w:lastRowFirstColumn="0" w:lastRowLastColumn="0"/>
+            </w:pPr>
+            <w:r>
+              <w:t>Should</w:t>
+            </w:r>
+          </w:p>
+        </w:tc>
+      </w:tr>
+      <w:tr>
+        <w:trPr>
+          <w:cnfStyle w:val="000000100000" w:firstRow="0" w:lastRow="0" w:firstColumn="0" w:lastColumn="0" w:oddVBand="0" w:evenVBand="0" w:oddHBand="1" w:evenHBand="0" w:firstRowFirstColumn="0" w:firstRowLastColumn="0" w:lastRowFirstColumn="0" w:lastRowLastColumn="0"/>
+        </w:trPr>
+        <w:tc>
+          <w:tcPr>
+            <w:cnfStyle w:val="001000000000" w:firstRow="0" w:lastRow="0" w:firstColumn="1" w:lastColumn="0" w:oddVBand="0" w:evenVBand="0" w:oddHBand="0" w:evenHBand="0" w:firstRowFirstColumn="0" w:firstRowLastColumn="0" w:lastRowFirstColumn="0" w:lastRowLastColumn="0"/>
+            <w:tcW w:w="793" w:type="dxa"/>
+          </w:tcPr>
+          <w:p>
+            <w:r>
+              <w:t>NFR-003</w:t>
+            </w:r>
+          </w:p>
+        </w:tc>
+        <w:tc>
+          <w:tcPr>
+            <w:tcW w:w="1742" w:type="dxa"/>
+          </w:tcPr>
+          <w:p>
+            <w:pPr>
+              <w:cnfStyle w:val="000000100000" w:firstRow="0" w:lastRow="0" w:firstColumn="0" w:lastColumn="0" w:oddVBand="0" w:evenVBand="0" w:oddHBand="1" w:evenHBand="0" w:firstRowFirstColumn="0" w:firstRowLastColumn="0" w:lastRowFirstColumn="0" w:lastRowLastColumn="0"/>
+            </w:pPr>
+            <w:r>
+              <w:t>Security</w:t>
+            </w:r>
+          </w:p>
+        </w:tc>
+        <w:tc>
+          <w:tcPr>
+            <w:tcW w:w="1637" w:type="dxa"/>
+          </w:tcPr>
+          <w:p>
+            <w:pPr>
+              <w:cnfStyle w:val="000000100000" w:firstRow="0" w:lastRow="0" w:firstColumn="0" w:lastColumn="0" w:oddVBand="0" w:evenVBand="0" w:oddHBand="1" w:evenHBand="0" w:firstRowFirstColumn="0" w:firstRowLastColumn="0" w:lastRowFirstColumn="0" w:lastRowLastColumn="0"/>
+            </w:pPr>
+            <w:r>
+              <w:t>No se</w:t>
+            </w:r>
+            <w:r>
+              <w:t xml:space="preserve">nsitive information is kept in the repository, all request </w:t>
+            </w:r>
+            <w:r>
+              <w:t>data</w:t>
+            </w:r>
+            <w:r>
+              <w:t xml:space="preserve"> in transit and</w:t>
+            </w:r>
+            <w:r>
+              <w:t xml:space="preserve"> saved credentials must be secured using industry-standard techniques.</w:t>
+            </w:r>
+          </w:p>
+        </w:tc>
+        <w:tc>
+          <w:tcPr>
+            <w:tcW w:w="2150" w:type="dxa"/>
+          </w:tcPr>
+          <w:p>
+            <w:pPr>
+              <w:cnfStyle w:val="000000100000" w:firstRow="0" w:lastRow="0" w:firstColumn="0" w:lastColumn="0" w:oddVBand="0" w:evenVBand="0" w:oddHBand="1" w:evenHBand="0" w:firstRowFirstColumn="0" w:firstRowLastColumn="0" w:lastRowFirstColumn="0" w:lastRowLastColumn="0"/>
+            </w:pPr>
+            <w:r>
+              <w:t>Constraint</w:t>
+            </w:r>
+          </w:p>
+        </w:tc>
+        <w:tc>
+          <w:tcPr>
+            <w:tcW w:w="1024" w:type="dxa"/>
+          </w:tcPr>
+          <w:p>
+            <w:pPr>
+              <w:cnfStyle w:val="000000100000" w:firstRow="0" w:lastRow="0" w:firstColumn="0" w:lastColumn="0" w:oddVBand="0" w:evenVBand="0" w:oddHBand="1" w:evenHBand="0" w:firstRowFirstColumn="0" w:firstRowLastColumn="0" w:lastRowFirstColumn="0" w:lastRowLastColumn="0"/>
+            </w:pPr>
+            <w:r>
+              <w:t>Must</w:t>
+            </w:r>
+          </w:p>
+        </w:tc>
+      </w:tr>
+      <w:tr>
+        <w:tc>
+          <w:tcPr>
+            <w:cnfStyle w:val="001000000000" w:firstRow="0" w:lastRow="0" w:firstColumn="1" w:lastColumn="0" w:oddVBand="0" w:evenVBand="0" w:oddHBand="0" w:evenHBand="0" w:firstRowFirstColumn="0" w:firstRowLastColumn="0" w:lastRowFirstColumn="0" w:lastRowLastColumn="0"/>
+            <w:tcW w:w="793" w:type="dxa"/>
+          </w:tcPr>
+          <w:p>
+            <w:r>
+              <w:t>NFR-004</w:t>
+            </w:r>
+          </w:p>
+        </w:tc>
+        <w:tc>
+          <w:tcPr>
+            <w:tcW w:w="1742" w:type="dxa"/>
+          </w:tcPr>
+          <w:p>
+            <w:pPr>
+              <w:cnfStyle w:val="000000000000" w:firstRow="0" w:lastRow="0" w:firstColumn="0" w:lastColumn="0" w:oddVBand="0" w:evenVBand="0" w:oddHBand="0" w:evenHBand="0" w:firstRowFirstColumn="0" w:firstRowLastColumn="0" w:lastRowFirstColumn="0" w:lastRowLastColumn="0"/>
+            </w:pPr>
+            <w:r>
+              <w:t>Availability</w:t>
+            </w:r>
+          </w:p>
+        </w:tc>
+        <w:tc>
+          <w:tcPr>
+            <w:tcW w:w="1637" w:type="dxa"/>
+          </w:tcPr>
+          <w:p>
+            <w:pPr>
+              <w:cnfStyle w:val="000000000000" w:firstRow="0" w:lastRow="0" w:firstColumn="0" w:lastColumn="0" w:oddVBand="0" w:evenVBand="0" w:oddHBand="0" w:evenHBand="0" w:firstRowFirstColumn="0" w:firstRowLastColumn="0" w:lastRowFirstColumn="0" w:lastRowLastColumn="0"/>
+            </w:pPr>
+            <w:r>
+              <w:t>Requesters</w:t>
+            </w:r>
+            <w:r>
+              <w:t xml:space="preserve"> and staff should be able to access the system during </w:t>
+            </w:r>
+            <w:r>
+              <w:t xml:space="preserve">scheduled business hours and aby </w:t>
+            </w:r>
+            <w:r>
+              <w:lastRenderedPageBreak/>
+              <w:t>scheduled outages should be announced.</w:t>
+            </w:r>
+          </w:p>
+        </w:tc>
+        <w:tc>
+          <w:tcPr>
+            <w:tcW w:w="2150" w:type="dxa"/>
+          </w:tcPr>
+          <w:p>
+            <w:pPr>
+              <w:cnfStyle w:val="000000000000" w:firstRow="0" w:lastRow="0" w:firstColumn="0" w:lastColumn="0" w:oddVBand="0" w:evenVBand="0" w:oddHBand="0" w:evenHBand="0" w:firstRowFirstColumn="0" w:firstRowLastColumn="0" w:lastRowFirstColumn="0" w:lastRowLastColumn="0"/>
+            </w:pPr>
+            <w:r>
+              <w:lastRenderedPageBreak/>
+              <w:t>Business need</w:t>
+            </w:r>
+          </w:p>
+        </w:tc>
+        <w:tc>
+          <w:tcPr>
+            <w:tcW w:w="1024" w:type="dxa"/>
+          </w:tcPr>
+          <w:p>
+            <w:pPr>
+              <w:cnfStyle w:val="000000000000" w:firstRow="0" w:lastRow="0" w:firstColumn="0" w:lastColumn="0" w:oddVBand="0" w:evenVBand="0" w:oddHBand="0" w:evenHBand="0" w:firstRowFirstColumn="0" w:firstRowLastColumn="0" w:lastRowFirstColumn="0" w:lastRowLastColumn="0"/>
+            </w:pPr>
+            <w:r>
+              <w:t>Should</w:t>
+            </w:r>
+          </w:p>
+        </w:tc>
+      </w:tr>
+      <w:tr>
+        <w:trPr>
+          <w:cnfStyle w:val="000000100000" w:firstRow="0" w:lastRow="0" w:firstColumn="0" w:lastColumn="0" w:oddVBand="0" w:evenVBand="0" w:oddHBand="1" w:evenHBand="0" w:firstRowFirstColumn="0" w:firstRowLastColumn="0" w:lastRowFirstColumn="0" w:lastRowLastColumn="0"/>
+        </w:trPr>
+        <w:tc>
+          <w:tcPr>
+            <w:cnfStyle w:val="001000000000" w:firstRow="0" w:lastRow="0" w:firstColumn="1" w:lastColumn="0" w:oddVBand="0" w:evenVBand="0" w:oddHBand="0" w:evenHBand="0" w:firstRowFirstColumn="0" w:firstRowLastColumn="0" w:lastRowFirstColumn="0" w:lastRowLastColumn="0"/>
+            <w:tcW w:w="793" w:type="dxa"/>
+          </w:tcPr>
+          <w:p>
+            <w:r>
+              <w:t>NFR-005</w:t>
+            </w:r>
+          </w:p>
+        </w:tc>
+        <w:tc>
+          <w:tcPr>
+            <w:tcW w:w="1742" w:type="dxa"/>
+          </w:tcPr>
+          <w:p>
+            <w:pPr>
+              <w:cnfStyle w:val="000000100000" w:firstRow="0" w:lastRow="0" w:firstColumn="0" w:lastColumn="0" w:oddVBand="0" w:evenVBand="0" w:oddHBand="1" w:evenHBand="0" w:firstRowFirstColumn="0" w:firstRowLastColumn="0" w:lastRowFirstColumn="0" w:lastRowLastColumn="0"/>
+            </w:pPr>
+            <w:r>
+              <w:t>Auditability</w:t>
+            </w:r>
+          </w:p>
+        </w:tc>
+        <w:tc>
+          <w:tcPr>
+            <w:tcW w:w="1637" w:type="dxa"/>
+          </w:tcPr>
+          <w:p>
+            <w:pPr>
+              <w:cnfStyle w:val="000000100000" w:firstRow="0" w:lastRow="0" w:firstColumn="0" w:lastColumn="0" w:oddVBand="0" w:evenVBand="0" w:oddHBand="1" w:evenHBand="0" w:firstRowFirstColumn="0" w:firstRowLastColumn="0" w:lastRowFirstColumn="0" w:lastRowLastColumn="0"/>
+            </w:pPr>
+            <w:r>
+              <w:t xml:space="preserve">Every staff action and status change on a request must be recorded, along with </w:t>
+            </w:r>
+            <w:r>
+              <w:t>the</w:t>
+            </w:r>
+            <w:r>
+              <w:t xml:space="preserve"> person who made the change and when</w:t>
+            </w:r>
+            <w:r>
+              <w:t>. This history must not be able to be edited.</w:t>
+            </w:r>
+          </w:p>
+        </w:tc>
+        <w:tc>
+          <w:tcPr>
+            <w:tcW w:w="2150" w:type="dxa"/>
+          </w:tcPr>
+          <w:p>
+            <w:pPr>
+              <w:cnfStyle w:val="000000100000" w:firstRow="0" w:lastRow="0" w:firstColumn="0" w:lastColumn="0" w:oddVBand="0" w:evenVBand="0" w:oddHBand="1" w:evenHBand="0" w:firstRowFirstColumn="0" w:firstRowLastColumn="0" w:lastRowFirstColumn="0" w:lastRowLastColumn="0"/>
+            </w:pPr>
+            <w:r>
+              <w:t>Traceability/ business need</w:t>
+            </w:r>
+          </w:p>
+        </w:tc>
+        <w:tc>
+          <w:tcPr>
+            <w:tcW w:w="1024" w:type="dxa"/>
+          </w:tcPr>
+          <w:p>
+            <w:pPr>
+              <w:cnfStyle w:val="000000100000" w:firstRow="0" w:lastRow="0" w:firstColumn="0" w:lastColumn="0" w:oddVBand="0" w:evenVBand="0" w:oddHBand="1" w:evenHBand="0" w:firstRowFirstColumn="0" w:firstRowLastColumn="0" w:lastRowFirstColumn="0" w:lastRowLastColumn="0"/>
+            </w:pPr>
+            <w:r>
+              <w:t>Must</w:t>
+            </w:r>
+          </w:p>
+        </w:tc>
+      </w:tr>
+      <w:tr>
+        <w:tc>
+          <w:tcPr>
+            <w:cnfStyle w:val="001000000000" w:firstRow="0" w:lastRow="0" w:firstColumn="1" w:lastColumn="0" w:oddVBand="0" w:evenVBand="0" w:oddHBand="0" w:evenHBand="0" w:firstRowFirstColumn="0" w:firstRowLastColumn="0" w:lastRowFirstColumn="0" w:lastRowLastColumn="0"/>
+            <w:tcW w:w="793" w:type="dxa"/>
+          </w:tcPr>
+          <w:p>
+            <w:r>
+              <w:t>NFR-006</w:t>
+            </w:r>
+          </w:p>
+        </w:tc>
+        <w:tc>
+          <w:tcPr>
+            <w:tcW w:w="1742" w:type="dxa"/>
+          </w:tcPr>
+          <w:p>
+            <w:pPr>
+              <w:cnfStyle w:val="000000000000" w:firstRow="0" w:lastRow="0" w:firstColumn="0" w:lastColumn="0" w:oddVBand="0" w:evenVBand="0" w:oddHBand="0" w:evenHBand="0" w:firstRowFirstColumn="0" w:firstRowLastColumn="0" w:lastRowFirstColumn="0" w:lastRowLastColumn="0"/>
+            </w:pPr>
+            <w:r>
+              <w:t>Maintainability</w:t>
+            </w:r>
+          </w:p>
+        </w:tc>
+        <w:tc>
+          <w:tcPr>
+            <w:tcW w:w="1637" w:type="dxa"/>
+          </w:tcPr>
+          <w:p>
+            <w:pPr>
+              <w:cnfStyle w:val="000000000000" w:firstRow="0" w:lastRow="0" w:firstColumn="0" w:lastColumn="0" w:oddVBand="0" w:evenVBand="0" w:oddHBand="0" w:evenHBand="0" w:firstRowFirstColumn="0" w:firstRowLastColumn="0" w:lastRowFirstColumn="0" w:lastRowLastColumn="0"/>
+            </w:pPr>
+            <w:r>
+              <w:t>For</w:t>
+            </w:r>
+            <w:r>
+              <w:t xml:space="preserve"> a new </w:t>
+            </w:r>
+            <w:r>
+              <w:t>team member</w:t>
+            </w:r>
+            <w:r>
+              <w:rPr>
+                <w:rStyle w:val="FootnoteReference"/>
+              </w:rPr>
+              <w:footnoteReference w:id="1"/>
+            </w:r>
+            <w:r>
+              <w:t xml:space="preserve"> </w:t>
+            </w:r>
+            <w:r>
+              <w:t>to find the re</w:t>
+            </w:r>
+            <w:r>
+              <w:t>quest-submission, staff-</w:t>
+            </w:r>
+            <w:r>
+              <w:t>action and</w:t>
+            </w:r>
+            <w:r>
+              <w:t xml:space="preserve"> reporting logic within a reasonable review</w:t>
+            </w:r>
+            <w:r>
+              <w:t>, the codebase must adhere to a consistent, defined structure.</w:t>
+            </w:r>
+          </w:p>
+        </w:tc>
+        <w:tc>
+          <w:tcPr>
+            <w:tcW w:w="2150" w:type="dxa"/>
+          </w:tcPr>
+          <w:p>
+            <w:pPr>
+              <w:cnfStyle w:val="000000000000" w:firstRow="0" w:lastRow="0" w:firstColumn="0" w:lastColumn="0" w:oddVBand="0" w:evenVBand="0" w:oddHBand="0" w:evenHBand="0" w:firstRowFirstColumn="0" w:firstRowLastColumn="0" w:lastRowFirstColumn="0" w:lastRowLastColumn="0"/>
+            </w:pPr>
+            <w:r>
+              <w:t xml:space="preserve"> Constraint</w:t>
+            </w:r>
+          </w:p>
+        </w:tc>
+        <w:tc>
+          <w:tcPr>
+            <w:tcW w:w="1024" w:type="dxa"/>
+          </w:tcPr>
+          <w:p>
+            <w:pPr>
+              <w:cnfStyle w:val="000000000000" w:firstRow="0" w:lastRow="0" w:firstColumn="0" w:lastColumn="0" w:oddVBand="0" w:evenVBand="0" w:oddHBand="0" w:evenHBand="0" w:firstRowFirstColumn="0" w:firstRowLastColumn="0" w:lastRowFirstColumn="0" w:lastRowLastColumn="0"/>
+            </w:pPr>
+            <w:r>
+              <w:t>Could</w:t>
+            </w:r>
+          </w:p>
+        </w:tc>
+      </w:tr>
+      <w:tr>
+        <w:trPr>
+          <w:cnfStyle w:val="000000100000" w:firstRow="0" w:lastRow="0" w:firstColumn="0" w:lastColumn="0" w:oddVBand="0" w:evenVBand="0" w:oddHBand="1" w:evenHBand="0" w:firstRowFirstColumn="0" w:firstRowLastColumn="0" w:lastRowFirstColumn="0" w:lastRowLastColumn="0"/>
+        </w:trPr>
+        <w:tc>
+          <w:tcPr>
+            <w:cnfStyle w:val="001000000000" w:firstRow="0" w:lastRow="0" w:firstColumn="1" w:lastColumn="0" w:oddVBand="0" w:evenVBand="0" w:oddHBand="0" w:evenHBand="0" w:firstRowFirstColumn="0" w:firstRowLastColumn="0" w:lastRowFirstColumn="0" w:lastRowLastColumn="0"/>
+            <w:tcW w:w="793" w:type="dxa"/>
+          </w:tcPr>
+          <w:p>
+            <w:r>
+              <w:t>NFR-007</w:t>
+            </w:r>
+          </w:p>
+        </w:tc>
+        <w:tc>
+          <w:tcPr>
+            <w:tcW w:w="1742" w:type="dxa"/>
+          </w:tcPr>
+          <w:p>
+            <w:pPr>
+              <w:cnfStyle w:val="000000100000" w:firstRow="0" w:lastRow="0" w:firstColumn="0" w:lastColumn="0" w:oddVBand="0" w:evenVBand="0" w:oddHBand="1" w:evenHBand="0" w:firstRowFirstColumn="0" w:firstRowLastColumn="0" w:lastRowFirstColumn="0" w:lastRowLastColumn="0"/>
+            </w:pPr>
+            <w:r>
+              <w:t>Scalability</w:t>
+            </w:r>
+          </w:p>
+        </w:tc>
+        <w:tc>
+          <w:tcPr>
+            <w:tcW w:w="1637" w:type="dxa"/>
+          </w:tcPr>
+          <w:p>
+            <w:pPr>
+              <w:cnfStyle w:val="000000100000" w:firstRow="0" w:lastRow="0" w:firstColumn="0" w:lastColumn="0" w:oddVBand="0" w:evenVBand="0" w:oddHBand="1" w:evenHBand="0" w:firstRowFirstColumn="0" w:firstRowLastColumn="0" w:lastRowFirstColumn="0" w:lastRowLastColumn="0"/>
+            </w:pPr>
+            <w:r>
+              <w:t>As the volume of requests exceed the initial testing dataset, the data model and queries must be made to continue to be functional</w:t>
+            </w:r>
+            <w:r>
+              <w:t>.</w:t>
+            </w:r>
+          </w:p>
+        </w:tc>
+        <w:tc>
+          <w:tcPr>
+            <w:tcW w:w="2150" w:type="dxa"/>
+          </w:tcPr>
+          <w:p>
+            <w:pPr>
+              <w:cnfStyle w:val="000000100000" w:firstRow="0" w:lastRow="0" w:firstColumn="0" w:lastColumn="0" w:oddVBand="0" w:evenVBand="0" w:oddHBand="1" w:evenHBand="0" w:firstRowFirstColumn="0" w:firstRowLastColumn="0" w:lastRowFirstColumn="0" w:lastRowLastColumn="0"/>
+            </w:pPr>
+            <w:r>
+              <w:t>Constraint/ business need</w:t>
+            </w:r>
+          </w:p>
+        </w:tc>
+        <w:tc>
+          <w:tcPr>
+            <w:tcW w:w="1024" w:type="dxa"/>
+          </w:tcPr>
+          <w:p>
+            <w:pPr>
+              <w:cnfStyle w:val="000000100000" w:firstRow="0" w:lastRow="0" w:firstColumn="0" w:lastColumn="0" w:oddVBand="0" w:evenVBand="0" w:oddHBand="1" w:evenHBand="0" w:firstRowFirstColumn="0" w:firstRowLastColumn="0" w:lastRowFirstColumn="0" w:lastRowLastColumn="0"/>
+            </w:pPr>
+            <w:r>
+              <w:t>Should</w:t>
+            </w:r>
+          </w:p>
+        </w:tc>
+      </w:tr>
+      <w:tr>
+        <w:tc>
+          <w:tcPr>
+            <w:cnfStyle w:val="001000000000" w:firstRow="0" w:lastRow="0" w:firstColumn="1" w:lastColumn="0" w:oddVBand="0" w:evenVBand="0" w:oddHBand="0" w:evenHBand="0" w:firstRowFirstColumn="0" w:firstRowLastColumn="0" w:lastRowFirstColumn="0" w:lastRowLastColumn="0"/>
+            <w:tcW w:w="793" w:type="dxa"/>
+          </w:tcPr>
+          <w:p>
+            <w:r>
+              <w:lastRenderedPageBreak/>
+              <w:t>NFR-008</w:t>
+            </w:r>
+          </w:p>
+        </w:tc>
+        <w:tc>
+          <w:tcPr>
+            <w:tcW w:w="1742" w:type="dxa"/>
+          </w:tcPr>
+          <w:p>
+            <w:pPr>
+              <w:cnfStyle w:val="000000000000" w:firstRow="0" w:lastRow="0" w:firstColumn="0" w:lastColumn="0" w:oddVBand="0" w:evenVBand="0" w:oddHBand="0" w:evenHBand="0" w:firstRowFirstColumn="0" w:firstRowLastColumn="0" w:lastRowFirstColumn="0" w:lastRowLastColumn="0"/>
+            </w:pPr>
+            <w:r>
+              <w:t>Compliance/ Data Handling</w:t>
+            </w:r>
+          </w:p>
+        </w:tc>
+        <w:tc>
+          <w:tcPr>
+            <w:tcW w:w="1637" w:type="dxa"/>
+          </w:tcPr>
+          <w:p>
+            <w:pPr>
+              <w:cnfStyle w:val="000000000000" w:firstRow="0" w:lastRow="0" w:firstColumn="0" w:lastColumn="0" w:oddVBand="0" w:evenVBand="0" w:oddHBand="0" w:evenHBand="0" w:firstRowFirstColumn="0" w:firstRowLastColumn="0" w:lastRowFirstColumn="0" w:lastRowLastColumn="0"/>
+            </w:pPr>
+            <w:r>
+              <w:t>In accordance with FR-006, only authorised roles may view private or sensitive requester data.</w:t>
+            </w:r>
+          </w:p>
+        </w:tc>
+        <w:tc>
+          <w:tcPr>
+            <w:tcW w:w="2150" w:type="dxa"/>
+          </w:tcPr>
+          <w:p>
+            <w:pPr>
+              <w:cnfStyle w:val="000000000000" w:firstRow="0" w:lastRow="0" w:firstColumn="0" w:lastColumn="0" w:oddVBand="0" w:evenVBand="0" w:oddHBand="0" w:evenHBand="0" w:firstRowFirstColumn="0" w:firstRowLastColumn="0" w:lastRowFirstColumn="0" w:lastRowLastColumn="0"/>
+            </w:pPr>
+            <w:r>
+              <w:t>Constraint/ business need</w:t>
+            </w:r>
+          </w:p>
+        </w:tc>
+        <w:tc>
+          <w:tcPr>
+            <w:tcW w:w="1024" w:type="dxa"/>
+          </w:tcPr>
+          <w:p>
+            <w:pPr>
+              <w:cnfStyle w:val="000000000000" w:firstRow="0" w:lastRow="0" w:firstColumn="0" w:lastColumn="0" w:oddVBand="0" w:evenVBand="0" w:oddHBand="0" w:evenHBand="0" w:firstRowFirstColumn="0" w:firstRowLastColumn="0" w:lastRowFirstColumn="0" w:lastRowLastColumn="0"/>
+            </w:pPr>
+            <w:r>
+              <w:t>Must</w:t>
+            </w:r>
+          </w:p>
+        </w:tc>
+      </w:tr>
+    </w:tbl>
+    <w:p/>
+    <w:p>
+      <w:pPr>
+        <w:pStyle w:val="Heading2"/>
+      </w:pPr>
+      <w:r>
+        <w:t>Acceptance criteria:</w:t>
+      </w:r>
+    </w:p>
+    <w:p/>
+    <w:p>
+      <w:pPr>
         <w:pStyle w:val="Heading1"/>
       </w:pPr>
       <w:r>
@@ -796,11 +2626,1800 @@
         <w:t>Initial RTM</w:t>
       </w:r>
     </w:p>
+    <w:tbl>
+      <w:tblPr>
+        <w:tblStyle w:val="GridTable2"/>
+        <w:tblW w:w="0" w:type="auto"/>
+        <w:tblLook w:val="04A0" w:firstRow="1" w:lastRow="0" w:firstColumn="1" w:lastColumn="0" w:noHBand="0" w:noVBand="1"/>
+      </w:tblPr>
+      <w:tblGrid>
+        <w:gridCol w:w="1386"/>
+        <w:gridCol w:w="1468"/>
+        <w:gridCol w:w="2782"/>
+        <w:gridCol w:w="1369"/>
+        <w:gridCol w:w="946"/>
+        <w:gridCol w:w="1075"/>
+      </w:tblGrid>
+      <w:tr>
+        <w:trPr>
+          <w:cnfStyle w:val="100000000000" w:firstRow="1" w:lastRow="0" w:firstColumn="0" w:lastColumn="0" w:oddVBand="0" w:evenVBand="0" w:oddHBand="0" w:evenHBand="0" w:firstRowFirstColumn="0" w:firstRowLastColumn="0" w:lastRowFirstColumn="0" w:lastRowLastColumn="0"/>
+        </w:trPr>
+        <w:tc>
+          <w:tcPr>
+            <w:cnfStyle w:val="001000000000" w:firstRow="0" w:lastRow="0" w:firstColumn="1" w:lastColumn="0" w:oddVBand="0" w:evenVBand="0" w:oddHBand="0" w:evenHBand="0" w:firstRowFirstColumn="0" w:firstRowLastColumn="0" w:lastRowFirstColumn="0" w:lastRowLastColumn="0"/>
+            <w:tcW w:w="1386" w:type="dxa"/>
+          </w:tcPr>
+          <w:p>
+            <w:r>
+              <w:t>So</w:t>
+            </w:r>
+            <w:r>
+              <w:t>urce/ Stakeholder</w:t>
+            </w:r>
+          </w:p>
+        </w:tc>
+        <w:tc>
+          <w:tcPr>
+            <w:tcW w:w="1024" w:type="dxa"/>
+          </w:tcPr>
+          <w:p>
+            <w:pPr>
+              <w:cnfStyle w:val="100000000000" w:firstRow="1" w:lastRow="0" w:firstColumn="0" w:lastColumn="0" w:oddVBand="0" w:evenVBand="0" w:oddHBand="0" w:evenHBand="0" w:firstRowFirstColumn="0" w:firstRowLastColumn="0" w:lastRowFirstColumn="0" w:lastRowLastColumn="0"/>
+            </w:pPr>
+            <w:r>
+              <w:t>Requirement ID</w:t>
+            </w:r>
+          </w:p>
+        </w:tc>
+        <w:tc>
+          <w:tcPr>
+            <w:tcW w:w="3226" w:type="dxa"/>
+          </w:tcPr>
+          <w:p>
+            <w:pPr>
+              <w:cnfStyle w:val="100000000000" w:firstRow="1" w:lastRow="0" w:firstColumn="0" w:lastColumn="0" w:oddVBand="0" w:evenVBand="0" w:oddHBand="0" w:evenHBand="0" w:firstRowFirstColumn="0" w:firstRowLastColumn="0" w:lastRowFirstColumn="0" w:lastRowLastColumn="0"/>
+            </w:pPr>
+            <w:r>
+              <w:t>Requirement Summary</w:t>
+            </w:r>
+          </w:p>
+        </w:tc>
+        <w:tc>
+          <w:tcPr>
+            <w:tcW w:w="1369" w:type="dxa"/>
+          </w:tcPr>
+          <w:p>
+            <w:pPr>
+              <w:cnfStyle w:val="100000000000" w:firstRow="1" w:lastRow="0" w:firstColumn="0" w:lastColumn="0" w:oddVBand="0" w:evenVBand="0" w:oddHBand="0" w:evenHBand="0" w:firstRowFirstColumn="0" w:firstRowLastColumn="0" w:lastRowFirstColumn="0" w:lastRowLastColumn="0"/>
+            </w:pPr>
+            <w:r>
+              <w:t>Acceptance Criteria</w:t>
+            </w:r>
+            <w:r>
+              <w:t xml:space="preserve"> (AC)</w:t>
+            </w:r>
+          </w:p>
+        </w:tc>
+        <w:tc>
+          <w:tcPr>
+            <w:tcW w:w="946" w:type="dxa"/>
+          </w:tcPr>
+          <w:p>
+            <w:pPr>
+              <w:cnfStyle w:val="100000000000" w:firstRow="1" w:lastRow="0" w:firstColumn="0" w:lastColumn="0" w:oddVBand="0" w:evenVBand="0" w:oddHBand="0" w:evenHBand="0" w:firstRowFirstColumn="0" w:firstRowLastColumn="0" w:lastRowFirstColumn="0" w:lastRowLastColumn="0"/>
+            </w:pPr>
+            <w:r>
+              <w:t>Design</w:t>
+            </w:r>
+          </w:p>
+        </w:tc>
+        <w:tc>
+          <w:tcPr>
+            <w:tcW w:w="1075" w:type="dxa"/>
+          </w:tcPr>
+          <w:p>
+            <w:pPr>
+              <w:cnfStyle w:val="100000000000" w:firstRow="1" w:lastRow="0" w:firstColumn="0" w:lastColumn="0" w:oddVBand="0" w:evenVBand="0" w:oddHBand="0" w:evenHBand="0" w:firstRowFirstColumn="0" w:firstRowLastColumn="0" w:lastRowFirstColumn="0" w:lastRowLastColumn="0"/>
+            </w:pPr>
+            <w:r>
+              <w:t>Issue/PR</w:t>
+            </w:r>
+          </w:p>
+        </w:tc>
+      </w:tr>
+      <w:tr>
+        <w:trPr>
+          <w:cnfStyle w:val="000000100000" w:firstRow="0" w:lastRow="0" w:firstColumn="0" w:lastColumn="0" w:oddVBand="0" w:evenVBand="0" w:oddHBand="1" w:evenHBand="0" w:firstRowFirstColumn="0" w:firstRowLastColumn="0" w:lastRowFirstColumn="0" w:lastRowLastColumn="0"/>
+        </w:trPr>
+        <w:tc>
+          <w:tcPr>
+            <w:cnfStyle w:val="001000000000" w:firstRow="0" w:lastRow="0" w:firstColumn="1" w:lastColumn="0" w:oddVBand="0" w:evenVBand="0" w:oddHBand="0" w:evenHBand="0" w:firstRowFirstColumn="0" w:firstRowLastColumn="0" w:lastRowFirstColumn="0" w:lastRowLastColumn="0"/>
+            <w:tcW w:w="1386" w:type="dxa"/>
+          </w:tcPr>
+          <w:p>
+            <w:r>
+              <w:t>Requester</w:t>
+            </w:r>
+          </w:p>
+        </w:tc>
+        <w:tc>
+          <w:tcPr>
+            <w:tcW w:w="1024" w:type="dxa"/>
+          </w:tcPr>
+          <w:p>
+            <w:pPr>
+              <w:cnfStyle w:val="000000100000" w:firstRow="0" w:lastRow="0" w:firstColumn="0" w:lastColumn="0" w:oddVBand="0" w:evenVBand="0" w:oddHBand="1" w:evenHBand="0" w:firstRowFirstColumn="0" w:firstRowLastColumn="0" w:lastRowFirstColumn="0" w:lastRowLastColumn="0"/>
+            </w:pPr>
+            <w:r>
+              <w:t>FR-001</w:t>
+            </w:r>
+          </w:p>
+        </w:tc>
+        <w:tc>
+          <w:tcPr>
+            <w:tcW w:w="3226" w:type="dxa"/>
+          </w:tcPr>
+          <w:p>
+            <w:pPr>
+              <w:cnfStyle w:val="000000100000" w:firstRow="0" w:lastRow="0" w:firstColumn="0" w:lastColumn="0" w:oddVBand="0" w:evenVBand="0" w:oddHBand="1" w:evenHBand="0" w:firstRowFirstColumn="0" w:firstRowLastColumn="0" w:lastRowFirstColumn="0" w:lastRowLastColumn="0"/>
+            </w:pPr>
+            <w:r>
+              <w:t>Submit new request</w:t>
+            </w:r>
+          </w:p>
+        </w:tc>
+        <w:tc>
+          <w:tcPr>
+            <w:tcW w:w="1369" w:type="dxa"/>
+          </w:tcPr>
+          <w:p>
+            <w:pPr>
+              <w:cnfStyle w:val="000000100000" w:firstRow="0" w:lastRow="0" w:firstColumn="0" w:lastColumn="0" w:oddVBand="0" w:evenVBand="0" w:oddHBand="1" w:evenHBand="0" w:firstRowFirstColumn="0" w:firstRowLastColumn="0" w:lastRowFirstColumn="0" w:lastRowLastColumn="0"/>
+            </w:pPr>
+            <w:r>
+              <w:t>See FR-001 AC</w:t>
+            </w:r>
+          </w:p>
+        </w:tc>
+        <w:tc>
+          <w:tcPr>
+            <w:tcW w:w="946" w:type="dxa"/>
+          </w:tcPr>
+          <w:p>
+            <w:pPr>
+              <w:cnfStyle w:val="000000100000" w:firstRow="0" w:lastRow="0" w:firstColumn="0" w:lastColumn="0" w:oddVBand="0" w:evenVBand="0" w:oddHBand="1" w:evenHBand="0" w:firstRowFirstColumn="0" w:firstRowLastColumn="0" w:lastRowFirstColumn="0" w:lastRowLastColumn="0"/>
+            </w:pPr>
+            <w:r>
+              <w:t>Pending M2</w:t>
+            </w:r>
+          </w:p>
+        </w:tc>
+        <w:tc>
+          <w:tcPr>
+            <w:tcW w:w="1075" w:type="dxa"/>
+          </w:tcPr>
+          <w:p>
+            <w:pPr>
+              <w:cnfStyle w:val="000000100000" w:firstRow="0" w:lastRow="0" w:firstColumn="0" w:lastColumn="0" w:oddVBand="0" w:evenVBand="0" w:oddHBand="1" w:evenHBand="0" w:firstRowFirstColumn="0" w:firstRowLastColumn="0" w:lastRowFirstColumn="0" w:lastRowLastColumn="0"/>
+            </w:pPr>
+            <w:r>
+              <w:t>Pending M3</w:t>
+            </w:r>
+          </w:p>
+        </w:tc>
+      </w:tr>
+      <w:tr>
+        <w:tc>
+          <w:tcPr>
+            <w:cnfStyle w:val="001000000000" w:firstRow="0" w:lastRow="0" w:firstColumn="1" w:lastColumn="0" w:oddVBand="0" w:evenVBand="0" w:oddHBand="0" w:evenHBand="0" w:firstRowFirstColumn="0" w:firstRowLastColumn="0" w:lastRowFirstColumn="0" w:lastRowLastColumn="0"/>
+            <w:tcW w:w="1386" w:type="dxa"/>
+          </w:tcPr>
+          <w:p>
+            <w:r>
+              <w:t>Requester</w:t>
+            </w:r>
+          </w:p>
+        </w:tc>
+        <w:tc>
+          <w:tcPr>
+            <w:tcW w:w="1024" w:type="dxa"/>
+          </w:tcPr>
+          <w:p>
+            <w:pPr>
+              <w:cnfStyle w:val="000000000000" w:firstRow="0" w:lastRow="0" w:firstColumn="0" w:lastColumn="0" w:oddVBand="0" w:evenVBand="0" w:oddHBand="0" w:evenHBand="0" w:firstRowFirstColumn="0" w:firstRowLastColumn="0" w:lastRowFirstColumn="0" w:lastRowLastColumn="0"/>
+            </w:pPr>
+            <w:r>
+              <w:t>FR-002</w:t>
+            </w:r>
+          </w:p>
+        </w:tc>
+        <w:tc>
+          <w:tcPr>
+            <w:tcW w:w="3226" w:type="dxa"/>
+          </w:tcPr>
+          <w:p>
+            <w:pPr>
+              <w:cnfStyle w:val="000000000000" w:firstRow="0" w:lastRow="0" w:firstColumn="0" w:lastColumn="0" w:oddVBand="0" w:evenVBand="0" w:oddHBand="0" w:evenHBand="0" w:firstRowFirstColumn="0" w:firstRowLastColumn="0" w:lastRowFirstColumn="0" w:lastRowLastColumn="0"/>
+            </w:pPr>
+            <w:r>
+              <w:t>Controlled category selection</w:t>
+            </w:r>
+          </w:p>
+        </w:tc>
+        <w:tc>
+          <w:tcPr>
+            <w:tcW w:w="1369" w:type="dxa"/>
+          </w:tcPr>
+          <w:p>
+            <w:pPr>
+              <w:cnfStyle w:val="000000000000" w:firstRow="0" w:lastRow="0" w:firstColumn="0" w:lastColumn="0" w:oddVBand="0" w:evenVBand="0" w:oddHBand="0" w:evenHBand="0" w:firstRowFirstColumn="0" w:firstRowLastColumn="0" w:lastRowFirstColumn="0" w:lastRowLastColumn="0"/>
+            </w:pPr>
+            <w:r>
+              <w:t>See FR-00</w:t>
+            </w:r>
+            <w:r>
+              <w:t>2</w:t>
+            </w:r>
+            <w:r>
+              <w:t xml:space="preserve"> AC</w:t>
+            </w:r>
+          </w:p>
+        </w:tc>
+        <w:tc>
+          <w:tcPr>
+            <w:tcW w:w="946" w:type="dxa"/>
+          </w:tcPr>
+          <w:p>
+            <w:pPr>
+              <w:cnfStyle w:val="000000000000" w:firstRow="0" w:lastRow="0" w:firstColumn="0" w:lastColumn="0" w:oddVBand="0" w:evenVBand="0" w:oddHBand="0" w:evenHBand="0" w:firstRowFirstColumn="0" w:firstRowLastColumn="0" w:lastRowFirstColumn="0" w:lastRowLastColumn="0"/>
+            </w:pPr>
+            <w:r>
+              <w:t>Pending M2</w:t>
+            </w:r>
+          </w:p>
+        </w:tc>
+        <w:tc>
+          <w:tcPr>
+            <w:tcW w:w="1075" w:type="dxa"/>
+          </w:tcPr>
+          <w:p>
+            <w:pPr>
+              <w:cnfStyle w:val="000000000000" w:firstRow="0" w:lastRow="0" w:firstColumn="0" w:lastColumn="0" w:oddVBand="0" w:evenVBand="0" w:oddHBand="0" w:evenHBand="0" w:firstRowFirstColumn="0" w:firstRowLastColumn="0" w:lastRowFirstColumn="0" w:lastRowLastColumn="0"/>
+            </w:pPr>
+            <w:r>
+              <w:t>Pending M3</w:t>
+            </w:r>
+          </w:p>
+        </w:tc>
+      </w:tr>
+      <w:tr>
+        <w:trPr>
+          <w:cnfStyle w:val="000000100000" w:firstRow="0" w:lastRow="0" w:firstColumn="0" w:lastColumn="0" w:oddVBand="0" w:evenVBand="0" w:oddHBand="1" w:evenHBand="0" w:firstRowFirstColumn="0" w:firstRowLastColumn="0" w:lastRowFirstColumn="0" w:lastRowLastColumn="0"/>
+        </w:trPr>
+        <w:tc>
+          <w:tcPr>
+            <w:cnfStyle w:val="001000000000" w:firstRow="0" w:lastRow="0" w:firstColumn="1" w:lastColumn="0" w:oddVBand="0" w:evenVBand="0" w:oddHBand="0" w:evenHBand="0" w:firstRowFirstColumn="0" w:firstRowLastColumn="0" w:lastRowFirstColumn="0" w:lastRowLastColumn="0"/>
+            <w:tcW w:w="1386" w:type="dxa"/>
+          </w:tcPr>
+          <w:p>
+            <w:r>
+              <w:t>Requester</w:t>
+            </w:r>
+          </w:p>
+        </w:tc>
+        <w:tc>
+          <w:tcPr>
+            <w:tcW w:w="1024" w:type="dxa"/>
+          </w:tcPr>
+          <w:p>
+            <w:pPr>
+              <w:cnfStyle w:val="000000100000" w:firstRow="0" w:lastRow="0" w:firstColumn="0" w:lastColumn="0" w:oddVBand="0" w:evenVBand="0" w:oddHBand="1" w:evenHBand="0" w:firstRowFirstColumn="0" w:firstRowLastColumn="0" w:lastRowFirstColumn="0" w:lastRowLastColumn="0"/>
+            </w:pPr>
+            <w:r>
+              <w:t>FR-003</w:t>
+            </w:r>
+          </w:p>
+        </w:tc>
+        <w:tc>
+          <w:tcPr>
+            <w:tcW w:w="3226" w:type="dxa"/>
+          </w:tcPr>
+          <w:p>
+            <w:pPr>
+              <w:cnfStyle w:val="000000100000" w:firstRow="0" w:lastRow="0" w:firstColumn="0" w:lastColumn="0" w:oddVBand="0" w:evenVBand="0" w:oddHBand="1" w:evenHBand="0" w:firstRowFirstColumn="0" w:firstRowLastColumn="0" w:lastRowFirstColumn="0" w:lastRowLastColumn="0"/>
+            </w:pPr>
+            <w:r>
+              <w:t xml:space="preserve">View </w:t>
+            </w:r>
+            <w:r>
+              <w:t>own request status</w:t>
+            </w:r>
+          </w:p>
+        </w:tc>
+        <w:tc>
+          <w:tcPr>
+            <w:tcW w:w="1369" w:type="dxa"/>
+          </w:tcPr>
+          <w:p>
+            <w:pPr>
+              <w:cnfStyle w:val="000000100000" w:firstRow="0" w:lastRow="0" w:firstColumn="0" w:lastColumn="0" w:oddVBand="0" w:evenVBand="0" w:oddHBand="1" w:evenHBand="0" w:firstRowFirstColumn="0" w:firstRowLastColumn="0" w:lastRowFirstColumn="0" w:lastRowLastColumn="0"/>
+            </w:pPr>
+            <w:r>
+              <w:t>See FR-00</w:t>
+            </w:r>
+            <w:r>
+              <w:t>3</w:t>
+            </w:r>
+            <w:r>
+              <w:t xml:space="preserve"> AC</w:t>
+            </w:r>
+          </w:p>
+        </w:tc>
+        <w:tc>
+          <w:tcPr>
+            <w:tcW w:w="946" w:type="dxa"/>
+          </w:tcPr>
+          <w:p>
+            <w:pPr>
+              <w:cnfStyle w:val="000000100000" w:firstRow="0" w:lastRow="0" w:firstColumn="0" w:lastColumn="0" w:oddVBand="0" w:evenVBand="0" w:oddHBand="1" w:evenHBand="0" w:firstRowFirstColumn="0" w:firstRowLastColumn="0" w:lastRowFirstColumn="0" w:lastRowLastColumn="0"/>
+            </w:pPr>
+            <w:r>
+              <w:t>Pending M2</w:t>
+            </w:r>
+          </w:p>
+        </w:tc>
+        <w:tc>
+          <w:tcPr>
+            <w:tcW w:w="1075" w:type="dxa"/>
+          </w:tcPr>
+          <w:p>
+            <w:pPr>
+              <w:cnfStyle w:val="000000100000" w:firstRow="0" w:lastRow="0" w:firstColumn="0" w:lastColumn="0" w:oddVBand="0" w:evenVBand="0" w:oddHBand="1" w:evenHBand="0" w:firstRowFirstColumn="0" w:firstRowLastColumn="0" w:lastRowFirstColumn="0" w:lastRowLastColumn="0"/>
+            </w:pPr>
+            <w:r>
+              <w:t>Pending M3</w:t>
+            </w:r>
+          </w:p>
+        </w:tc>
+      </w:tr>
+      <w:tr>
+        <w:tc>
+          <w:tcPr>
+            <w:cnfStyle w:val="001000000000" w:firstRow="0" w:lastRow="0" w:firstColumn="1" w:lastColumn="0" w:oddVBand="0" w:evenVBand="0" w:oddHBand="0" w:evenHBand="0" w:firstRowFirstColumn="0" w:firstRowLastColumn="0" w:lastRowFirstColumn="0" w:lastRowLastColumn="0"/>
+            <w:tcW w:w="1386" w:type="dxa"/>
+          </w:tcPr>
+          <w:p>
+            <w:r>
+              <w:t>Requester</w:t>
+            </w:r>
+          </w:p>
+        </w:tc>
+        <w:tc>
+          <w:tcPr>
+            <w:tcW w:w="1024" w:type="dxa"/>
+          </w:tcPr>
+          <w:p>
+            <w:pPr>
+              <w:cnfStyle w:val="000000000000" w:firstRow="0" w:lastRow="0" w:firstColumn="0" w:lastColumn="0" w:oddVBand="0" w:evenVBand="0" w:oddHBand="0" w:evenHBand="0" w:firstRowFirstColumn="0" w:firstRowLastColumn="0" w:lastRowFirstColumn="0" w:lastRowLastColumn="0"/>
+            </w:pPr>
+            <w:r>
+              <w:t>FR-004</w:t>
+            </w:r>
+          </w:p>
+        </w:tc>
+        <w:tc>
+          <w:tcPr>
+            <w:tcW w:w="3226" w:type="dxa"/>
+          </w:tcPr>
+          <w:p>
+            <w:pPr>
+              <w:cnfStyle w:val="000000000000" w:firstRow="0" w:lastRow="0" w:firstColumn="0" w:lastColumn="0" w:oddVBand="0" w:evenVBand="0" w:oddHBand="0" w:evenHBand="0" w:firstRowFirstColumn="0" w:firstRowLastColumn="0" w:lastRowFirstColumn="0" w:lastRowLastColumn="0"/>
+            </w:pPr>
+            <w:r>
+              <w:t>View own request history</w:t>
+            </w:r>
+          </w:p>
+        </w:tc>
+        <w:tc>
+          <w:tcPr>
+            <w:tcW w:w="1369" w:type="dxa"/>
+          </w:tcPr>
+          <w:p>
+            <w:pPr>
+              <w:cnfStyle w:val="000000000000" w:firstRow="0" w:lastRow="0" w:firstColumn="0" w:lastColumn="0" w:oddVBand="0" w:evenVBand="0" w:oddHBand="0" w:evenHBand="0" w:firstRowFirstColumn="0" w:firstRowLastColumn="0" w:lastRowFirstColumn="0" w:lastRowLastColumn="0"/>
+            </w:pPr>
+            <w:r>
+              <w:t>See FR-00</w:t>
+            </w:r>
+            <w:r>
+              <w:t>4</w:t>
+            </w:r>
+            <w:r>
+              <w:t xml:space="preserve"> AC</w:t>
+            </w:r>
+          </w:p>
+        </w:tc>
+        <w:tc>
+          <w:tcPr>
+            <w:tcW w:w="946" w:type="dxa"/>
+          </w:tcPr>
+          <w:p>
+            <w:pPr>
+              <w:cnfStyle w:val="000000000000" w:firstRow="0" w:lastRow="0" w:firstColumn="0" w:lastColumn="0" w:oddVBand="0" w:evenVBand="0" w:oddHBand="0" w:evenHBand="0" w:firstRowFirstColumn="0" w:firstRowLastColumn="0" w:lastRowFirstColumn="0" w:lastRowLastColumn="0"/>
+            </w:pPr>
+            <w:r>
+              <w:t>Pending M2</w:t>
+            </w:r>
+          </w:p>
+        </w:tc>
+        <w:tc>
+          <w:tcPr>
+            <w:tcW w:w="1075" w:type="dxa"/>
+          </w:tcPr>
+          <w:p>
+            <w:pPr>
+              <w:cnfStyle w:val="000000000000" w:firstRow="0" w:lastRow="0" w:firstColumn="0" w:lastColumn="0" w:oddVBand="0" w:evenVBand="0" w:oddHBand="0" w:evenHBand="0" w:firstRowFirstColumn="0" w:firstRowLastColumn="0" w:lastRowFirstColumn="0" w:lastRowLastColumn="0"/>
+            </w:pPr>
+            <w:r>
+              <w:t>Pending M3</w:t>
+            </w:r>
+          </w:p>
+        </w:tc>
+      </w:tr>
+      <w:tr>
+        <w:trPr>
+          <w:cnfStyle w:val="000000100000" w:firstRow="0" w:lastRow="0" w:firstColumn="0" w:lastColumn="0" w:oddVBand="0" w:evenVBand="0" w:oddHBand="1" w:evenHBand="0" w:firstRowFirstColumn="0" w:firstRowLastColumn="0" w:lastRowFirstColumn="0" w:lastRowLastColumn="0"/>
+        </w:trPr>
+        <w:tc>
+          <w:tcPr>
+            <w:cnfStyle w:val="001000000000" w:firstRow="0" w:lastRow="0" w:firstColumn="1" w:lastColumn="0" w:oddVBand="0" w:evenVBand="0" w:oddHBand="0" w:evenHBand="0" w:firstRowFirstColumn="0" w:firstRowLastColumn="0" w:lastRowFirstColumn="0" w:lastRowLastColumn="0"/>
+            <w:tcW w:w="1386" w:type="dxa"/>
+          </w:tcPr>
+          <w:p>
+            <w:r>
+              <w:t>Requester</w:t>
+            </w:r>
+          </w:p>
+        </w:tc>
+        <w:tc>
+          <w:tcPr>
+            <w:tcW w:w="1024" w:type="dxa"/>
+          </w:tcPr>
+          <w:p>
+            <w:pPr>
+              <w:cnfStyle w:val="000000100000" w:firstRow="0" w:lastRow="0" w:firstColumn="0" w:lastColumn="0" w:oddVBand="0" w:evenVBand="0" w:oddHBand="1" w:evenHBand="0" w:firstRowFirstColumn="0" w:firstRowLastColumn="0" w:lastRowFirstColumn="0" w:lastRowLastColumn="0"/>
+            </w:pPr>
+            <w:r>
+              <w:t>FR-005</w:t>
+            </w:r>
+          </w:p>
+        </w:tc>
+        <w:tc>
+          <w:tcPr>
+            <w:tcW w:w="3226" w:type="dxa"/>
+          </w:tcPr>
+          <w:p>
+            <w:pPr>
+              <w:cnfStyle w:val="000000100000" w:firstRow="0" w:lastRow="0" w:firstColumn="0" w:lastColumn="0" w:oddVBand="0" w:evenVBand="0" w:oddHBand="1" w:evenHBand="0" w:firstRowFirstColumn="0" w:firstRowLastColumn="0" w:lastRowFirstColumn="0" w:lastRowLastColumn="0"/>
+            </w:pPr>
+            <w:r>
+              <w:t>Feedback on status change</w:t>
+            </w:r>
+          </w:p>
+        </w:tc>
+        <w:tc>
+          <w:tcPr>
+            <w:tcW w:w="1369" w:type="dxa"/>
+          </w:tcPr>
+          <w:p>
+            <w:pPr>
+              <w:cnfStyle w:val="000000100000" w:firstRow="0" w:lastRow="0" w:firstColumn="0" w:lastColumn="0" w:oddVBand="0" w:evenVBand="0" w:oddHBand="1" w:evenHBand="0" w:firstRowFirstColumn="0" w:firstRowLastColumn="0" w:lastRowFirstColumn="0" w:lastRowLastColumn="0"/>
+            </w:pPr>
+            <w:r>
+              <w:t>See FR-00</w:t>
+            </w:r>
+            <w:r>
+              <w:t>5</w:t>
+            </w:r>
+            <w:r>
+              <w:t xml:space="preserve"> AC</w:t>
+            </w:r>
+          </w:p>
+        </w:tc>
+        <w:tc>
+          <w:tcPr>
+            <w:tcW w:w="946" w:type="dxa"/>
+          </w:tcPr>
+          <w:p>
+            <w:pPr>
+              <w:cnfStyle w:val="000000100000" w:firstRow="0" w:lastRow="0" w:firstColumn="0" w:lastColumn="0" w:oddVBand="0" w:evenVBand="0" w:oddHBand="1" w:evenHBand="0" w:firstRowFirstColumn="0" w:firstRowLastColumn="0" w:lastRowFirstColumn="0" w:lastRowLastColumn="0"/>
+            </w:pPr>
+            <w:r>
+              <w:t>Pending M2</w:t>
+            </w:r>
+          </w:p>
+        </w:tc>
+        <w:tc>
+          <w:tcPr>
+            <w:tcW w:w="1075" w:type="dxa"/>
+          </w:tcPr>
+          <w:p>
+            <w:pPr>
+              <w:cnfStyle w:val="000000100000" w:firstRow="0" w:lastRow="0" w:firstColumn="0" w:lastColumn="0" w:oddVBand="0" w:evenVBand="0" w:oddHBand="1" w:evenHBand="0" w:firstRowFirstColumn="0" w:firstRowLastColumn="0" w:lastRowFirstColumn="0" w:lastRowLastColumn="0"/>
+            </w:pPr>
+            <w:r>
+              <w:t>Pending M3</w:t>
+            </w:r>
+          </w:p>
+        </w:tc>
+      </w:tr>
+      <w:tr>
+        <w:tc>
+          <w:tcPr>
+            <w:cnfStyle w:val="001000000000" w:firstRow="0" w:lastRow="0" w:firstColumn="1" w:lastColumn="0" w:oddVBand="0" w:evenVBand="0" w:oddHBand="0" w:evenHBand="0" w:firstRowFirstColumn="0" w:firstRowLastColumn="0" w:lastRowFirstColumn="0" w:lastRowLastColumn="0"/>
+            <w:tcW w:w="1386" w:type="dxa"/>
+          </w:tcPr>
+          <w:p>
+            <w:r>
+              <w:t>Security Constraint</w:t>
+            </w:r>
+          </w:p>
+        </w:tc>
+        <w:tc>
+          <w:tcPr>
+            <w:tcW w:w="1024" w:type="dxa"/>
+          </w:tcPr>
+          <w:p>
+            <w:pPr>
+              <w:cnfStyle w:val="000000000000" w:firstRow="0" w:lastRow="0" w:firstColumn="0" w:lastColumn="0" w:oddVBand="0" w:evenVBand="0" w:oddHBand="0" w:evenHBand="0" w:firstRowFirstColumn="0" w:firstRowLastColumn="0" w:lastRowFirstColumn="0" w:lastRowLastColumn="0"/>
+            </w:pPr>
+            <w:r>
+              <w:t>FR-006</w:t>
+            </w:r>
+          </w:p>
+        </w:tc>
+        <w:tc>
+          <w:tcPr>
+            <w:tcW w:w="3226" w:type="dxa"/>
+          </w:tcPr>
+          <w:p>
+            <w:pPr>
+              <w:cnfStyle w:val="000000000000" w:firstRow="0" w:lastRow="0" w:firstColumn="0" w:lastColumn="0" w:oddVBand="0" w:evenVBand="0" w:oddHBand="0" w:evenHBand="0" w:firstRowFirstColumn="0" w:firstRowLastColumn="0" w:lastRowFirstColumn="0" w:lastRowLastColumn="0"/>
+            </w:pPr>
+            <w:r>
+              <w:t>Role-based access control</w:t>
+            </w:r>
+          </w:p>
+        </w:tc>
+        <w:tc>
+          <w:tcPr>
+            <w:tcW w:w="1369" w:type="dxa"/>
+          </w:tcPr>
+          <w:p>
+            <w:pPr>
+              <w:cnfStyle w:val="000000000000" w:firstRow="0" w:lastRow="0" w:firstColumn="0" w:lastColumn="0" w:oddVBand="0" w:evenVBand="0" w:oddHBand="0" w:evenHBand="0" w:firstRowFirstColumn="0" w:firstRowLastColumn="0" w:lastRowFirstColumn="0" w:lastRowLastColumn="0"/>
+            </w:pPr>
+            <w:r>
+              <w:t>See FR-00</w:t>
+            </w:r>
+            <w:r>
+              <w:t>6</w:t>
+            </w:r>
+            <w:r>
+              <w:t xml:space="preserve"> AC</w:t>
+            </w:r>
+          </w:p>
+        </w:tc>
+        <w:tc>
+          <w:tcPr>
+            <w:tcW w:w="946" w:type="dxa"/>
+          </w:tcPr>
+          <w:p>
+            <w:pPr>
+              <w:cnfStyle w:val="000000000000" w:firstRow="0" w:lastRow="0" w:firstColumn="0" w:lastColumn="0" w:oddVBand="0" w:evenVBand="0" w:oddHBand="0" w:evenHBand="0" w:firstRowFirstColumn="0" w:firstRowLastColumn="0" w:lastRowFirstColumn="0" w:lastRowLastColumn="0"/>
+            </w:pPr>
+            <w:r>
+              <w:t>Pending M2</w:t>
+            </w:r>
+          </w:p>
+        </w:tc>
+        <w:tc>
+          <w:tcPr>
+            <w:tcW w:w="1075" w:type="dxa"/>
+          </w:tcPr>
+          <w:p>
+            <w:pPr>
+              <w:cnfStyle w:val="000000000000" w:firstRow="0" w:lastRow="0" w:firstColumn="0" w:lastColumn="0" w:oddVBand="0" w:evenVBand="0" w:oddHBand="0" w:evenHBand="0" w:firstRowFirstColumn="0" w:firstRowLastColumn="0" w:lastRowFirstColumn="0" w:lastRowLastColumn="0"/>
+            </w:pPr>
+            <w:r>
+              <w:t>Pending M3</w:t>
+            </w:r>
+          </w:p>
+        </w:tc>
+      </w:tr>
+      <w:tr>
+        <w:trPr>
+          <w:cnfStyle w:val="000000100000" w:firstRow="0" w:lastRow="0" w:firstColumn="0" w:lastColumn="0" w:oddVBand="0" w:evenVBand="0" w:oddHBand="1" w:evenHBand="0" w:firstRowFirstColumn="0" w:firstRowLastColumn="0" w:lastRowFirstColumn="0" w:lastRowLastColumn="0"/>
+        </w:trPr>
+        <w:tc>
+          <w:tcPr>
+            <w:cnfStyle w:val="001000000000" w:firstRow="0" w:lastRow="0" w:firstColumn="1" w:lastColumn="0" w:oddVBand="0" w:evenVBand="0" w:oddHBand="0" w:evenHBand="0" w:firstRowFirstColumn="0" w:firstRowLastColumn="0" w:lastRowFirstColumn="0" w:lastRowLastColumn="0"/>
+            <w:tcW w:w="1386" w:type="dxa"/>
+          </w:tcPr>
+          <w:p>
+            <w:r>
+              <w:t>Staff</w:t>
+            </w:r>
+          </w:p>
+        </w:tc>
+        <w:tc>
+          <w:tcPr>
+            <w:tcW w:w="1024" w:type="dxa"/>
+          </w:tcPr>
+          <w:p>
+            <w:pPr>
+              <w:cnfStyle w:val="000000100000" w:firstRow="0" w:lastRow="0" w:firstColumn="0" w:lastColumn="0" w:oddVBand="0" w:evenVBand="0" w:oddHBand="1" w:evenHBand="0" w:firstRowFirstColumn="0" w:firstRowLastColumn="0" w:lastRowFirstColumn="0" w:lastRowLastColumn="0"/>
+            </w:pPr>
+            <w:r>
+              <w:t>FR-007</w:t>
+            </w:r>
+          </w:p>
+        </w:tc>
+        <w:tc>
+          <w:tcPr>
+            <w:tcW w:w="3226" w:type="dxa"/>
+          </w:tcPr>
+          <w:p>
+            <w:pPr>
+              <w:cnfStyle w:val="000000100000" w:firstRow="0" w:lastRow="0" w:firstColumn="0" w:lastColumn="0" w:oddVBand="0" w:evenVBand="0" w:oddHBand="1" w:evenHBand="0" w:firstRowFirstColumn="0" w:firstRowLastColumn="0" w:lastRowFirstColumn="0" w:lastRowLastColumn="0"/>
+            </w:pPr>
+            <w:r>
+              <w:t>View relevant requests</w:t>
+            </w:r>
+          </w:p>
+        </w:tc>
+        <w:tc>
+          <w:tcPr>
+            <w:tcW w:w="1369" w:type="dxa"/>
+          </w:tcPr>
+          <w:p>
+            <w:pPr>
+              <w:cnfStyle w:val="000000100000" w:firstRow="0" w:lastRow="0" w:firstColumn="0" w:lastColumn="0" w:oddVBand="0" w:evenVBand="0" w:oddHBand="1" w:evenHBand="0" w:firstRowFirstColumn="0" w:firstRowLastColumn="0" w:lastRowFirstColumn="0" w:lastRowLastColumn="0"/>
+            </w:pPr>
+            <w:r>
+              <w:t>See FR-00</w:t>
+            </w:r>
+            <w:r>
+              <w:t>7</w:t>
+            </w:r>
+            <w:r>
+              <w:t xml:space="preserve"> AC</w:t>
+            </w:r>
+          </w:p>
+        </w:tc>
+        <w:tc>
+          <w:tcPr>
+            <w:tcW w:w="946" w:type="dxa"/>
+          </w:tcPr>
+          <w:p>
+            <w:pPr>
+              <w:cnfStyle w:val="000000100000" w:firstRow="0" w:lastRow="0" w:firstColumn="0" w:lastColumn="0" w:oddVBand="0" w:evenVBand="0" w:oddHBand="1" w:evenHBand="0" w:firstRowFirstColumn="0" w:firstRowLastColumn="0" w:lastRowFirstColumn="0" w:lastRowLastColumn="0"/>
+            </w:pPr>
+            <w:r>
+              <w:t>Pending M2</w:t>
+            </w:r>
+          </w:p>
+        </w:tc>
+        <w:tc>
+          <w:tcPr>
+            <w:tcW w:w="1075" w:type="dxa"/>
+          </w:tcPr>
+          <w:p>
+            <w:pPr>
+              <w:cnfStyle w:val="000000100000" w:firstRow="0" w:lastRow="0" w:firstColumn="0" w:lastColumn="0" w:oddVBand="0" w:evenVBand="0" w:oddHBand="1" w:evenHBand="0" w:firstRowFirstColumn="0" w:firstRowLastColumn="0" w:lastRowFirstColumn="0" w:lastRowLastColumn="0"/>
+            </w:pPr>
+            <w:r>
+              <w:t>Pending M3</w:t>
+            </w:r>
+          </w:p>
+        </w:tc>
+      </w:tr>
+      <w:tr>
+        <w:tc>
+          <w:tcPr>
+            <w:cnfStyle w:val="001000000000" w:firstRow="0" w:lastRow="0" w:firstColumn="1" w:lastColumn="0" w:oddVBand="0" w:evenVBand="0" w:oddHBand="0" w:evenHBand="0" w:firstRowFirstColumn="0" w:firstRowLastColumn="0" w:lastRowFirstColumn="0" w:lastRowLastColumn="0"/>
+            <w:tcW w:w="1386" w:type="dxa"/>
+          </w:tcPr>
+          <w:p>
+            <w:r>
+              <w:t>Staff</w:t>
+            </w:r>
+          </w:p>
+        </w:tc>
+        <w:tc>
+          <w:tcPr>
+            <w:tcW w:w="1024" w:type="dxa"/>
+          </w:tcPr>
+          <w:p>
+            <w:pPr>
+              <w:cnfStyle w:val="000000000000" w:firstRow="0" w:lastRow="0" w:firstColumn="0" w:lastColumn="0" w:oddVBand="0" w:evenVBand="0" w:oddHBand="0" w:evenHBand="0" w:firstRowFirstColumn="0" w:firstRowLastColumn="0" w:lastRowFirstColumn="0" w:lastRowLastColumn="0"/>
+            </w:pPr>
+            <w:r>
+              <w:t>FR-008</w:t>
+            </w:r>
+          </w:p>
+        </w:tc>
+        <w:tc>
+          <w:tcPr>
+            <w:tcW w:w="3226" w:type="dxa"/>
+          </w:tcPr>
+          <w:p>
+            <w:pPr>
+              <w:cnfStyle w:val="000000000000" w:firstRow="0" w:lastRow="0" w:firstColumn="0" w:lastColumn="0" w:oddVBand="0" w:evenVBand="0" w:oddHBand="0" w:evenHBand="0" w:firstRowFirstColumn="0" w:firstRowLastColumn="0" w:lastRowFirstColumn="0" w:lastRowLastColumn="0"/>
+            </w:pPr>
+            <w:r>
+              <w:t>Search/filter/sort</w:t>
+            </w:r>
+          </w:p>
+        </w:tc>
+        <w:tc>
+          <w:tcPr>
+            <w:tcW w:w="1369" w:type="dxa"/>
+          </w:tcPr>
+          <w:p>
+            <w:pPr>
+              <w:cnfStyle w:val="000000000000" w:firstRow="0" w:lastRow="0" w:firstColumn="0" w:lastColumn="0" w:oddVBand="0" w:evenVBand="0" w:oddHBand="0" w:evenHBand="0" w:firstRowFirstColumn="0" w:firstRowLastColumn="0" w:lastRowFirstColumn="0" w:lastRowLastColumn="0"/>
+            </w:pPr>
+            <w:r>
+              <w:t>See FR-00</w:t>
+            </w:r>
+            <w:r>
+              <w:t>8</w:t>
+            </w:r>
+            <w:r>
+              <w:t xml:space="preserve"> AC</w:t>
+            </w:r>
+          </w:p>
+        </w:tc>
+        <w:tc>
+          <w:tcPr>
+            <w:tcW w:w="946" w:type="dxa"/>
+          </w:tcPr>
+          <w:p>
+            <w:pPr>
+              <w:cnfStyle w:val="000000000000" w:firstRow="0" w:lastRow="0" w:firstColumn="0" w:lastColumn="0" w:oddVBand="0" w:evenVBand="0" w:oddHBand="0" w:evenHBand="0" w:firstRowFirstColumn="0" w:firstRowLastColumn="0" w:lastRowFirstColumn="0" w:lastRowLastColumn="0"/>
+            </w:pPr>
+            <w:r>
+              <w:t>Pending M2</w:t>
+            </w:r>
+          </w:p>
+        </w:tc>
+        <w:tc>
+          <w:tcPr>
+            <w:tcW w:w="1075" w:type="dxa"/>
+          </w:tcPr>
+          <w:p>
+            <w:pPr>
+              <w:cnfStyle w:val="000000000000" w:firstRow="0" w:lastRow="0" w:firstColumn="0" w:lastColumn="0" w:oddVBand="0" w:evenVBand="0" w:oddHBand="0" w:evenHBand="0" w:firstRowFirstColumn="0" w:firstRowLastColumn="0" w:lastRowFirstColumn="0" w:lastRowLastColumn="0"/>
+            </w:pPr>
+            <w:r>
+              <w:t>Pending M3</w:t>
+            </w:r>
+          </w:p>
+        </w:tc>
+      </w:tr>
+      <w:tr>
+        <w:trPr>
+          <w:cnfStyle w:val="000000100000" w:firstRow="0" w:lastRow="0" w:firstColumn="0" w:lastColumn="0" w:oddVBand="0" w:evenVBand="0" w:oddHBand="1" w:evenHBand="0" w:firstRowFirstColumn="0" w:firstRowLastColumn="0" w:lastRowFirstColumn="0" w:lastRowLastColumn="0"/>
+        </w:trPr>
+        <w:tc>
+          <w:tcPr>
+            <w:cnfStyle w:val="001000000000" w:firstRow="0" w:lastRow="0" w:firstColumn="1" w:lastColumn="0" w:oddVBand="0" w:evenVBand="0" w:oddHBand="0" w:evenHBand="0" w:firstRowFirstColumn="0" w:firstRowLastColumn="0" w:lastRowFirstColumn="0" w:lastRowLastColumn="0"/>
+            <w:tcW w:w="1386" w:type="dxa"/>
+          </w:tcPr>
+          <w:p>
+            <w:r>
+              <w:t>Staff</w:t>
+            </w:r>
+          </w:p>
+        </w:tc>
+        <w:tc>
+          <w:tcPr>
+            <w:tcW w:w="1024" w:type="dxa"/>
+          </w:tcPr>
+          <w:p>
+            <w:pPr>
+              <w:cnfStyle w:val="000000100000" w:firstRow="0" w:lastRow="0" w:firstColumn="0" w:lastColumn="0" w:oddVBand="0" w:evenVBand="0" w:oddHBand="1" w:evenHBand="0" w:firstRowFirstColumn="0" w:firstRowLastColumn="0" w:lastRowFirstColumn="0" w:lastRowLastColumn="0"/>
+            </w:pPr>
+            <w:r>
+              <w:t>FR-009</w:t>
+            </w:r>
+          </w:p>
+        </w:tc>
+        <w:tc>
+          <w:tcPr>
+            <w:tcW w:w="3226" w:type="dxa"/>
+          </w:tcPr>
+          <w:p>
+            <w:pPr>
+              <w:cnfStyle w:val="000000100000" w:firstRow="0" w:lastRow="0" w:firstColumn="0" w:lastColumn="0" w:oddVBand="0" w:evenVBand="0" w:oddHBand="1" w:evenHBand="0" w:firstRowFirstColumn="0" w:firstRowLastColumn="0" w:lastRowFirstColumn="0" w:lastRowLastColumn="0"/>
+            </w:pPr>
+            <w:r>
+              <w:t>View full request details</w:t>
+            </w:r>
+          </w:p>
+        </w:tc>
+        <w:tc>
+          <w:tcPr>
+            <w:tcW w:w="1369" w:type="dxa"/>
+          </w:tcPr>
+          <w:p>
+            <w:pPr>
+              <w:cnfStyle w:val="000000100000" w:firstRow="0" w:lastRow="0" w:firstColumn="0" w:lastColumn="0" w:oddVBand="0" w:evenVBand="0" w:oddHBand="1" w:evenHBand="0" w:firstRowFirstColumn="0" w:firstRowLastColumn="0" w:lastRowFirstColumn="0" w:lastRowLastColumn="0"/>
+            </w:pPr>
+            <w:r>
+              <w:t>See FR-00</w:t>
+            </w:r>
+            <w:r>
+              <w:t>9</w:t>
+            </w:r>
+            <w:r>
+              <w:t xml:space="preserve"> AC</w:t>
+            </w:r>
+          </w:p>
+        </w:tc>
+        <w:tc>
+          <w:tcPr>
+            <w:tcW w:w="946" w:type="dxa"/>
+          </w:tcPr>
+          <w:p>
+            <w:pPr>
+              <w:cnfStyle w:val="000000100000" w:firstRow="0" w:lastRow="0" w:firstColumn="0" w:lastColumn="0" w:oddVBand="0" w:evenVBand="0" w:oddHBand="1" w:evenHBand="0" w:firstRowFirstColumn="0" w:firstRowLastColumn="0" w:lastRowFirstColumn="0" w:lastRowLastColumn="0"/>
+            </w:pPr>
+            <w:r>
+              <w:t>Pending M2</w:t>
+            </w:r>
+          </w:p>
+        </w:tc>
+        <w:tc>
+          <w:tcPr>
+            <w:tcW w:w="1075" w:type="dxa"/>
+          </w:tcPr>
+          <w:p>
+            <w:pPr>
+              <w:cnfStyle w:val="000000100000" w:firstRow="0" w:lastRow="0" w:firstColumn="0" w:lastColumn="0" w:oddVBand="0" w:evenVBand="0" w:oddHBand="1" w:evenHBand="0" w:firstRowFirstColumn="0" w:firstRowLastColumn="0" w:lastRowFirstColumn="0" w:lastRowLastColumn="0"/>
+            </w:pPr>
+            <w:r>
+              <w:t>Pending M3</w:t>
+            </w:r>
+          </w:p>
+        </w:tc>
+      </w:tr>
+      <w:tr>
+        <w:tc>
+          <w:tcPr>
+            <w:cnfStyle w:val="001000000000" w:firstRow="0" w:lastRow="0" w:firstColumn="1" w:lastColumn="0" w:oddVBand="0" w:evenVBand="0" w:oddHBand="0" w:evenHBand="0" w:firstRowFirstColumn="0" w:firstRowLastColumn="0" w:lastRowFirstColumn="0" w:lastRowLastColumn="0"/>
+            <w:tcW w:w="1386" w:type="dxa"/>
+          </w:tcPr>
+          <w:p>
+            <w:r>
+              <w:t>Staff</w:t>
+            </w:r>
+          </w:p>
+        </w:tc>
+        <w:tc>
+          <w:tcPr>
+            <w:tcW w:w="1024" w:type="dxa"/>
+          </w:tcPr>
+          <w:p>
+            <w:pPr>
+              <w:cnfStyle w:val="000000000000" w:firstRow="0" w:lastRow="0" w:firstColumn="0" w:lastColumn="0" w:oddVBand="0" w:evenVBand="0" w:oddHBand="0" w:evenHBand="0" w:firstRowFirstColumn="0" w:firstRowLastColumn="0" w:lastRowFirstColumn="0" w:lastRowLastColumn="0"/>
+            </w:pPr>
+            <w:r>
+              <w:t>FR-010</w:t>
+            </w:r>
+          </w:p>
+        </w:tc>
+        <w:tc>
+          <w:tcPr>
+            <w:tcW w:w="3226" w:type="dxa"/>
+          </w:tcPr>
+          <w:p>
+            <w:pPr>
+              <w:cnfStyle w:val="000000000000" w:firstRow="0" w:lastRow="0" w:firstColumn="0" w:lastColumn="0" w:oddVBand="0" w:evenVBand="0" w:oddHBand="0" w:evenHBand="0" w:firstRowFirstColumn="0" w:firstRowLastColumn="0" w:lastRowFirstColumn="0" w:lastRowLastColumn="0"/>
+            </w:pPr>
+            <w:r>
+              <w:t>Assign/accept request</w:t>
+            </w:r>
+          </w:p>
+        </w:tc>
+        <w:tc>
+          <w:tcPr>
+            <w:tcW w:w="1369" w:type="dxa"/>
+          </w:tcPr>
+          <w:p>
+            <w:pPr>
+              <w:cnfStyle w:val="000000000000" w:firstRow="0" w:lastRow="0" w:firstColumn="0" w:lastColumn="0" w:oddVBand="0" w:evenVBand="0" w:oddHBand="0" w:evenHBand="0" w:firstRowFirstColumn="0" w:firstRowLastColumn="0" w:lastRowFirstColumn="0" w:lastRowLastColumn="0"/>
+            </w:pPr>
+            <w:r>
+              <w:t>See FR-0</w:t>
+            </w:r>
+            <w:r>
+              <w:t>10</w:t>
+            </w:r>
+            <w:r>
+              <w:t xml:space="preserve"> AC</w:t>
+            </w:r>
+          </w:p>
+        </w:tc>
+        <w:tc>
+          <w:tcPr>
+            <w:tcW w:w="946" w:type="dxa"/>
+          </w:tcPr>
+          <w:p>
+            <w:pPr>
+              <w:cnfStyle w:val="000000000000" w:firstRow="0" w:lastRow="0" w:firstColumn="0" w:lastColumn="0" w:oddVBand="0" w:evenVBand="0" w:oddHBand="0" w:evenHBand="0" w:firstRowFirstColumn="0" w:firstRowLastColumn="0" w:lastRowFirstColumn="0" w:lastRowLastColumn="0"/>
+            </w:pPr>
+            <w:r>
+              <w:t>Pending M2</w:t>
+            </w:r>
+          </w:p>
+        </w:tc>
+        <w:tc>
+          <w:tcPr>
+            <w:tcW w:w="1075" w:type="dxa"/>
+          </w:tcPr>
+          <w:p>
+            <w:pPr>
+              <w:cnfStyle w:val="000000000000" w:firstRow="0" w:lastRow="0" w:firstColumn="0" w:lastColumn="0" w:oddVBand="0" w:evenVBand="0" w:oddHBand="0" w:evenHBand="0" w:firstRowFirstColumn="0" w:firstRowLastColumn="0" w:lastRowFirstColumn="0" w:lastRowLastColumn="0"/>
+            </w:pPr>
+            <w:r>
+              <w:t>Pending M3</w:t>
+            </w:r>
+          </w:p>
+        </w:tc>
+      </w:tr>
+      <w:tr>
+        <w:trPr>
+          <w:cnfStyle w:val="000000100000" w:firstRow="0" w:lastRow="0" w:firstColumn="0" w:lastColumn="0" w:oddVBand="0" w:evenVBand="0" w:oddHBand="1" w:evenHBand="0" w:firstRowFirstColumn="0" w:firstRowLastColumn="0" w:lastRowFirstColumn="0" w:lastRowLastColumn="0"/>
+        </w:trPr>
+        <w:tc>
+          <w:tcPr>
+            <w:cnfStyle w:val="001000000000" w:firstRow="0" w:lastRow="0" w:firstColumn="1" w:lastColumn="0" w:oddVBand="0" w:evenVBand="0" w:oddHBand="0" w:evenHBand="0" w:firstRowFirstColumn="0" w:firstRowLastColumn="0" w:lastRowFirstColumn="0" w:lastRowLastColumn="0"/>
+            <w:tcW w:w="1386" w:type="dxa"/>
+          </w:tcPr>
+          <w:p>
+            <w:r>
+              <w:t>Staff</w:t>
+            </w:r>
+          </w:p>
+        </w:tc>
+        <w:tc>
+          <w:tcPr>
+            <w:tcW w:w="1024" w:type="dxa"/>
+          </w:tcPr>
+          <w:p>
+            <w:pPr>
+              <w:cnfStyle w:val="000000100000" w:firstRow="0" w:lastRow="0" w:firstColumn="0" w:lastColumn="0" w:oddVBand="0" w:evenVBand="0" w:oddHBand="1" w:evenHBand="0" w:firstRowFirstColumn="0" w:firstRowLastColumn="0" w:lastRowFirstColumn="0" w:lastRowLastColumn="0"/>
+            </w:pPr>
+            <w:r>
+              <w:t>FR-011</w:t>
+            </w:r>
+          </w:p>
+        </w:tc>
+        <w:tc>
+          <w:tcPr>
+            <w:tcW w:w="3226" w:type="dxa"/>
+          </w:tcPr>
+          <w:p>
+            <w:pPr>
+              <w:cnfStyle w:val="000000100000" w:firstRow="0" w:lastRow="0" w:firstColumn="0" w:lastColumn="0" w:oddVBand="0" w:evenVBand="0" w:oddHBand="1" w:evenHBand="0" w:firstRowFirstColumn="0" w:firstRowLastColumn="0" w:lastRowFirstColumn="0" w:lastRowLastColumn="0"/>
+            </w:pPr>
+            <w:r>
+              <w:t>Controlled status transitions</w:t>
+            </w:r>
+          </w:p>
+        </w:tc>
+        <w:tc>
+          <w:tcPr>
+            <w:tcW w:w="1369" w:type="dxa"/>
+          </w:tcPr>
+          <w:p>
+            <w:pPr>
+              <w:cnfStyle w:val="000000100000" w:firstRow="0" w:lastRow="0" w:firstColumn="0" w:lastColumn="0" w:oddVBand="0" w:evenVBand="0" w:oddHBand="1" w:evenHBand="0" w:firstRowFirstColumn="0" w:firstRowLastColumn="0" w:lastRowFirstColumn="0" w:lastRowLastColumn="0"/>
+            </w:pPr>
+            <w:r>
+              <w:t>See FR-0</w:t>
+            </w:r>
+            <w:r>
+              <w:t>11</w:t>
+            </w:r>
+            <w:r>
+              <w:t xml:space="preserve"> AC</w:t>
+            </w:r>
+          </w:p>
+        </w:tc>
+        <w:tc>
+          <w:tcPr>
+            <w:tcW w:w="946" w:type="dxa"/>
+          </w:tcPr>
+          <w:p>
+            <w:pPr>
+              <w:cnfStyle w:val="000000100000" w:firstRow="0" w:lastRow="0" w:firstColumn="0" w:lastColumn="0" w:oddVBand="0" w:evenVBand="0" w:oddHBand="1" w:evenHBand="0" w:firstRowFirstColumn="0" w:firstRowLastColumn="0" w:lastRowFirstColumn="0" w:lastRowLastColumn="0"/>
+            </w:pPr>
+            <w:r>
+              <w:t>Pending M2</w:t>
+            </w:r>
+          </w:p>
+        </w:tc>
+        <w:tc>
+          <w:tcPr>
+            <w:tcW w:w="1075" w:type="dxa"/>
+          </w:tcPr>
+          <w:p>
+            <w:pPr>
+              <w:cnfStyle w:val="000000100000" w:firstRow="0" w:lastRow="0" w:firstColumn="0" w:lastColumn="0" w:oddVBand="0" w:evenVBand="0" w:oddHBand="1" w:evenHBand="0" w:firstRowFirstColumn="0" w:firstRowLastColumn="0" w:lastRowFirstColumn="0" w:lastRowLastColumn="0"/>
+            </w:pPr>
+            <w:r>
+              <w:t>Pending M3</w:t>
+            </w:r>
+          </w:p>
+        </w:tc>
+      </w:tr>
+      <w:tr>
+        <w:tc>
+          <w:tcPr>
+            <w:cnfStyle w:val="001000000000" w:firstRow="0" w:lastRow="0" w:firstColumn="1" w:lastColumn="0" w:oddVBand="0" w:evenVBand="0" w:oddHBand="0" w:evenHBand="0" w:firstRowFirstColumn="0" w:firstRowLastColumn="0" w:lastRowFirstColumn="0" w:lastRowLastColumn="0"/>
+            <w:tcW w:w="1386" w:type="dxa"/>
+          </w:tcPr>
+          <w:p>
+            <w:r>
+              <w:t>Staff</w:t>
+            </w:r>
+          </w:p>
+        </w:tc>
+        <w:tc>
+          <w:tcPr>
+            <w:tcW w:w="1024" w:type="dxa"/>
+          </w:tcPr>
+          <w:p>
+            <w:pPr>
+              <w:cnfStyle w:val="000000000000" w:firstRow="0" w:lastRow="0" w:firstColumn="0" w:lastColumn="0" w:oddVBand="0" w:evenVBand="0" w:oddHBand="0" w:evenHBand="0" w:firstRowFirstColumn="0" w:firstRowLastColumn="0" w:lastRowFirstColumn="0" w:lastRowLastColumn="0"/>
+            </w:pPr>
+            <w:r>
+              <w:t>FR-012</w:t>
+            </w:r>
+          </w:p>
+        </w:tc>
+        <w:tc>
+          <w:tcPr>
+            <w:tcW w:w="3226" w:type="dxa"/>
+          </w:tcPr>
+          <w:p>
+            <w:pPr>
+              <w:cnfStyle w:val="000000000000" w:firstRow="0" w:lastRow="0" w:firstColumn="0" w:lastColumn="0" w:oddVBand="0" w:evenVBand="0" w:oddHBand="0" w:evenHBand="0" w:firstRowFirstColumn="0" w:firstRowLastColumn="0" w:lastRowFirstColumn="0" w:lastRowLastColumn="0"/>
+            </w:pPr>
+            <w:r>
+              <w:t>Record</w:t>
+            </w:r>
+            <w:r>
+              <w:t xml:space="preserve"> actions/comments</w:t>
+            </w:r>
+          </w:p>
+        </w:tc>
+        <w:tc>
+          <w:tcPr>
+            <w:tcW w:w="1369" w:type="dxa"/>
+          </w:tcPr>
+          <w:p>
+            <w:pPr>
+              <w:cnfStyle w:val="000000000000" w:firstRow="0" w:lastRow="0" w:firstColumn="0" w:lastColumn="0" w:oddVBand="0" w:evenVBand="0" w:oddHBand="0" w:evenHBand="0" w:firstRowFirstColumn="0" w:firstRowLastColumn="0" w:lastRowFirstColumn="0" w:lastRowLastColumn="0"/>
+            </w:pPr>
+            <w:r>
+              <w:t>See FR-0</w:t>
+            </w:r>
+            <w:r>
+              <w:t>12</w:t>
+            </w:r>
+            <w:r>
+              <w:t xml:space="preserve"> AC</w:t>
+            </w:r>
+          </w:p>
+        </w:tc>
+        <w:tc>
+          <w:tcPr>
+            <w:tcW w:w="946" w:type="dxa"/>
+          </w:tcPr>
+          <w:p>
+            <w:pPr>
+              <w:cnfStyle w:val="000000000000" w:firstRow="0" w:lastRow="0" w:firstColumn="0" w:lastColumn="0" w:oddVBand="0" w:evenVBand="0" w:oddHBand="0" w:evenHBand="0" w:firstRowFirstColumn="0" w:firstRowLastColumn="0" w:lastRowFirstColumn="0" w:lastRowLastColumn="0"/>
+            </w:pPr>
+            <w:r>
+              <w:t>Pending M2</w:t>
+            </w:r>
+          </w:p>
+        </w:tc>
+        <w:tc>
+          <w:tcPr>
+            <w:tcW w:w="1075" w:type="dxa"/>
+          </w:tcPr>
+          <w:p>
+            <w:pPr>
+              <w:cnfStyle w:val="000000000000" w:firstRow="0" w:lastRow="0" w:firstColumn="0" w:lastColumn="0" w:oddVBand="0" w:evenVBand="0" w:oddHBand="0" w:evenHBand="0" w:firstRowFirstColumn="0" w:firstRowLastColumn="0" w:lastRowFirstColumn="0" w:lastRowLastColumn="0"/>
+            </w:pPr>
+            <w:r>
+              <w:t>Pending M3</w:t>
+            </w:r>
+          </w:p>
+        </w:tc>
+      </w:tr>
+      <w:tr>
+        <w:trPr>
+          <w:cnfStyle w:val="000000100000" w:firstRow="0" w:lastRow="0" w:firstColumn="0" w:lastColumn="0" w:oddVBand="0" w:evenVBand="0" w:oddHBand="1" w:evenHBand="0" w:firstRowFirstColumn="0" w:firstRowLastColumn="0" w:lastRowFirstColumn="0" w:lastRowLastColumn="0"/>
+        </w:trPr>
+        <w:tc>
+          <w:tcPr>
+            <w:cnfStyle w:val="001000000000" w:firstRow="0" w:lastRow="0" w:firstColumn="1" w:lastColumn="0" w:oddVBand="0" w:evenVBand="0" w:oddHBand="0" w:evenHBand="0" w:firstRowFirstColumn="0" w:firstRowLastColumn="0" w:lastRowFirstColumn="0" w:lastRowLastColumn="0"/>
+            <w:tcW w:w="1386" w:type="dxa"/>
+          </w:tcPr>
+          <w:p>
+            <w:r>
+              <w:lastRenderedPageBreak/>
+              <w:t>Staff</w:t>
+            </w:r>
+          </w:p>
+        </w:tc>
+        <w:tc>
+          <w:tcPr>
+            <w:tcW w:w="1024" w:type="dxa"/>
+          </w:tcPr>
+          <w:p>
+            <w:pPr>
+              <w:cnfStyle w:val="000000100000" w:firstRow="0" w:lastRow="0" w:firstColumn="0" w:lastColumn="0" w:oddVBand="0" w:evenVBand="0" w:oddHBand="1" w:evenHBand="0" w:firstRowFirstColumn="0" w:firstRowLastColumn="0" w:lastRowFirstColumn="0" w:lastRowLastColumn="0"/>
+            </w:pPr>
+            <w:r>
+              <w:t>FR-013</w:t>
+            </w:r>
+          </w:p>
+        </w:tc>
+        <w:tc>
+          <w:tcPr>
+            <w:tcW w:w="3226" w:type="dxa"/>
+          </w:tcPr>
+          <w:p>
+            <w:pPr>
+              <w:cnfStyle w:val="000000100000" w:firstRow="0" w:lastRow="0" w:firstColumn="0" w:lastColumn="0" w:oddVBand="0" w:evenVBand="0" w:oddHBand="1" w:evenHBand="0" w:firstRowFirstColumn="0" w:firstRowLastColumn="0" w:lastRowFirstColumn="0" w:lastRowLastColumn="0"/>
+            </w:pPr>
+            <w:r>
+              <w:t>Resolve/close request</w:t>
+            </w:r>
+          </w:p>
+        </w:tc>
+        <w:tc>
+          <w:tcPr>
+            <w:tcW w:w="1369" w:type="dxa"/>
+          </w:tcPr>
+          <w:p>
+            <w:pPr>
+              <w:cnfStyle w:val="000000100000" w:firstRow="0" w:lastRow="0" w:firstColumn="0" w:lastColumn="0" w:oddVBand="0" w:evenVBand="0" w:oddHBand="1" w:evenHBand="0" w:firstRowFirstColumn="0" w:firstRowLastColumn="0" w:lastRowFirstColumn="0" w:lastRowLastColumn="0"/>
+            </w:pPr>
+            <w:r>
+              <w:t>See FR-0</w:t>
+            </w:r>
+            <w:r>
+              <w:t>13</w:t>
+            </w:r>
+            <w:r>
+              <w:t xml:space="preserve"> AC</w:t>
+            </w:r>
+          </w:p>
+        </w:tc>
+        <w:tc>
+          <w:tcPr>
+            <w:tcW w:w="946" w:type="dxa"/>
+          </w:tcPr>
+          <w:p>
+            <w:pPr>
+              <w:cnfStyle w:val="000000100000" w:firstRow="0" w:lastRow="0" w:firstColumn="0" w:lastColumn="0" w:oddVBand="0" w:evenVBand="0" w:oddHBand="1" w:evenHBand="0" w:firstRowFirstColumn="0" w:firstRowLastColumn="0" w:lastRowFirstColumn="0" w:lastRowLastColumn="0"/>
+            </w:pPr>
+            <w:r>
+              <w:t>Pending M2</w:t>
+            </w:r>
+          </w:p>
+        </w:tc>
+        <w:tc>
+          <w:tcPr>
+            <w:tcW w:w="1075" w:type="dxa"/>
+          </w:tcPr>
+          <w:p>
+            <w:pPr>
+              <w:cnfStyle w:val="000000100000" w:firstRow="0" w:lastRow="0" w:firstColumn="0" w:lastColumn="0" w:oddVBand="0" w:evenVBand="0" w:oddHBand="1" w:evenHBand="0" w:firstRowFirstColumn="0" w:firstRowLastColumn="0" w:lastRowFirstColumn="0" w:lastRowLastColumn="0"/>
+            </w:pPr>
+            <w:r>
+              <w:t>Pending M3</w:t>
+            </w:r>
+          </w:p>
+        </w:tc>
+      </w:tr>
+      <w:tr>
+        <w:tc>
+          <w:tcPr>
+            <w:cnfStyle w:val="001000000000" w:firstRow="0" w:lastRow="0" w:firstColumn="1" w:lastColumn="0" w:oddVBand="0" w:evenVBand="0" w:oddHBand="0" w:evenHBand="0" w:firstRowFirstColumn="0" w:firstRowLastColumn="0" w:lastRowFirstColumn="0" w:lastRowLastColumn="0"/>
+            <w:tcW w:w="1386" w:type="dxa"/>
+          </w:tcPr>
+          <w:p>
+            <w:r>
+              <w:t>Manager</w:t>
+            </w:r>
+          </w:p>
+        </w:tc>
+        <w:tc>
+          <w:tcPr>
+            <w:tcW w:w="1024" w:type="dxa"/>
+          </w:tcPr>
+          <w:p>
+            <w:pPr>
+              <w:cnfStyle w:val="000000000000" w:firstRow="0" w:lastRow="0" w:firstColumn="0" w:lastColumn="0" w:oddVBand="0" w:evenVBand="0" w:oddHBand="0" w:evenHBand="0" w:firstRowFirstColumn="0" w:firstRowLastColumn="0" w:lastRowFirstColumn="0" w:lastRowLastColumn="0"/>
+            </w:pPr>
+            <w:r>
+              <w:t>FR-014</w:t>
+            </w:r>
+          </w:p>
+        </w:tc>
+        <w:tc>
+          <w:tcPr>
+            <w:tcW w:w="3226" w:type="dxa"/>
+          </w:tcPr>
+          <w:p>
+            <w:pPr>
+              <w:cnfStyle w:val="000000000000" w:firstRow="0" w:lastRow="0" w:firstColumn="0" w:lastColumn="0" w:oddVBand="0" w:evenVBand="0" w:oddHBand="0" w:evenHBand="0" w:firstRowFirstColumn="0" w:firstRowLastColumn="0" w:lastRowFirstColumn="0" w:lastRowLastColumn="0"/>
+            </w:pPr>
+            <w:r>
+              <w:t>Aggregate activity view</w:t>
+            </w:r>
+          </w:p>
+        </w:tc>
+        <w:tc>
+          <w:tcPr>
+            <w:tcW w:w="1369" w:type="dxa"/>
+          </w:tcPr>
+          <w:p>
+            <w:pPr>
+              <w:cnfStyle w:val="000000000000" w:firstRow="0" w:lastRow="0" w:firstColumn="0" w:lastColumn="0" w:oddVBand="0" w:evenVBand="0" w:oddHBand="0" w:evenHBand="0" w:firstRowFirstColumn="0" w:firstRowLastColumn="0" w:lastRowFirstColumn="0" w:lastRowLastColumn="0"/>
+            </w:pPr>
+            <w:r>
+              <w:t>See FR-0</w:t>
+            </w:r>
+            <w:r>
+              <w:t>14</w:t>
+            </w:r>
+            <w:r>
+              <w:t xml:space="preserve"> AC</w:t>
+            </w:r>
+          </w:p>
+        </w:tc>
+        <w:tc>
+          <w:tcPr>
+            <w:tcW w:w="946" w:type="dxa"/>
+          </w:tcPr>
+          <w:p>
+            <w:pPr>
+              <w:cnfStyle w:val="000000000000" w:firstRow="0" w:lastRow="0" w:firstColumn="0" w:lastColumn="0" w:oddVBand="0" w:evenVBand="0" w:oddHBand="0" w:evenHBand="0" w:firstRowFirstColumn="0" w:firstRowLastColumn="0" w:lastRowFirstColumn="0" w:lastRowLastColumn="0"/>
+            </w:pPr>
+            <w:r>
+              <w:t>Pending M2</w:t>
+            </w:r>
+          </w:p>
+        </w:tc>
+        <w:tc>
+          <w:tcPr>
+            <w:tcW w:w="1075" w:type="dxa"/>
+          </w:tcPr>
+          <w:p>
+            <w:pPr>
+              <w:cnfStyle w:val="000000000000" w:firstRow="0" w:lastRow="0" w:firstColumn="0" w:lastColumn="0" w:oddVBand="0" w:evenVBand="0" w:oddHBand="0" w:evenHBand="0" w:firstRowFirstColumn="0" w:firstRowLastColumn="0" w:lastRowFirstColumn="0" w:lastRowLastColumn="0"/>
+            </w:pPr>
+            <w:r>
+              <w:t>Pending M3</w:t>
+            </w:r>
+          </w:p>
+        </w:tc>
+      </w:tr>
+      <w:tr>
+        <w:trPr>
+          <w:cnfStyle w:val="000000100000" w:firstRow="0" w:lastRow="0" w:firstColumn="0" w:lastColumn="0" w:oddVBand="0" w:evenVBand="0" w:oddHBand="1" w:evenHBand="0" w:firstRowFirstColumn="0" w:firstRowLastColumn="0" w:lastRowFirstColumn="0" w:lastRowLastColumn="0"/>
+        </w:trPr>
+        <w:tc>
+          <w:tcPr>
+            <w:cnfStyle w:val="001000000000" w:firstRow="0" w:lastRow="0" w:firstColumn="1" w:lastColumn="0" w:oddVBand="0" w:evenVBand="0" w:oddHBand="0" w:evenHBand="0" w:firstRowFirstColumn="0" w:firstRowLastColumn="0" w:lastRowFirstColumn="0" w:lastRowLastColumn="0"/>
+            <w:tcW w:w="1386" w:type="dxa"/>
+          </w:tcPr>
+          <w:p>
+            <w:r>
+              <w:t xml:space="preserve">Manager </w:t>
+            </w:r>
+          </w:p>
+        </w:tc>
+        <w:tc>
+          <w:tcPr>
+            <w:tcW w:w="1024" w:type="dxa"/>
+          </w:tcPr>
+          <w:p>
+            <w:pPr>
+              <w:cnfStyle w:val="000000100000" w:firstRow="0" w:lastRow="0" w:firstColumn="0" w:lastColumn="0" w:oddVBand="0" w:evenVBand="0" w:oddHBand="1" w:evenHBand="0" w:firstRowFirstColumn="0" w:firstRowLastColumn="0" w:lastRowFirstColumn="0" w:lastRowLastColumn="0"/>
+            </w:pPr>
+            <w:r>
+              <w:t>FR-015</w:t>
+            </w:r>
+          </w:p>
+        </w:tc>
+        <w:tc>
+          <w:tcPr>
+            <w:tcW w:w="3226" w:type="dxa"/>
+          </w:tcPr>
+          <w:p>
+            <w:pPr>
+              <w:cnfStyle w:val="000000100000" w:firstRow="0" w:lastRow="0" w:firstColumn="0" w:lastColumn="0" w:oddVBand="0" w:evenVBand="0" w:oddHBand="1" w:evenHBand="0" w:firstRowFirstColumn="0" w:firstRowLastColumn="0" w:lastRowFirstColumn="0" w:lastRowLastColumn="0"/>
+            </w:pPr>
+            <w:r>
+              <w:t>Overdue request flagging</w:t>
+            </w:r>
+          </w:p>
+        </w:tc>
+        <w:tc>
+          <w:tcPr>
+            <w:tcW w:w="1369" w:type="dxa"/>
+          </w:tcPr>
+          <w:p>
+            <w:pPr>
+              <w:cnfStyle w:val="000000100000" w:firstRow="0" w:lastRow="0" w:firstColumn="0" w:lastColumn="0" w:oddVBand="0" w:evenVBand="0" w:oddHBand="1" w:evenHBand="0" w:firstRowFirstColumn="0" w:firstRowLastColumn="0" w:lastRowFirstColumn="0" w:lastRowLastColumn="0"/>
+            </w:pPr>
+            <w:r>
+              <w:t>See FR-0</w:t>
+            </w:r>
+            <w:r>
+              <w:t>15</w:t>
+            </w:r>
+            <w:r>
+              <w:t xml:space="preserve"> AC</w:t>
+            </w:r>
+          </w:p>
+        </w:tc>
+        <w:tc>
+          <w:tcPr>
+            <w:tcW w:w="946" w:type="dxa"/>
+          </w:tcPr>
+          <w:p>
+            <w:pPr>
+              <w:cnfStyle w:val="000000100000" w:firstRow="0" w:lastRow="0" w:firstColumn="0" w:lastColumn="0" w:oddVBand="0" w:evenVBand="0" w:oddHBand="1" w:evenHBand="0" w:firstRowFirstColumn="0" w:firstRowLastColumn="0" w:lastRowFirstColumn="0" w:lastRowLastColumn="0"/>
+            </w:pPr>
+            <w:r>
+              <w:t>Pending M2</w:t>
+            </w:r>
+          </w:p>
+        </w:tc>
+        <w:tc>
+          <w:tcPr>
+            <w:tcW w:w="1075" w:type="dxa"/>
+          </w:tcPr>
+          <w:p>
+            <w:pPr>
+              <w:cnfStyle w:val="000000100000" w:firstRow="0" w:lastRow="0" w:firstColumn="0" w:lastColumn="0" w:oddVBand="0" w:evenVBand="0" w:oddHBand="1" w:evenHBand="0" w:firstRowFirstColumn="0" w:firstRowLastColumn="0" w:lastRowFirstColumn="0" w:lastRowLastColumn="0"/>
+            </w:pPr>
+            <w:r>
+              <w:t>Pending M3</w:t>
+            </w:r>
+          </w:p>
+        </w:tc>
+      </w:tr>
+      <w:tr>
+        <w:tc>
+          <w:tcPr>
+            <w:cnfStyle w:val="001000000000" w:firstRow="0" w:lastRow="0" w:firstColumn="1" w:lastColumn="0" w:oddVBand="0" w:evenVBand="0" w:oddHBand="0" w:evenHBand="0" w:firstRowFirstColumn="0" w:firstRowLastColumn="0" w:lastRowFirstColumn="0" w:lastRowLastColumn="0"/>
+            <w:tcW w:w="1386" w:type="dxa"/>
+          </w:tcPr>
+          <w:p>
+            <w:r>
+              <w:t>Manager</w:t>
+            </w:r>
+          </w:p>
+        </w:tc>
+        <w:tc>
+          <w:tcPr>
+            <w:tcW w:w="1024" w:type="dxa"/>
+          </w:tcPr>
+          <w:p>
+            <w:pPr>
+              <w:cnfStyle w:val="000000000000" w:firstRow="0" w:lastRow="0" w:firstColumn="0" w:lastColumn="0" w:oddVBand="0" w:evenVBand="0" w:oddHBand="0" w:evenHBand="0" w:firstRowFirstColumn="0" w:firstRowLastColumn="0" w:lastRowFirstColumn="0" w:lastRowLastColumn="0"/>
+            </w:pPr>
+            <w:r>
+              <w:t>FR-016</w:t>
+            </w:r>
+          </w:p>
+        </w:tc>
+        <w:tc>
+          <w:tcPr>
+            <w:tcW w:w="3226" w:type="dxa"/>
+          </w:tcPr>
+          <w:p>
+            <w:pPr>
+              <w:cnfStyle w:val="000000000000" w:firstRow="0" w:lastRow="0" w:firstColumn="0" w:lastColumn="0" w:oddVBand="0" w:evenVBand="0" w:oddHBand="0" w:evenHBand="0" w:firstRowFirstColumn="0" w:firstRowLastColumn="0" w:lastRowFirstColumn="0" w:lastRowLastColumn="0"/>
+            </w:pPr>
+            <w:r>
+              <w:t xml:space="preserve">Filter/group by </w:t>
+            </w:r>
+            <w:r>
+              <w:t>dimension</w:t>
+            </w:r>
+          </w:p>
+        </w:tc>
+        <w:tc>
+          <w:tcPr>
+            <w:tcW w:w="1369" w:type="dxa"/>
+          </w:tcPr>
+          <w:p>
+            <w:pPr>
+              <w:cnfStyle w:val="000000000000" w:firstRow="0" w:lastRow="0" w:firstColumn="0" w:lastColumn="0" w:oddVBand="0" w:evenVBand="0" w:oddHBand="0" w:evenHBand="0" w:firstRowFirstColumn="0" w:firstRowLastColumn="0" w:lastRowFirstColumn="0" w:lastRowLastColumn="0"/>
+            </w:pPr>
+            <w:r>
+              <w:t>See FR-0</w:t>
+            </w:r>
+            <w:r>
+              <w:t>16</w:t>
+            </w:r>
+            <w:r>
+              <w:t xml:space="preserve"> AC</w:t>
+            </w:r>
+          </w:p>
+        </w:tc>
+        <w:tc>
+          <w:tcPr>
+            <w:tcW w:w="946" w:type="dxa"/>
+          </w:tcPr>
+          <w:p>
+            <w:pPr>
+              <w:cnfStyle w:val="000000000000" w:firstRow="0" w:lastRow="0" w:firstColumn="0" w:lastColumn="0" w:oddVBand="0" w:evenVBand="0" w:oddHBand="0" w:evenHBand="0" w:firstRowFirstColumn="0" w:firstRowLastColumn="0" w:lastRowFirstColumn="0" w:lastRowLastColumn="0"/>
+            </w:pPr>
+            <w:r>
+              <w:t>Pending M2</w:t>
+            </w:r>
+          </w:p>
+        </w:tc>
+        <w:tc>
+          <w:tcPr>
+            <w:tcW w:w="1075" w:type="dxa"/>
+          </w:tcPr>
+          <w:p>
+            <w:pPr>
+              <w:cnfStyle w:val="000000000000" w:firstRow="0" w:lastRow="0" w:firstColumn="0" w:lastColumn="0" w:oddVBand="0" w:evenVBand="0" w:oddHBand="0" w:evenHBand="0" w:firstRowFirstColumn="0" w:firstRowLastColumn="0" w:lastRowFirstColumn="0" w:lastRowLastColumn="0"/>
+            </w:pPr>
+            <w:r>
+              <w:t>Pending M3</w:t>
+            </w:r>
+          </w:p>
+        </w:tc>
+      </w:tr>
+      <w:tr>
+        <w:trPr>
+          <w:cnfStyle w:val="000000100000" w:firstRow="0" w:lastRow="0" w:firstColumn="0" w:lastColumn="0" w:oddVBand="0" w:evenVBand="0" w:oddHBand="1" w:evenHBand="0" w:firstRowFirstColumn="0" w:firstRowLastColumn="0" w:lastRowFirstColumn="0" w:lastRowLastColumn="0"/>
+        </w:trPr>
+        <w:tc>
+          <w:tcPr>
+            <w:cnfStyle w:val="001000000000" w:firstRow="0" w:lastRow="0" w:firstColumn="1" w:lastColumn="0" w:oddVBand="0" w:evenVBand="0" w:oddHBand="0" w:evenHBand="0" w:firstRowFirstColumn="0" w:firstRowLastColumn="0" w:lastRowFirstColumn="0" w:lastRowLastColumn="0"/>
+            <w:tcW w:w="1386" w:type="dxa"/>
+          </w:tcPr>
+          <w:p>
+            <w:r>
+              <w:t>Manager</w:t>
+            </w:r>
+          </w:p>
+        </w:tc>
+        <w:tc>
+          <w:tcPr>
+            <w:tcW w:w="1024" w:type="dxa"/>
+          </w:tcPr>
+          <w:p>
+            <w:pPr>
+              <w:cnfStyle w:val="000000100000" w:firstRow="0" w:lastRow="0" w:firstColumn="0" w:lastColumn="0" w:oddVBand="0" w:evenVBand="0" w:oddHBand="1" w:evenHBand="0" w:firstRowFirstColumn="0" w:firstRowLastColumn="0" w:lastRowFirstColumn="0" w:lastRowLastColumn="0"/>
+            </w:pPr>
+            <w:r>
+              <w:t>FR-017</w:t>
+            </w:r>
+          </w:p>
+        </w:tc>
+        <w:tc>
+          <w:tcPr>
+            <w:tcW w:w="3226" w:type="dxa"/>
+          </w:tcPr>
+          <w:p>
+            <w:pPr>
+              <w:cnfStyle w:val="000000100000" w:firstRow="0" w:lastRow="0" w:firstColumn="0" w:lastColumn="0" w:oddVBand="0" w:evenVBand="0" w:oddHBand="1" w:evenHBand="0" w:firstRowFirstColumn="0" w:firstRowLastColumn="0" w:lastRowFirstColumn="0" w:lastRowLastColumn="0"/>
+            </w:pPr>
+            <w:r>
+              <w:t>Accountability/performance info</w:t>
+            </w:r>
+          </w:p>
+        </w:tc>
+        <w:tc>
+          <w:tcPr>
+            <w:tcW w:w="1369" w:type="dxa"/>
+          </w:tcPr>
+          <w:p>
+            <w:pPr>
+              <w:cnfStyle w:val="000000100000" w:firstRow="0" w:lastRow="0" w:firstColumn="0" w:lastColumn="0" w:oddVBand="0" w:evenVBand="0" w:oddHBand="1" w:evenHBand="0" w:firstRowFirstColumn="0" w:firstRowLastColumn="0" w:lastRowFirstColumn="0" w:lastRowLastColumn="0"/>
+            </w:pPr>
+            <w:r>
+              <w:t>See FR-0</w:t>
+            </w:r>
+            <w:r>
+              <w:t>17</w:t>
+            </w:r>
+            <w:r>
+              <w:t xml:space="preserve"> AC</w:t>
+            </w:r>
+          </w:p>
+        </w:tc>
+        <w:tc>
+          <w:tcPr>
+            <w:tcW w:w="946" w:type="dxa"/>
+          </w:tcPr>
+          <w:p>
+            <w:pPr>
+              <w:cnfStyle w:val="000000100000" w:firstRow="0" w:lastRow="0" w:firstColumn="0" w:lastColumn="0" w:oddVBand="0" w:evenVBand="0" w:oddHBand="1" w:evenHBand="0" w:firstRowFirstColumn="0" w:firstRowLastColumn="0" w:lastRowFirstColumn="0" w:lastRowLastColumn="0"/>
+            </w:pPr>
+            <w:r>
+              <w:t>Pending M2</w:t>
+            </w:r>
+          </w:p>
+        </w:tc>
+        <w:tc>
+          <w:tcPr>
+            <w:tcW w:w="1075" w:type="dxa"/>
+          </w:tcPr>
+          <w:p>
+            <w:pPr>
+              <w:cnfStyle w:val="000000100000" w:firstRow="0" w:lastRow="0" w:firstColumn="0" w:lastColumn="0" w:oddVBand="0" w:evenVBand="0" w:oddHBand="1" w:evenHBand="0" w:firstRowFirstColumn="0" w:firstRowLastColumn="0" w:lastRowFirstColumn="0" w:lastRowLastColumn="0"/>
+            </w:pPr>
+            <w:r>
+              <w:t>Pending M3</w:t>
+            </w:r>
+          </w:p>
+        </w:tc>
+      </w:tr>
+      <w:tr>
+        <w:tc>
+          <w:tcPr>
+            <w:cnfStyle w:val="001000000000" w:firstRow="0" w:lastRow="0" w:firstColumn="1" w:lastColumn="0" w:oddVBand="0" w:evenVBand="0" w:oddHBand="0" w:evenHBand="0" w:firstRowFirstColumn="0" w:firstRowLastColumn="0" w:lastRowFirstColumn="0" w:lastRowLastColumn="0"/>
+            <w:tcW w:w="1386" w:type="dxa"/>
+          </w:tcPr>
+          <w:p>
+            <w:r>
+              <w:t>Constraints</w:t>
+            </w:r>
+          </w:p>
+        </w:tc>
+        <w:tc>
+          <w:tcPr>
+            <w:tcW w:w="1024" w:type="dxa"/>
+          </w:tcPr>
+          <w:p>
+            <w:pPr>
+              <w:cnfStyle w:val="000000000000" w:firstRow="0" w:lastRow="0" w:firstColumn="0" w:lastColumn="0" w:oddVBand="0" w:evenVBand="0" w:oddHBand="0" w:evenHBand="0" w:firstRowFirstColumn="0" w:firstRowLastColumn="0" w:lastRowFirstColumn="0" w:lastRowLastColumn="0"/>
+            </w:pPr>
+            <w:r>
+              <w:t>NFR-001-&gt;008</w:t>
+            </w:r>
+          </w:p>
+        </w:tc>
+        <w:tc>
+          <w:tcPr>
+            <w:tcW w:w="3226" w:type="dxa"/>
+          </w:tcPr>
+          <w:p>
+            <w:pPr>
+              <w:cnfStyle w:val="000000000000" w:firstRow="0" w:lastRow="0" w:firstColumn="0" w:lastColumn="0" w:oddVBand="0" w:evenVBand="0" w:oddHBand="0" w:evenHBand="0" w:firstRowFirstColumn="0" w:firstRowLastColumn="0" w:lastRowFirstColumn="0" w:lastRowLastColumn="0"/>
+            </w:pPr>
+            <w:r>
+              <w:t>Non-functional quality attributes</w:t>
+            </w:r>
+          </w:p>
+        </w:tc>
+        <w:tc>
+          <w:tcPr>
+            <w:tcW w:w="1369" w:type="dxa"/>
+          </w:tcPr>
+          <w:p>
+            <w:pPr>
+              <w:cnfStyle w:val="000000000000" w:firstRow="0" w:lastRow="0" w:firstColumn="0" w:lastColumn="0" w:oddVBand="0" w:evenVBand="0" w:oddHBand="0" w:evenHBand="0" w:firstRowFirstColumn="0" w:firstRowLastColumn="0" w:lastRowFirstColumn="0" w:lastRowLastColumn="0"/>
+            </w:pPr>
+            <w:r>
+              <w:t xml:space="preserve">See NFR </w:t>
+            </w:r>
+            <w:r>
+              <w:t>AC</w:t>
+            </w:r>
+          </w:p>
+        </w:tc>
+        <w:tc>
+          <w:tcPr>
+            <w:tcW w:w="946" w:type="dxa"/>
+          </w:tcPr>
+          <w:p>
+            <w:pPr>
+              <w:cnfStyle w:val="000000000000" w:firstRow="0" w:lastRow="0" w:firstColumn="0" w:lastColumn="0" w:oddVBand="0" w:evenVBand="0" w:oddHBand="0" w:evenHBand="0" w:firstRowFirstColumn="0" w:firstRowLastColumn="0" w:lastRowFirstColumn="0" w:lastRowLastColumn="0"/>
+            </w:pPr>
+            <w:r>
+              <w:t>Pending M2</w:t>
+            </w:r>
+          </w:p>
+        </w:tc>
+        <w:tc>
+          <w:tcPr>
+            <w:tcW w:w="1075" w:type="dxa"/>
+          </w:tcPr>
+          <w:p>
+            <w:pPr>
+              <w:cnfStyle w:val="000000000000" w:firstRow="0" w:lastRow="0" w:firstColumn="0" w:lastColumn="0" w:oddVBand="0" w:evenVBand="0" w:oddHBand="0" w:evenHBand="0" w:firstRowFirstColumn="0" w:firstRowLastColumn="0" w:lastRowFirstColumn="0" w:lastRowLastColumn="0"/>
+            </w:pPr>
+            <w:r>
+              <w:t>Pending M3</w:t>
+            </w:r>
+          </w:p>
+        </w:tc>
+      </w:tr>
+    </w:tbl>
+    <w:p/>
+    <w:p>
+      <w:pPr>
+        <w:pStyle w:val="Heading2"/>
+      </w:pPr>
+      <w:r>
+        <w:t>Example of an end-to-end trace</w:t>
+      </w:r>
+      <w:r>
+        <w:t>:</w:t>
+      </w:r>
+    </w:p>
+    <w:p>
+      <w:r>
+        <w:t>FR-001</w:t>
+      </w:r>
+      <w:r>
+        <w:t xml:space="preserve"> (Make a new service request):</w:t>
+      </w:r>
+    </w:p>
+    <w:p>
+      <w:pPr>
+        <w:pStyle w:val="ListParagraph"/>
+        <w:numPr>
+          <w:ilvl w:val="0"/>
+          <w:numId w:val="1"/>
+        </w:numPr>
+      </w:pPr>
+      <w:r>
+        <w:t>Source: Business need: The organi</w:t>
+      </w:r>
+      <w:r>
+        <w:t xml:space="preserve">sation </w:t>
+      </w:r>
+      <w:r>
+        <w:t>wants</w:t>
+      </w:r>
+      <w:r>
+        <w:t xml:space="preserve"> a dependable method of submitting requests</w:t>
+      </w:r>
+      <w:r>
+        <w:t>.</w:t>
+      </w:r>
+    </w:p>
+    <w:p>
+      <w:pPr>
+        <w:pStyle w:val="ListParagraph"/>
+        <w:numPr>
+          <w:ilvl w:val="0"/>
+          <w:numId w:val="1"/>
+        </w:numPr>
+      </w:pPr>
+      <w:r>
+        <w:t>Stakeholder: The main user of this feature, as determined by the stakeholder ana</w:t>
+      </w:r>
+      <w:r>
+        <w:t xml:space="preserve">lysis, is the </w:t>
+      </w:r>
+      <w:r>
+        <w:t>requester (</w:t>
+      </w:r>
+      <w:r>
+        <w:t>member of the community).</w:t>
+      </w:r>
+    </w:p>
+    <w:p>
+      <w:pPr>
+        <w:pStyle w:val="ListParagraph"/>
+        <w:numPr>
+          <w:ilvl w:val="0"/>
+          <w:numId w:val="1"/>
+        </w:numPr>
+      </w:pPr>
+      <w:r>
+        <w:t xml:space="preserve">Requirement: </w:t>
+      </w:r>
+      <w:r>
+        <w:t>FR-001</w:t>
+      </w:r>
+      <w:r>
+        <w:t xml:space="preserve"> prioritised as “Must”</w:t>
+      </w:r>
+      <w:r>
+        <w:t xml:space="preserve"> meaning everything below (see FR table) depends on it, without it the platform has no entry point</w:t>
+      </w:r>
+      <w:r>
+        <w:t>.</w:t>
+      </w:r>
+    </w:p>
+    <w:p>
+      <w:pPr>
+        <w:pStyle w:val="ListParagraph"/>
+        <w:numPr>
+          <w:ilvl w:val="0"/>
+          <w:numId w:val="1"/>
+        </w:numPr>
+      </w:pPr>
+      <w:r>
+        <w:t xml:space="preserve">Acceptance criteria: “Submitted” is the first </w:t>
+      </w:r>
+      <w:r>
+        <w:t>status,</w:t>
+      </w:r>
+      <w:r>
+        <w:t xml:space="preserve"> a unique reference number is generated</w:t>
+      </w:r>
+      <w:r>
+        <w:t xml:space="preserve"> and mandatory fields are enforced.</w:t>
+      </w:r>
+    </w:p>
+    <w:p>
+      <w:pPr>
+        <w:pStyle w:val="ListParagraph"/>
+        <w:numPr>
+          <w:ilvl w:val="0"/>
+          <w:numId w:val="1"/>
+        </w:numPr>
+      </w:pPr>
+      <w:r>
+        <w:t xml:space="preserve">Current M1 evidence: FR-001 is linked in the RTM </w:t>
+      </w:r>
+      <w:r>
+        <w:t>and recorder as a task or issue in the repository backlog</w:t>
+      </w:r>
+      <w:r>
+        <w:t>.</w:t>
+      </w:r>
+    </w:p>
+    <w:p>
+      <w:pPr>
+        <w:pStyle w:val="ListParagraph"/>
+        <w:numPr>
+          <w:ilvl w:val="0"/>
+          <w:numId w:val="1"/>
+        </w:numPr>
+      </w:pPr>
+      <w:r>
+        <w:t>Later additions: Include M2- data model/UI design for the submission form</w:t>
+      </w:r>
+      <w:r>
+        <w:t>. M3- implementation PR and automated test demonstration</w:t>
+      </w:r>
+      <w:r>
+        <w:t>. M4- proof that the feature functions in the deployed environment.</w:t>
+      </w:r>
+    </w:p>
     <w:p>
       <w:pPr>
         <w:pStyle w:val="Heading1"/>
       </w:pPr>
       <w:r>
+        <w:lastRenderedPageBreak/>
         <w:t>Initial risk register</w:t>
       </w:r>
     </w:p>
@@ -845,6 +4464,175 @@
     </w:sectPr>
   </w:body>
 </w:document>
+</file>
+
+<file path=word/endnotes.xml><?xml version="1.0" encoding="utf-8"?>
+<w:endnotes xmlns:wpc="http://schemas.microsoft.com/office/word/2010/wordprocessingCanvas" xmlns:cx="http://schemas.microsoft.com/office/drawing/2014/chartex" xmlns:cx1="http://schemas.microsoft.com/office/drawing/2015/9/8/chartex" xmlns:cx2="http://schemas.microsoft.com/office/drawing/2015/10/21/chartex" xmlns:cx3="http://schemas.microsoft.com/office/drawing/2016/5/9/chartex" xmlns:cx4="http://schemas.microsoft.com/office/drawing/2016/5/10/chartex" xmlns:cx5="http://schemas.microsoft.com/office/drawing/2016/5/11/chartex" xmlns:cx6="http://schemas.microsoft.com/office/drawing/2016/5/12/chartex" xmlns:cx7="http://schemas.microsoft.com/office/drawing/2016/5/13/chartex" xmlns:cx8="http://schemas.microsoft.com/office/drawing/2016/5/14/chartex" xmlns:mc="http://schemas.openxmlformats.org/markup-compatibility/2006" xmlns:aink="http://schemas.microsoft.com/office/drawing/2016/ink" xmlns:am3d="http://schemas.microsoft.com/office/drawing/2017/model3d" xmlns:o="urn:schemas-microsoft-com:office:office" xmlns:oel="http://schemas.microsoft.com/office/2019/extlst" xmlns:r="http://schemas.openxmlformats.org/officeDocument/2006/relationships" xmlns:m="http://schemas.openxmlformats.org/officeDocument/2006/math" xmlns:v="urn:schemas-microsoft-com:vml" xmlns:wp14="http://schemas.microsoft.com/office/word/2010/wordprocessingDrawing" xmlns:wp="http://schemas.openxmlformats.org/drawingml/2006/wordprocessingDrawing" xmlns:w10="urn:schemas-microsoft-com:office:word" xmlns:w="http://schemas.openxmlformats.org/wordprocessingml/2006/main" xmlns:w14="http://schemas.microsoft.com/office/word/2010/wordml" xmlns:w15="http://schemas.microsoft.com/office/word/2012/wordml" xmlns:w16cex="http://schemas.microsoft.com/office/word/2018/wordml/cex" xmlns:w16cid="http://schemas.microsoft.com/office/word/2016/wordml/cid" xmlns:w16="http://schemas.microsoft.com/office/word/2018/wordml" xmlns:w16du="http://schemas.microsoft.com/office/word/2023/wordml/word16du" xmlns:w16sdtdh="http://schemas.microsoft.com/office/word/2020/wordml/sdtdatahash" xmlns:w16sdtfl="http://schemas.microsoft.com/office/word/2024/wordml/sdtformatlock" xmlns:w16se="http://schemas.microsoft.com/office/word/2015/wordml/symex" xmlns:wpg="http://schemas.microsoft.com/office/word/2010/wordprocessingGroup" xmlns:wpi="http://schemas.microsoft.com/office/word/2010/wordprocessingInk" xmlns:wne="http://schemas.microsoft.com/office/word/2006/wordml" xmlns:wps="http://schemas.microsoft.com/office/word/2010/wordprocessingShape" mc:Ignorable="w14 w15 w16se w16cid w16 w16cex w16sdtdh w16sdtfl w16du wp14">
+  <w:endnote w:type="separator" w:id="-1">
+    <w:p>
+      <w:pPr>
+        <w:spacing w:after="0" w:line="240" w:lineRule="auto"/>
+      </w:pPr>
+      <w:r>
+        <w:separator/>
+      </w:r>
+    </w:p>
+  </w:endnote>
+  <w:endnote w:type="continuationSeparator" w:id="0">
+    <w:p>
+      <w:pPr>
+        <w:spacing w:after="0" w:line="240" w:lineRule="auto"/>
+      </w:pPr>
+      <w:r>
+        <w:continuationSeparator/>
+      </w:r>
+    </w:p>
+  </w:endnote>
+</w:endnotes>
+</file>
+
+<file path=word/footnotes.xml><?xml version="1.0" encoding="utf-8"?>
+<w:footnotes xmlns:wpc="http://schemas.microsoft.com/office/word/2010/wordprocessingCanvas" xmlns:cx="http://schemas.microsoft.com/office/drawing/2014/chartex" xmlns:cx1="http://schemas.microsoft.com/office/drawing/2015/9/8/chartex" xmlns:cx2="http://schemas.microsoft.com/office/drawing/2015/10/21/chartex" xmlns:cx3="http://schemas.microsoft.com/office/drawing/2016/5/9/chartex" xmlns:cx4="http://schemas.microsoft.com/office/drawing/2016/5/10/chartex" xmlns:cx5="http://schemas.microsoft.com/office/drawing/2016/5/11/chartex" xmlns:cx6="http://schemas.microsoft.com/office/drawing/2016/5/12/chartex" xmlns:cx7="http://schemas.microsoft.com/office/drawing/2016/5/13/chartex" xmlns:cx8="http://schemas.microsoft.com/office/drawing/2016/5/14/chartex" xmlns:mc="http://schemas.openxmlformats.org/markup-compatibility/2006" xmlns:aink="http://schemas.microsoft.com/office/drawing/2016/ink" xmlns:am3d="http://schemas.microsoft.com/office/drawing/2017/model3d" xmlns:o="urn:schemas-microsoft-com:office:office" xmlns:oel="http://schemas.microsoft.com/office/2019/extlst" xmlns:r="http://schemas.openxmlformats.org/officeDocument/2006/relationships" xmlns:m="http://schemas.openxmlformats.org/officeDocument/2006/math" xmlns:v="urn:schemas-microsoft-com:vml" xmlns:wp14="http://schemas.microsoft.com/office/word/2010/wordprocessingDrawing" xmlns:wp="http://schemas.openxmlformats.org/drawingml/2006/wordprocessingDrawing" xmlns:w10="urn:schemas-microsoft-com:office:word" xmlns:w="http://schemas.openxmlformats.org/wordprocessingml/2006/main" xmlns:w14="http://schemas.microsoft.com/office/word/2010/wordml" xmlns:w15="http://schemas.microsoft.com/office/word/2012/wordml" xmlns:w16cex="http://schemas.microsoft.com/office/word/2018/wordml/cex" xmlns:w16cid="http://schemas.microsoft.com/office/word/2016/wordml/cid" xmlns:w16="http://schemas.microsoft.com/office/word/2018/wordml" xmlns:w16du="http://schemas.microsoft.com/office/word/2023/wordml/word16du" xmlns:w16sdtdh="http://schemas.microsoft.com/office/word/2020/wordml/sdtdatahash" xmlns:w16sdtfl="http://schemas.microsoft.com/office/word/2024/wordml/sdtformatlock" xmlns:w16se="http://schemas.microsoft.com/office/word/2015/wordml/symex" xmlns:wpg="http://schemas.microsoft.com/office/word/2010/wordprocessingGroup" xmlns:wpi="http://schemas.microsoft.com/office/word/2010/wordprocessingInk" xmlns:wne="http://schemas.microsoft.com/office/word/2006/wordml" xmlns:wps="http://schemas.microsoft.com/office/word/2010/wordprocessingShape" mc:Ignorable="w14 w15 w16se w16cid w16 w16cex w16sdtdh w16sdtfl w16du wp14">
+  <w:footnote w:type="separator" w:id="-1">
+    <w:p>
+      <w:pPr>
+        <w:spacing w:after="0" w:line="240" w:lineRule="auto"/>
+      </w:pPr>
+      <w:r>
+        <w:separator/>
+      </w:r>
+    </w:p>
+  </w:footnote>
+  <w:footnote w:type="continuationSeparator" w:id="0">
+    <w:p>
+      <w:pPr>
+        <w:spacing w:after="0" w:line="240" w:lineRule="auto"/>
+      </w:pPr>
+      <w:r>
+        <w:continuationSeparator/>
+      </w:r>
+    </w:p>
+  </w:footnote>
+  <w:footnote w:id="1">
+    <w:p>
+      <w:pPr>
+        <w:pStyle w:val="FootnoteText"/>
+        <w:rPr>
+          <w:lang w:val="en-US"/>
+        </w:rPr>
+      </w:pPr>
+      <w:r>
+        <w:rPr>
+          <w:rStyle w:val="FootnoteReference"/>
+        </w:rPr>
+        <w:footnoteRef/>
+      </w:r>
+      <w:r>
+        <w:t xml:space="preserve"> </w:t>
+      </w:r>
+      <w:r>
+        <w:rPr>
+          <w:lang w:val="en-US"/>
+        </w:rPr>
+        <w:t>New member of the development team.</w:t>
+      </w:r>
+    </w:p>
+  </w:footnote>
+</w:footnotes>
+</file>
+
+<file path=word/numbering.xml><?xml version="1.0" encoding="utf-8"?>
+<w:numbering xmlns:wpc="http://schemas.microsoft.com/office/word/2010/wordprocessingCanvas" xmlns:cx="http://schemas.microsoft.com/office/drawing/2014/chartex" xmlns:cx1="http://schemas.microsoft.com/office/drawing/2015/9/8/chartex" xmlns:cx2="http://schemas.microsoft.com/office/drawing/2015/10/21/chartex" xmlns:cx3="http://schemas.microsoft.com/office/drawing/2016/5/9/chartex" xmlns:cx4="http://schemas.microsoft.com/office/drawing/2016/5/10/chartex" xmlns:cx5="http://schemas.microsoft.com/office/drawing/2016/5/11/chartex" xmlns:cx6="http://schemas.microsoft.com/office/drawing/2016/5/12/chartex" xmlns:cx7="http://schemas.microsoft.com/office/drawing/2016/5/13/chartex" xmlns:cx8="http://schemas.microsoft.com/office/drawing/2016/5/14/chartex" xmlns:mc="http://schemas.openxmlformats.org/markup-compatibility/2006" xmlns:aink="http://schemas.microsoft.com/office/drawing/2016/ink" xmlns:am3d="http://schemas.microsoft.com/office/drawing/2017/model3d" xmlns:o="urn:schemas-microsoft-com:office:office" xmlns:oel="http://schemas.microsoft.com/office/2019/extlst" xmlns:r="http://schemas.openxmlformats.org/officeDocument/2006/relationships" xmlns:m="http://schemas.openxmlformats.org/officeDocument/2006/math" xmlns:v="urn:schemas-microsoft-com:vml" xmlns:wp14="http://schemas.microsoft.com/office/word/2010/wordprocessingDrawing" xmlns:wp="http://schemas.openxmlformats.org/drawingml/2006/wordprocessingDrawing" xmlns:w10="urn:schemas-microsoft-com:office:word" xmlns:w="http://schemas.openxmlformats.org/wordprocessingml/2006/main" xmlns:w14="http://schemas.microsoft.com/office/word/2010/wordml" xmlns:w15="http://schemas.microsoft.com/office/word/2012/wordml" xmlns:w16cex="http://schemas.microsoft.com/office/word/2018/wordml/cex" xmlns:w16cid="http://schemas.microsoft.com/office/word/2016/wordml/cid" xmlns:w16="http://schemas.microsoft.com/office/word/2018/wordml" xmlns:w16du="http://schemas.microsoft.com/office/word/2023/wordml/word16du" xmlns:w16sdtdh="http://schemas.microsoft.com/office/word/2020/wordml/sdtdatahash" xmlns:w16sdtfl="http://schemas.microsoft.com/office/word/2024/wordml/sdtformatlock" xmlns:w16se="http://schemas.microsoft.com/office/word/2015/wordml/symex" xmlns:wpg="http://schemas.microsoft.com/office/word/2010/wordprocessingGroup" xmlns:wpi="http://schemas.microsoft.com/office/word/2010/wordprocessingInk" xmlns:wne="http://schemas.microsoft.com/office/word/2006/wordml" xmlns:wps="http://schemas.microsoft.com/office/word/2010/wordprocessingShape" mc:Ignorable="w14 w15 w16se w16cid w16 w16cex w16sdtdh w16sdtfl w16du wp14">
+  <w:abstractNum w:abstractNumId="0" w15:restartNumberingAfterBreak="0">
+    <w:nsid w:val="661A3109"/>
+    <w:multiLevelType w:val="hybridMultilevel"/>
+    <w:tmpl w:val="B94292DC"/>
+    <w:lvl w:ilvl="0" w:tplc="0409000F">
+      <w:start w:val="1"/>
+      <w:numFmt w:val="decimal"/>
+      <w:lvlText w:val="%1."/>
+      <w:lvlJc w:val="left"/>
+      <w:pPr>
+        <w:ind w:left="768" w:hanging="360"/>
+      </w:pPr>
+    </w:lvl>
+    <w:lvl w:ilvl="1" w:tplc="04090019" w:tentative="1">
+      <w:start w:val="1"/>
+      <w:numFmt w:val="lowerLetter"/>
+      <w:lvlText w:val="%2."/>
+      <w:lvlJc w:val="left"/>
+      <w:pPr>
+        <w:ind w:left="1488" w:hanging="360"/>
+      </w:pPr>
+    </w:lvl>
+    <w:lvl w:ilvl="2" w:tplc="0409001B" w:tentative="1">
+      <w:start w:val="1"/>
+      <w:numFmt w:val="lowerRoman"/>
+      <w:lvlText w:val="%3."/>
+      <w:lvlJc w:val="right"/>
+      <w:pPr>
+        <w:ind w:left="2208" w:hanging="180"/>
+      </w:pPr>
+    </w:lvl>
+    <w:lvl w:ilvl="3" w:tplc="0409000F" w:tentative="1">
+      <w:start w:val="1"/>
+      <w:numFmt w:val="decimal"/>
+      <w:lvlText w:val="%4."/>
+      <w:lvlJc w:val="left"/>
+      <w:pPr>
+        <w:ind w:left="2928" w:hanging="360"/>
+      </w:pPr>
+    </w:lvl>
+    <w:lvl w:ilvl="4" w:tplc="04090019" w:tentative="1">
+      <w:start w:val="1"/>
+      <w:numFmt w:val="lowerLetter"/>
+      <w:lvlText w:val="%5."/>
+      <w:lvlJc w:val="left"/>
+      <w:pPr>
+        <w:ind w:left="3648" w:hanging="360"/>
+      </w:pPr>
+    </w:lvl>
+    <w:lvl w:ilvl="5" w:tplc="0409001B" w:tentative="1">
+      <w:start w:val="1"/>
+      <w:numFmt w:val="lowerRoman"/>
+      <w:lvlText w:val="%6."/>
+      <w:lvlJc w:val="right"/>
+      <w:pPr>
+        <w:ind w:left="4368" w:hanging="180"/>
+      </w:pPr>
+    </w:lvl>
+    <w:lvl w:ilvl="6" w:tplc="0409000F" w:tentative="1">
+      <w:start w:val="1"/>
+      <w:numFmt w:val="decimal"/>
+      <w:lvlText w:val="%7."/>
+      <w:lvlJc w:val="left"/>
+      <w:pPr>
+        <w:ind w:left="5088" w:hanging="360"/>
+      </w:pPr>
+    </w:lvl>
+    <w:lvl w:ilvl="7" w:tplc="04090019" w:tentative="1">
+      <w:start w:val="1"/>
+      <w:numFmt w:val="lowerLetter"/>
+      <w:lvlText w:val="%8."/>
+      <w:lvlJc w:val="left"/>
+      <w:pPr>
+        <w:ind w:left="5808" w:hanging="360"/>
+      </w:pPr>
+    </w:lvl>
+    <w:lvl w:ilvl="8" w:tplc="0409001B" w:tentative="1">
+      <w:start w:val="1"/>
+      <w:numFmt w:val="lowerRoman"/>
+      <w:lvlText w:val="%9."/>
+      <w:lvlJc w:val="right"/>
+      <w:pPr>
+        <w:ind w:left="6528" w:hanging="180"/>
+      </w:pPr>
+    </w:lvl>
+  </w:abstractNum>
+  <w:num w:numId="1" w16cid:durableId="1611619726">
+    <w:abstractNumId w:val="0"/>
+  </w:num>
+</w:numbering>
 </file>
 
 <file path=word/styles.xml><?xml version="1.0" encoding="utf-8"?>
@@ -1247,7 +5035,7 @@
   <w:style w:type="paragraph" w:default="1" w:styleId="Normal">
     <w:name w:val="Normal"/>
     <w:qFormat/>
-    <w:rsid w:val="00F047F6"/>
+    <w:rsid w:val="0019184D"/>
   </w:style>
   <w:style w:type="paragraph" w:styleId="Heading1">
     <w:name w:val="heading 1"/>
@@ -1276,7 +5064,6 @@
     <w:next w:val="Normal"/>
     <w:link w:val="Heading2Char"/>
     <w:uiPriority w:val="9"/>
-    <w:semiHidden/>
     <w:unhideWhenUsed/>
     <w:qFormat/>
     <w:rsid w:val="00F047F6"/>
@@ -1451,7 +5238,6 @@
   <w:style w:type="character" w:default="1" w:styleId="DefaultParagraphFont">
     <w:name w:val="Default Paragraph Font"/>
     <w:uiPriority w:val="1"/>
-    <w:semiHidden/>
     <w:unhideWhenUsed/>
   </w:style>
   <w:style w:type="table" w:default="1" w:styleId="TableNormal">
@@ -1493,7 +5279,6 @@
     <w:basedOn w:val="DefaultParagraphFont"/>
     <w:link w:val="Heading2"/>
     <w:uiPriority w:val="9"/>
-    <w:semiHidden/>
     <w:rsid w:val="00F047F6"/>
     <w:rPr>
       <w:rFonts w:asciiTheme="majorHAnsi" w:eastAsiaTheme="majorEastAsia" w:hAnsiTheme="majorHAnsi" w:cstheme="majorBidi"/>
@@ -1853,6 +5638,275 @@
       <w:u w:val="single"/>
     </w:rPr>
   </w:style>
+  <w:style w:type="table" w:styleId="TableGrid">
+    <w:name w:val="Table Grid"/>
+    <w:basedOn w:val="TableNormal"/>
+    <w:uiPriority w:val="39"/>
+    <w:rsid w:val="00AA54D9"/>
+    <w:pPr>
+      <w:spacing w:after="0" w:line="240" w:lineRule="auto"/>
+    </w:pPr>
+    <w:tblPr>
+      <w:tblBorders>
+        <w:top w:val="single" w:sz="4" w:space="0" w:color="auto"/>
+        <w:left w:val="single" w:sz="4" w:space="0" w:color="auto"/>
+        <w:bottom w:val="single" w:sz="4" w:space="0" w:color="auto"/>
+        <w:right w:val="single" w:sz="4" w:space="0" w:color="auto"/>
+        <w:insideH w:val="single" w:sz="4" w:space="0" w:color="auto"/>
+        <w:insideV w:val="single" w:sz="4" w:space="0" w:color="auto"/>
+      </w:tblBorders>
+    </w:tblPr>
+  </w:style>
+  <w:style w:type="table" w:styleId="GridTable2">
+    <w:name w:val="Grid Table 2"/>
+    <w:basedOn w:val="TableNormal"/>
+    <w:uiPriority w:val="47"/>
+    <w:rsid w:val="00AA54D9"/>
+    <w:pPr>
+      <w:spacing w:after="0" w:line="240" w:lineRule="auto"/>
+    </w:pPr>
+    <w:tblPr>
+      <w:tblStyleRowBandSize w:val="1"/>
+      <w:tblStyleColBandSize w:val="1"/>
+      <w:tblBorders>
+        <w:top w:val="single" w:sz="2" w:space="0" w:color="666666" w:themeColor="text1" w:themeTint="99"/>
+        <w:bottom w:val="single" w:sz="2" w:space="0" w:color="666666" w:themeColor="text1" w:themeTint="99"/>
+        <w:insideH w:val="single" w:sz="2" w:space="0" w:color="666666" w:themeColor="text1" w:themeTint="99"/>
+        <w:insideV w:val="single" w:sz="2" w:space="0" w:color="666666" w:themeColor="text1" w:themeTint="99"/>
+      </w:tblBorders>
+    </w:tblPr>
+    <w:tblStylePr w:type="firstRow">
+      <w:rPr>
+        <w:b/>
+        <w:bCs/>
+      </w:rPr>
+      <w:tblPr/>
+      <w:tcPr>
+        <w:tcBorders>
+          <w:top w:val="nil"/>
+          <w:bottom w:val="single" w:sz="12" w:space="0" w:color="666666" w:themeColor="text1" w:themeTint="99"/>
+          <w:insideH w:val="nil"/>
+          <w:insideV w:val="nil"/>
+        </w:tcBorders>
+        <w:shd w:val="clear" w:color="auto" w:fill="FFFFFF" w:themeFill="background1"/>
+      </w:tcPr>
+    </w:tblStylePr>
+    <w:tblStylePr w:type="lastRow">
+      <w:rPr>
+        <w:b/>
+        <w:bCs/>
+      </w:rPr>
+      <w:tblPr/>
+      <w:tcPr>
+        <w:tcBorders>
+          <w:top w:val="double" w:sz="2" w:space="0" w:color="666666" w:themeColor="text1" w:themeTint="99"/>
+          <w:bottom w:val="nil"/>
+          <w:insideH w:val="nil"/>
+          <w:insideV w:val="nil"/>
+        </w:tcBorders>
+        <w:shd w:val="clear" w:color="auto" w:fill="FFFFFF" w:themeFill="background1"/>
+      </w:tcPr>
+    </w:tblStylePr>
+    <w:tblStylePr w:type="firstCol">
+      <w:rPr>
+        <w:b/>
+        <w:bCs/>
+      </w:rPr>
+    </w:tblStylePr>
+    <w:tblStylePr w:type="lastCol">
+      <w:rPr>
+        <w:b/>
+        <w:bCs/>
+      </w:rPr>
+    </w:tblStylePr>
+    <w:tblStylePr w:type="band1Vert">
+      <w:tblPr/>
+      <w:tcPr>
+        <w:shd w:val="clear" w:color="auto" w:fill="CCCCCC" w:themeFill="text1" w:themeFillTint="33"/>
+      </w:tcPr>
+    </w:tblStylePr>
+    <w:tblStylePr w:type="band1Horz">
+      <w:tblPr/>
+      <w:tcPr>
+        <w:shd w:val="clear" w:color="auto" w:fill="CCCCCC" w:themeFill="text1" w:themeFillTint="33"/>
+      </w:tcPr>
+    </w:tblStylePr>
+  </w:style>
+  <w:style w:type="paragraph" w:styleId="FootnoteText">
+    <w:name w:val="footnote text"/>
+    <w:basedOn w:val="Normal"/>
+    <w:link w:val="FootnoteTextChar"/>
+    <w:uiPriority w:val="99"/>
+    <w:semiHidden/>
+    <w:unhideWhenUsed/>
+    <w:rsid w:val="00927213"/>
+    <w:pPr>
+      <w:spacing w:after="0" w:line="240" w:lineRule="auto"/>
+    </w:pPr>
+    <w:rPr>
+      <w:sz w:val="20"/>
+      <w:szCs w:val="20"/>
+    </w:rPr>
+  </w:style>
+  <w:style w:type="character" w:customStyle="1" w:styleId="FootnoteTextChar">
+    <w:name w:val="Footnote Text Char"/>
+    <w:basedOn w:val="DefaultParagraphFont"/>
+    <w:link w:val="FootnoteText"/>
+    <w:uiPriority w:val="99"/>
+    <w:semiHidden/>
+    <w:rsid w:val="00927213"/>
+    <w:rPr>
+      <w:sz w:val="20"/>
+      <w:szCs w:val="20"/>
+    </w:rPr>
+  </w:style>
+  <w:style w:type="character" w:styleId="FootnoteReference">
+    <w:name w:val="footnote reference"/>
+    <w:basedOn w:val="DefaultParagraphFont"/>
+    <w:uiPriority w:val="99"/>
+    <w:semiHidden/>
+    <w:unhideWhenUsed/>
+    <w:rsid w:val="00927213"/>
+    <w:rPr>
+      <w:vertAlign w:val="superscript"/>
+    </w:rPr>
+  </w:style>
+  <w:style w:type="table" w:styleId="GridTable3">
+    <w:name w:val="Grid Table 3"/>
+    <w:basedOn w:val="TableNormal"/>
+    <w:uiPriority w:val="48"/>
+    <w:rsid w:val="0090029B"/>
+    <w:pPr>
+      <w:spacing w:after="0" w:line="240" w:lineRule="auto"/>
+    </w:pPr>
+    <w:tblPr>
+      <w:tblStyleRowBandSize w:val="1"/>
+      <w:tblStyleColBandSize w:val="1"/>
+      <w:tblBorders>
+        <w:top w:val="single" w:sz="4" w:space="0" w:color="666666" w:themeColor="text1" w:themeTint="99"/>
+        <w:left w:val="single" w:sz="4" w:space="0" w:color="666666" w:themeColor="text1" w:themeTint="99"/>
+        <w:bottom w:val="single" w:sz="4" w:space="0" w:color="666666" w:themeColor="text1" w:themeTint="99"/>
+        <w:right w:val="single" w:sz="4" w:space="0" w:color="666666" w:themeColor="text1" w:themeTint="99"/>
+        <w:insideH w:val="single" w:sz="4" w:space="0" w:color="666666" w:themeColor="text1" w:themeTint="99"/>
+        <w:insideV w:val="single" w:sz="4" w:space="0" w:color="666666" w:themeColor="text1" w:themeTint="99"/>
+      </w:tblBorders>
+    </w:tblPr>
+    <w:tblStylePr w:type="firstRow">
+      <w:rPr>
+        <w:b/>
+        <w:bCs/>
+      </w:rPr>
+      <w:tblPr/>
+      <w:tcPr>
+        <w:tcBorders>
+          <w:top w:val="nil"/>
+          <w:left w:val="nil"/>
+          <w:right w:val="nil"/>
+          <w:insideH w:val="nil"/>
+          <w:insideV w:val="nil"/>
+        </w:tcBorders>
+        <w:shd w:val="clear" w:color="auto" w:fill="FFFFFF" w:themeFill="background1"/>
+      </w:tcPr>
+    </w:tblStylePr>
+    <w:tblStylePr w:type="lastRow">
+      <w:rPr>
+        <w:b/>
+        <w:bCs/>
+      </w:rPr>
+      <w:tblPr/>
+      <w:tcPr>
+        <w:tcBorders>
+          <w:left w:val="nil"/>
+          <w:bottom w:val="nil"/>
+          <w:right w:val="nil"/>
+          <w:insideH w:val="nil"/>
+          <w:insideV w:val="nil"/>
+        </w:tcBorders>
+        <w:shd w:val="clear" w:color="auto" w:fill="FFFFFF" w:themeFill="background1"/>
+      </w:tcPr>
+    </w:tblStylePr>
+    <w:tblStylePr w:type="firstCol">
+      <w:pPr>
+        <w:jc w:val="right"/>
+      </w:pPr>
+      <w:rPr>
+        <w:i/>
+        <w:iCs/>
+      </w:rPr>
+      <w:tblPr/>
+      <w:tcPr>
+        <w:tcBorders>
+          <w:top w:val="nil"/>
+          <w:left w:val="nil"/>
+          <w:bottom w:val="nil"/>
+          <w:insideH w:val="nil"/>
+          <w:insideV w:val="nil"/>
+        </w:tcBorders>
+        <w:shd w:val="clear" w:color="auto" w:fill="FFFFFF" w:themeFill="background1"/>
+      </w:tcPr>
+    </w:tblStylePr>
+    <w:tblStylePr w:type="lastCol">
+      <w:rPr>
+        <w:i/>
+        <w:iCs/>
+      </w:rPr>
+      <w:tblPr/>
+      <w:tcPr>
+        <w:tcBorders>
+          <w:top w:val="nil"/>
+          <w:bottom w:val="nil"/>
+          <w:right w:val="nil"/>
+          <w:insideH w:val="nil"/>
+          <w:insideV w:val="nil"/>
+        </w:tcBorders>
+        <w:shd w:val="clear" w:color="auto" w:fill="FFFFFF" w:themeFill="background1"/>
+      </w:tcPr>
+    </w:tblStylePr>
+    <w:tblStylePr w:type="band1Vert">
+      <w:tblPr/>
+      <w:tcPr>
+        <w:shd w:val="clear" w:color="auto" w:fill="CCCCCC" w:themeFill="text1" w:themeFillTint="33"/>
+      </w:tcPr>
+    </w:tblStylePr>
+    <w:tblStylePr w:type="band1Horz">
+      <w:tblPr/>
+      <w:tcPr>
+        <w:shd w:val="clear" w:color="auto" w:fill="CCCCCC" w:themeFill="text1" w:themeFillTint="33"/>
+      </w:tcPr>
+    </w:tblStylePr>
+    <w:tblStylePr w:type="neCell">
+      <w:tblPr/>
+      <w:tcPr>
+        <w:tcBorders>
+          <w:bottom w:val="single" w:sz="4" w:space="0" w:color="666666" w:themeColor="text1" w:themeTint="99"/>
+        </w:tcBorders>
+      </w:tcPr>
+    </w:tblStylePr>
+    <w:tblStylePr w:type="nwCell">
+      <w:tblPr/>
+      <w:tcPr>
+        <w:tcBorders>
+          <w:bottom w:val="single" w:sz="4" w:space="0" w:color="666666" w:themeColor="text1" w:themeTint="99"/>
+        </w:tcBorders>
+      </w:tcPr>
+    </w:tblStylePr>
+    <w:tblStylePr w:type="seCell">
+      <w:tblPr/>
+      <w:tcPr>
+        <w:tcBorders>
+          <w:top w:val="single" w:sz="4" w:space="0" w:color="666666" w:themeColor="text1" w:themeTint="99"/>
+        </w:tcBorders>
+      </w:tcPr>
+    </w:tblStylePr>
+    <w:tblStylePr w:type="swCell">
+      <w:tblPr/>
+      <w:tcPr>
+        <w:tcBorders>
+          <w:top w:val="single" w:sz="4" w:space="0" w:color="666666" w:themeColor="text1" w:themeTint="99"/>
+        </w:tcBorders>
+      </w:tcPr>
+    </w:tblStylePr>
+  </w:style>
 </w:styles>
 </file>
 
@@ -1929,18 +5983,18 @@
 
 <file path=word/glossary/fontTable.xml><?xml version="1.0" encoding="utf-8"?>
 <w:fonts xmlns:mc="http://schemas.openxmlformats.org/markup-compatibility/2006" xmlns:r="http://schemas.openxmlformats.org/officeDocument/2006/relationships" xmlns:w="http://schemas.openxmlformats.org/wordprocessingml/2006/main" xmlns:w14="http://schemas.microsoft.com/office/word/2010/wordml" xmlns:w15="http://schemas.microsoft.com/office/word/2012/wordml" xmlns:w16cex="http://schemas.microsoft.com/office/word/2018/wordml/cex" xmlns:w16cid="http://schemas.microsoft.com/office/word/2016/wordml/cid" xmlns:w16="http://schemas.microsoft.com/office/word/2018/wordml" xmlns:w16du="http://schemas.microsoft.com/office/word/2023/wordml/word16du" xmlns:w16sdtdh="http://schemas.microsoft.com/office/word/2020/wordml/sdtdatahash" xmlns:w16sdtfl="http://schemas.microsoft.com/office/word/2024/wordml/sdtformatlock" xmlns:w16se="http://schemas.microsoft.com/office/word/2015/wordml/symex" mc:Ignorable="w14 w15 w16se w16cid w16 w16cex w16sdtdh w16sdtfl w16du">
-  <w:font w:name="Aptos">
-    <w:charset w:val="00"/>
-    <w:family w:val="swiss"/>
-    <w:pitch w:val="variable"/>
-    <w:sig w:usb0="20000287" w:usb1="00000003" w:usb2="00000000" w:usb3="00000000" w:csb0="0000019F" w:csb1="00000000"/>
-  </w:font>
   <w:font w:name="Times New Roman">
     <w:panose1 w:val="02020603050405020304"/>
     <w:charset w:val="00"/>
     <w:family w:val="roman"/>
     <w:pitch w:val="variable"/>
     <w:sig w:usb0="E0002EFF" w:usb1="C000785B" w:usb2="00000009" w:usb3="00000000" w:csb0="000001FF" w:csb1="00000000"/>
+  </w:font>
+  <w:font w:name="Aptos">
+    <w:charset w:val="00"/>
+    <w:family w:val="swiss"/>
+    <w:pitch w:val="variable"/>
+    <w:sig w:usb0="20000287" w:usb1="00000003" w:usb2="00000000" w:usb3="00000000" w:csb0="0000019F" w:csb1="00000000"/>
   </w:font>
   <w:font w:name="Aptos Display">
     <w:charset w:val="00"/>
@@ -1967,11 +6021,15 @@
   </w:compat>
   <w:rsids>
     <w:rsidRoot w:val="006C106A"/>
+    <w:rsid w:val="00652EBA"/>
+    <w:rsid w:val="006B0995"/>
     <w:rsid w:val="006B59FC"/>
     <w:rsid w:val="006C106A"/>
     <w:rsid w:val="00B13C9E"/>
+    <w:rsid w:val="00BB3F3C"/>
     <w:rsid w:val="00E3330B"/>
     <w:rsid w:val="00ED1F7E"/>
+    <w:rsid w:val="00F11FC7"/>
   </w:rsids>
   <m:mathPr>
     <m:mathFont m:val="Cambria Math"/>

</xml_diff>

<commit_message>
Added Decision Log and AI Usage Register
Add individual decision log entry and AI Usage Register" -m "
- Adds Engineering Decision Log table with DEC-B-002: deferral of
  the exact NFR-002 (Performance) threshold pending M2 hosting/
  architecture decisions, with a labelled provisional placeholder
  set in the interim (per Master Brief §13 ADR structure)
- Adds AI Usage Register with 4 entries covering AI-assisted work on
  Requirements/RTM drafting, PED table population, the decision log
  entry itself, and commit message drafting, each recording the
  verification step taken and issues found (per Master Brief §10.1
  minimum fields)

Refs: PED v1.0, M1 Engineering Decision Log and AI Usage Register sections
</commit_message>
<xml_diff>
--- a/SEN_381_Project_Miletone_1.docx
+++ b/SEN_381_Project_Miletone_1.docx
@@ -651,19 +651,7 @@
                               <w:rPr>
                                 <w:rStyle w:val="Hyperlink"/>
                               </w:rPr>
-                              <w:t>Git</w:t>
-                            </w:r>
-                            <w:r>
-                              <w:rPr>
-                                <w:rStyle w:val="Hyperlink"/>
-                              </w:rPr>
-                              <w:t>H</w:t>
-                            </w:r>
-                            <w:r>
-                              <w:rPr>
-                                <w:rStyle w:val="Hyperlink"/>
-                              </w:rPr>
-                              <w:t>ub Repo</w:t>
+                              <w:t>GitHub Repo</w:t>
                             </w:r>
                           </w:hyperlink>
                         </w:p>
@@ -715,17 +703,1044 @@
           </w:r>
         </w:p>
         <w:p>
-          <w:fldSimple w:instr=" TOC \o &quot;1-3&quot; \h \z \u ">
-            <w:r>
-              <w:rPr>
-                <w:b/>
-                <w:bCs/>
-                <w:noProof/>
-                <w:lang w:val="en-US"/>
-              </w:rPr>
-              <w:t>No table of contents entries found.</w:t>
-            </w:r>
-          </w:fldSimple>
+          <w:pPr>
+            <w:pStyle w:val="TOC1"/>
+            <w:tabs>
+              <w:tab w:val="right" w:leader="dot" w:pos="9016"/>
+            </w:tabs>
+            <w:rPr>
+              <w:noProof/>
+            </w:rPr>
+          </w:pPr>
+          <w:r>
+            <w:fldChar w:fldCharType="begin"/>
+          </w:r>
+          <w:r>
+            <w:instrText xml:space="preserve"> TOC \o "1-3" \h \z \u </w:instrText>
+          </w:r>
+          <w:r>
+            <w:fldChar w:fldCharType="separate"/>
+          </w:r>
+          <w:hyperlink w:anchor="_Toc239857434" w:history="1">
+            <w:r>
+              <w:rPr>
+                <w:rStyle w:val="Hyperlink"/>
+                <w:noProof/>
+              </w:rPr>
+              <w:t>Problem &amp; business need</w:t>
+            </w:r>
+            <w:r>
+              <w:rPr>
+                <w:noProof/>
+                <w:webHidden/>
+              </w:rPr>
+              <w:tab/>
+            </w:r>
+            <w:r>
+              <w:rPr>
+                <w:noProof/>
+                <w:webHidden/>
+              </w:rPr>
+              <w:fldChar w:fldCharType="begin"/>
+            </w:r>
+            <w:r>
+              <w:rPr>
+                <w:noProof/>
+                <w:webHidden/>
+              </w:rPr>
+              <w:instrText xml:space="preserve"> PAGEREF _Toc239857434 \h </w:instrText>
+            </w:r>
+            <w:r>
+              <w:rPr>
+                <w:noProof/>
+                <w:webHidden/>
+              </w:rPr>
+            </w:r>
+            <w:r>
+              <w:rPr>
+                <w:noProof/>
+                <w:webHidden/>
+              </w:rPr>
+              <w:fldChar w:fldCharType="separate"/>
+            </w:r>
+            <w:r>
+              <w:rPr>
+                <w:noProof/>
+                <w:webHidden/>
+              </w:rPr>
+              <w:t>3</w:t>
+            </w:r>
+            <w:r>
+              <w:rPr>
+                <w:noProof/>
+                <w:webHidden/>
+              </w:rPr>
+              <w:fldChar w:fldCharType="end"/>
+            </w:r>
+          </w:hyperlink>
+        </w:p>
+        <w:p>
+          <w:pPr>
+            <w:pStyle w:val="TOC1"/>
+            <w:tabs>
+              <w:tab w:val="right" w:leader="dot" w:pos="9016"/>
+            </w:tabs>
+            <w:rPr>
+              <w:noProof/>
+            </w:rPr>
+          </w:pPr>
+          <w:hyperlink w:anchor="_Toc239857435" w:history="1">
+            <w:r>
+              <w:rPr>
+                <w:rStyle w:val="Hyperlink"/>
+                <w:noProof/>
+              </w:rPr>
+              <w:t>Stakeholder analysis</w:t>
+            </w:r>
+            <w:r>
+              <w:rPr>
+                <w:noProof/>
+                <w:webHidden/>
+              </w:rPr>
+              <w:tab/>
+            </w:r>
+            <w:r>
+              <w:rPr>
+                <w:noProof/>
+                <w:webHidden/>
+              </w:rPr>
+              <w:fldChar w:fldCharType="begin"/>
+            </w:r>
+            <w:r>
+              <w:rPr>
+                <w:noProof/>
+                <w:webHidden/>
+              </w:rPr>
+              <w:instrText xml:space="preserve"> PAGEREF _Toc239857435 \h </w:instrText>
+            </w:r>
+            <w:r>
+              <w:rPr>
+                <w:noProof/>
+                <w:webHidden/>
+              </w:rPr>
+            </w:r>
+            <w:r>
+              <w:rPr>
+                <w:noProof/>
+                <w:webHidden/>
+              </w:rPr>
+              <w:fldChar w:fldCharType="separate"/>
+            </w:r>
+            <w:r>
+              <w:rPr>
+                <w:noProof/>
+                <w:webHidden/>
+              </w:rPr>
+              <w:t>3</w:t>
+            </w:r>
+            <w:r>
+              <w:rPr>
+                <w:noProof/>
+                <w:webHidden/>
+              </w:rPr>
+              <w:fldChar w:fldCharType="end"/>
+            </w:r>
+          </w:hyperlink>
+        </w:p>
+        <w:p>
+          <w:pPr>
+            <w:pStyle w:val="TOC1"/>
+            <w:tabs>
+              <w:tab w:val="right" w:leader="dot" w:pos="9016"/>
+            </w:tabs>
+            <w:rPr>
+              <w:noProof/>
+            </w:rPr>
+          </w:pPr>
+          <w:hyperlink w:anchor="_Toc239857436" w:history="1">
+            <w:r>
+              <w:rPr>
+                <w:rStyle w:val="Hyperlink"/>
+                <w:noProof/>
+              </w:rPr>
+              <w:t>Scope baseline</w:t>
+            </w:r>
+            <w:r>
+              <w:rPr>
+                <w:noProof/>
+                <w:webHidden/>
+              </w:rPr>
+              <w:tab/>
+            </w:r>
+            <w:r>
+              <w:rPr>
+                <w:noProof/>
+                <w:webHidden/>
+              </w:rPr>
+              <w:fldChar w:fldCharType="begin"/>
+            </w:r>
+            <w:r>
+              <w:rPr>
+                <w:noProof/>
+                <w:webHidden/>
+              </w:rPr>
+              <w:instrText xml:space="preserve"> PAGEREF _Toc239857436 \h </w:instrText>
+            </w:r>
+            <w:r>
+              <w:rPr>
+                <w:noProof/>
+                <w:webHidden/>
+              </w:rPr>
+            </w:r>
+            <w:r>
+              <w:rPr>
+                <w:noProof/>
+                <w:webHidden/>
+              </w:rPr>
+              <w:fldChar w:fldCharType="separate"/>
+            </w:r>
+            <w:r>
+              <w:rPr>
+                <w:noProof/>
+                <w:webHidden/>
+              </w:rPr>
+              <w:t>3</w:t>
+            </w:r>
+            <w:r>
+              <w:rPr>
+                <w:noProof/>
+                <w:webHidden/>
+              </w:rPr>
+              <w:fldChar w:fldCharType="end"/>
+            </w:r>
+          </w:hyperlink>
+        </w:p>
+        <w:p>
+          <w:pPr>
+            <w:pStyle w:val="TOC1"/>
+            <w:tabs>
+              <w:tab w:val="right" w:leader="dot" w:pos="9016"/>
+            </w:tabs>
+            <w:rPr>
+              <w:noProof/>
+            </w:rPr>
+          </w:pPr>
+          <w:hyperlink w:anchor="_Toc239857437" w:history="1">
+            <w:r>
+              <w:rPr>
+                <w:rStyle w:val="Hyperlink"/>
+                <w:noProof/>
+              </w:rPr>
+              <w:t>Requirements &amp; acceptance criteria</w:t>
+            </w:r>
+            <w:r>
+              <w:rPr>
+                <w:noProof/>
+                <w:webHidden/>
+              </w:rPr>
+              <w:tab/>
+            </w:r>
+            <w:r>
+              <w:rPr>
+                <w:noProof/>
+                <w:webHidden/>
+              </w:rPr>
+              <w:fldChar w:fldCharType="begin"/>
+            </w:r>
+            <w:r>
+              <w:rPr>
+                <w:noProof/>
+                <w:webHidden/>
+              </w:rPr>
+              <w:instrText xml:space="preserve"> PAGEREF _Toc239857437 \h </w:instrText>
+            </w:r>
+            <w:r>
+              <w:rPr>
+                <w:noProof/>
+                <w:webHidden/>
+              </w:rPr>
+            </w:r>
+            <w:r>
+              <w:rPr>
+                <w:noProof/>
+                <w:webHidden/>
+              </w:rPr>
+              <w:fldChar w:fldCharType="separate"/>
+            </w:r>
+            <w:r>
+              <w:rPr>
+                <w:noProof/>
+                <w:webHidden/>
+              </w:rPr>
+              <w:t>3</w:t>
+            </w:r>
+            <w:r>
+              <w:rPr>
+                <w:noProof/>
+                <w:webHidden/>
+              </w:rPr>
+              <w:fldChar w:fldCharType="end"/>
+            </w:r>
+          </w:hyperlink>
+        </w:p>
+        <w:p>
+          <w:pPr>
+            <w:pStyle w:val="TOC2"/>
+            <w:tabs>
+              <w:tab w:val="right" w:leader="dot" w:pos="9016"/>
+            </w:tabs>
+            <w:rPr>
+              <w:noProof/>
+            </w:rPr>
+          </w:pPr>
+          <w:hyperlink w:anchor="_Toc239857438" w:history="1">
+            <w:r>
+              <w:rPr>
+                <w:rStyle w:val="Hyperlink"/>
+                <w:noProof/>
+              </w:rPr>
+              <w:t>Functional Requirements (FRs)</w:t>
+            </w:r>
+            <w:r>
+              <w:rPr>
+                <w:noProof/>
+                <w:webHidden/>
+              </w:rPr>
+              <w:tab/>
+            </w:r>
+            <w:r>
+              <w:rPr>
+                <w:noProof/>
+                <w:webHidden/>
+              </w:rPr>
+              <w:fldChar w:fldCharType="begin"/>
+            </w:r>
+            <w:r>
+              <w:rPr>
+                <w:noProof/>
+                <w:webHidden/>
+              </w:rPr>
+              <w:instrText xml:space="preserve"> PAGEREF _Toc239857438 \h </w:instrText>
+            </w:r>
+            <w:r>
+              <w:rPr>
+                <w:noProof/>
+                <w:webHidden/>
+              </w:rPr>
+            </w:r>
+            <w:r>
+              <w:rPr>
+                <w:noProof/>
+                <w:webHidden/>
+              </w:rPr>
+              <w:fldChar w:fldCharType="separate"/>
+            </w:r>
+            <w:r>
+              <w:rPr>
+                <w:noProof/>
+                <w:webHidden/>
+              </w:rPr>
+              <w:t>3</w:t>
+            </w:r>
+            <w:r>
+              <w:rPr>
+                <w:noProof/>
+                <w:webHidden/>
+              </w:rPr>
+              <w:fldChar w:fldCharType="end"/>
+            </w:r>
+          </w:hyperlink>
+        </w:p>
+        <w:p>
+          <w:pPr>
+            <w:pStyle w:val="TOC2"/>
+            <w:tabs>
+              <w:tab w:val="right" w:leader="dot" w:pos="9016"/>
+            </w:tabs>
+            <w:rPr>
+              <w:noProof/>
+            </w:rPr>
+          </w:pPr>
+          <w:hyperlink w:anchor="_Toc239857439" w:history="1">
+            <w:r>
+              <w:rPr>
+                <w:rStyle w:val="Hyperlink"/>
+                <w:noProof/>
+              </w:rPr>
+              <w:t>Non-Functional Requirements (NFRs):</w:t>
+            </w:r>
+            <w:r>
+              <w:rPr>
+                <w:noProof/>
+                <w:webHidden/>
+              </w:rPr>
+              <w:tab/>
+            </w:r>
+            <w:r>
+              <w:rPr>
+                <w:noProof/>
+                <w:webHidden/>
+              </w:rPr>
+              <w:fldChar w:fldCharType="begin"/>
+            </w:r>
+            <w:r>
+              <w:rPr>
+                <w:noProof/>
+                <w:webHidden/>
+              </w:rPr>
+              <w:instrText xml:space="preserve"> PAGEREF _Toc239857439 \h </w:instrText>
+            </w:r>
+            <w:r>
+              <w:rPr>
+                <w:noProof/>
+                <w:webHidden/>
+              </w:rPr>
+            </w:r>
+            <w:r>
+              <w:rPr>
+                <w:noProof/>
+                <w:webHidden/>
+              </w:rPr>
+              <w:fldChar w:fldCharType="separate"/>
+            </w:r>
+            <w:r>
+              <w:rPr>
+                <w:noProof/>
+                <w:webHidden/>
+              </w:rPr>
+              <w:t>5</w:t>
+            </w:r>
+            <w:r>
+              <w:rPr>
+                <w:noProof/>
+                <w:webHidden/>
+              </w:rPr>
+              <w:fldChar w:fldCharType="end"/>
+            </w:r>
+          </w:hyperlink>
+        </w:p>
+        <w:p>
+          <w:pPr>
+            <w:pStyle w:val="TOC2"/>
+            <w:tabs>
+              <w:tab w:val="right" w:leader="dot" w:pos="9016"/>
+            </w:tabs>
+            <w:rPr>
+              <w:noProof/>
+            </w:rPr>
+          </w:pPr>
+          <w:hyperlink w:anchor="_Toc239857440" w:history="1">
+            <w:r>
+              <w:rPr>
+                <w:rStyle w:val="Hyperlink"/>
+                <w:noProof/>
+              </w:rPr>
+              <w:t>Acceptance criteria:</w:t>
+            </w:r>
+            <w:r>
+              <w:rPr>
+                <w:noProof/>
+                <w:webHidden/>
+              </w:rPr>
+              <w:tab/>
+            </w:r>
+            <w:r>
+              <w:rPr>
+                <w:noProof/>
+                <w:webHidden/>
+              </w:rPr>
+              <w:fldChar w:fldCharType="begin"/>
+            </w:r>
+            <w:r>
+              <w:rPr>
+                <w:noProof/>
+                <w:webHidden/>
+              </w:rPr>
+              <w:instrText xml:space="preserve"> PAGEREF _Toc239857440 \h </w:instrText>
+            </w:r>
+            <w:r>
+              <w:rPr>
+                <w:noProof/>
+                <w:webHidden/>
+              </w:rPr>
+            </w:r>
+            <w:r>
+              <w:rPr>
+                <w:noProof/>
+                <w:webHidden/>
+              </w:rPr>
+              <w:fldChar w:fldCharType="separate"/>
+            </w:r>
+            <w:r>
+              <w:rPr>
+                <w:noProof/>
+                <w:webHidden/>
+              </w:rPr>
+              <w:t>8</w:t>
+            </w:r>
+            <w:r>
+              <w:rPr>
+                <w:noProof/>
+                <w:webHidden/>
+              </w:rPr>
+              <w:fldChar w:fldCharType="end"/>
+            </w:r>
+          </w:hyperlink>
+        </w:p>
+        <w:p>
+          <w:pPr>
+            <w:pStyle w:val="TOC1"/>
+            <w:tabs>
+              <w:tab w:val="right" w:leader="dot" w:pos="9016"/>
+            </w:tabs>
+            <w:rPr>
+              <w:noProof/>
+            </w:rPr>
+          </w:pPr>
+          <w:hyperlink w:anchor="_Toc239857441" w:history="1">
+            <w:r>
+              <w:rPr>
+                <w:rStyle w:val="Hyperlink"/>
+                <w:noProof/>
+              </w:rPr>
+              <w:t>Constraints</w:t>
+            </w:r>
+            <w:r>
+              <w:rPr>
+                <w:noProof/>
+                <w:webHidden/>
+              </w:rPr>
+              <w:tab/>
+            </w:r>
+            <w:r>
+              <w:rPr>
+                <w:noProof/>
+                <w:webHidden/>
+              </w:rPr>
+              <w:fldChar w:fldCharType="begin"/>
+            </w:r>
+            <w:r>
+              <w:rPr>
+                <w:noProof/>
+                <w:webHidden/>
+              </w:rPr>
+              <w:instrText xml:space="preserve"> PAGEREF _Toc239857441 \h </w:instrText>
+            </w:r>
+            <w:r>
+              <w:rPr>
+                <w:noProof/>
+                <w:webHidden/>
+              </w:rPr>
+            </w:r>
+            <w:r>
+              <w:rPr>
+                <w:noProof/>
+                <w:webHidden/>
+              </w:rPr>
+              <w:fldChar w:fldCharType="separate"/>
+            </w:r>
+            <w:r>
+              <w:rPr>
+                <w:noProof/>
+                <w:webHidden/>
+              </w:rPr>
+              <w:t>9</w:t>
+            </w:r>
+            <w:r>
+              <w:rPr>
+                <w:noProof/>
+                <w:webHidden/>
+              </w:rPr>
+              <w:fldChar w:fldCharType="end"/>
+            </w:r>
+          </w:hyperlink>
+        </w:p>
+        <w:p>
+          <w:pPr>
+            <w:pStyle w:val="TOC1"/>
+            <w:tabs>
+              <w:tab w:val="right" w:leader="dot" w:pos="9016"/>
+            </w:tabs>
+            <w:rPr>
+              <w:noProof/>
+            </w:rPr>
+          </w:pPr>
+          <w:hyperlink w:anchor="_Toc239857442" w:history="1">
+            <w:r>
+              <w:rPr>
+                <w:rStyle w:val="Hyperlink"/>
+                <w:noProof/>
+              </w:rPr>
+              <w:t>Initial RTM</w:t>
+            </w:r>
+            <w:r>
+              <w:rPr>
+                <w:noProof/>
+                <w:webHidden/>
+              </w:rPr>
+              <w:tab/>
+            </w:r>
+            <w:r>
+              <w:rPr>
+                <w:noProof/>
+                <w:webHidden/>
+              </w:rPr>
+              <w:fldChar w:fldCharType="begin"/>
+            </w:r>
+            <w:r>
+              <w:rPr>
+                <w:noProof/>
+                <w:webHidden/>
+              </w:rPr>
+              <w:instrText xml:space="preserve"> PAGEREF _Toc239857442 \h </w:instrText>
+            </w:r>
+            <w:r>
+              <w:rPr>
+                <w:noProof/>
+                <w:webHidden/>
+              </w:rPr>
+            </w:r>
+            <w:r>
+              <w:rPr>
+                <w:noProof/>
+                <w:webHidden/>
+              </w:rPr>
+              <w:fldChar w:fldCharType="separate"/>
+            </w:r>
+            <w:r>
+              <w:rPr>
+                <w:noProof/>
+                <w:webHidden/>
+              </w:rPr>
+              <w:t>9</w:t>
+            </w:r>
+            <w:r>
+              <w:rPr>
+                <w:noProof/>
+                <w:webHidden/>
+              </w:rPr>
+              <w:fldChar w:fldCharType="end"/>
+            </w:r>
+          </w:hyperlink>
+        </w:p>
+        <w:p>
+          <w:pPr>
+            <w:pStyle w:val="TOC2"/>
+            <w:tabs>
+              <w:tab w:val="right" w:leader="dot" w:pos="9016"/>
+            </w:tabs>
+            <w:rPr>
+              <w:noProof/>
+            </w:rPr>
+          </w:pPr>
+          <w:hyperlink w:anchor="_Toc239857443" w:history="1">
+            <w:r>
+              <w:rPr>
+                <w:rStyle w:val="Hyperlink"/>
+                <w:noProof/>
+              </w:rPr>
+              <w:t>Example of an end-to-end trace:</w:t>
+            </w:r>
+            <w:r>
+              <w:rPr>
+                <w:noProof/>
+                <w:webHidden/>
+              </w:rPr>
+              <w:tab/>
+            </w:r>
+            <w:r>
+              <w:rPr>
+                <w:noProof/>
+                <w:webHidden/>
+              </w:rPr>
+              <w:fldChar w:fldCharType="begin"/>
+            </w:r>
+            <w:r>
+              <w:rPr>
+                <w:noProof/>
+                <w:webHidden/>
+              </w:rPr>
+              <w:instrText xml:space="preserve"> PAGEREF _Toc239857443 \h </w:instrText>
+            </w:r>
+            <w:r>
+              <w:rPr>
+                <w:noProof/>
+                <w:webHidden/>
+              </w:rPr>
+            </w:r>
+            <w:r>
+              <w:rPr>
+                <w:noProof/>
+                <w:webHidden/>
+              </w:rPr>
+              <w:fldChar w:fldCharType="separate"/>
+            </w:r>
+            <w:r>
+              <w:rPr>
+                <w:noProof/>
+                <w:webHidden/>
+              </w:rPr>
+              <w:t>10</w:t>
+            </w:r>
+            <w:r>
+              <w:rPr>
+                <w:noProof/>
+                <w:webHidden/>
+              </w:rPr>
+              <w:fldChar w:fldCharType="end"/>
+            </w:r>
+          </w:hyperlink>
+        </w:p>
+        <w:p>
+          <w:pPr>
+            <w:pStyle w:val="TOC1"/>
+            <w:tabs>
+              <w:tab w:val="right" w:leader="dot" w:pos="9016"/>
+            </w:tabs>
+            <w:rPr>
+              <w:noProof/>
+            </w:rPr>
+          </w:pPr>
+          <w:hyperlink w:anchor="_Toc239857444" w:history="1">
+            <w:r>
+              <w:rPr>
+                <w:rStyle w:val="Hyperlink"/>
+                <w:noProof/>
+              </w:rPr>
+              <w:t>Initial risk register</w:t>
+            </w:r>
+            <w:r>
+              <w:rPr>
+                <w:noProof/>
+                <w:webHidden/>
+              </w:rPr>
+              <w:tab/>
+            </w:r>
+            <w:r>
+              <w:rPr>
+                <w:noProof/>
+                <w:webHidden/>
+              </w:rPr>
+              <w:fldChar w:fldCharType="begin"/>
+            </w:r>
+            <w:r>
+              <w:rPr>
+                <w:noProof/>
+                <w:webHidden/>
+              </w:rPr>
+              <w:instrText xml:space="preserve"> PAGEREF _Toc239857444 \h </w:instrText>
+            </w:r>
+            <w:r>
+              <w:rPr>
+                <w:noProof/>
+                <w:webHidden/>
+              </w:rPr>
+            </w:r>
+            <w:r>
+              <w:rPr>
+                <w:noProof/>
+                <w:webHidden/>
+              </w:rPr>
+              <w:fldChar w:fldCharType="separate"/>
+            </w:r>
+            <w:r>
+              <w:rPr>
+                <w:noProof/>
+                <w:webHidden/>
+              </w:rPr>
+              <w:t>11</w:t>
+            </w:r>
+            <w:r>
+              <w:rPr>
+                <w:noProof/>
+                <w:webHidden/>
+              </w:rPr>
+              <w:fldChar w:fldCharType="end"/>
+            </w:r>
+          </w:hyperlink>
+        </w:p>
+        <w:p>
+          <w:pPr>
+            <w:pStyle w:val="TOC1"/>
+            <w:tabs>
+              <w:tab w:val="right" w:leader="dot" w:pos="9016"/>
+            </w:tabs>
+            <w:rPr>
+              <w:noProof/>
+            </w:rPr>
+          </w:pPr>
+          <w:hyperlink w:anchor="_Toc239857445" w:history="1">
+            <w:r>
+              <w:rPr>
+                <w:rStyle w:val="Hyperlink"/>
+                <w:noProof/>
+              </w:rPr>
+              <w:t>Forward engineering Considerations</w:t>
+            </w:r>
+            <w:r>
+              <w:rPr>
+                <w:noProof/>
+                <w:webHidden/>
+              </w:rPr>
+              <w:tab/>
+            </w:r>
+            <w:r>
+              <w:rPr>
+                <w:noProof/>
+                <w:webHidden/>
+              </w:rPr>
+              <w:fldChar w:fldCharType="begin"/>
+            </w:r>
+            <w:r>
+              <w:rPr>
+                <w:noProof/>
+                <w:webHidden/>
+              </w:rPr>
+              <w:instrText xml:space="preserve"> PAGEREF _Toc239857445 \h </w:instrText>
+            </w:r>
+            <w:r>
+              <w:rPr>
+                <w:noProof/>
+                <w:webHidden/>
+              </w:rPr>
+            </w:r>
+            <w:r>
+              <w:rPr>
+                <w:noProof/>
+                <w:webHidden/>
+              </w:rPr>
+              <w:fldChar w:fldCharType="separate"/>
+            </w:r>
+            <w:r>
+              <w:rPr>
+                <w:noProof/>
+                <w:webHidden/>
+              </w:rPr>
+              <w:t>11</w:t>
+            </w:r>
+            <w:r>
+              <w:rPr>
+                <w:noProof/>
+                <w:webHidden/>
+              </w:rPr>
+              <w:fldChar w:fldCharType="end"/>
+            </w:r>
+          </w:hyperlink>
+        </w:p>
+        <w:p>
+          <w:pPr>
+            <w:pStyle w:val="TOC1"/>
+            <w:tabs>
+              <w:tab w:val="right" w:leader="dot" w:pos="9016"/>
+            </w:tabs>
+            <w:rPr>
+              <w:noProof/>
+            </w:rPr>
+          </w:pPr>
+          <w:hyperlink w:anchor="_Toc239857446" w:history="1">
+            <w:r>
+              <w:rPr>
+                <w:rStyle w:val="Hyperlink"/>
+                <w:noProof/>
+              </w:rPr>
+              <w:t>Engineering decision log</w:t>
+            </w:r>
+            <w:r>
+              <w:rPr>
+                <w:noProof/>
+                <w:webHidden/>
+              </w:rPr>
+              <w:tab/>
+            </w:r>
+            <w:r>
+              <w:rPr>
+                <w:noProof/>
+                <w:webHidden/>
+              </w:rPr>
+              <w:fldChar w:fldCharType="begin"/>
+            </w:r>
+            <w:r>
+              <w:rPr>
+                <w:noProof/>
+                <w:webHidden/>
+              </w:rPr>
+              <w:instrText xml:space="preserve"> PAGEREF _Toc239857446 \h </w:instrText>
+            </w:r>
+            <w:r>
+              <w:rPr>
+                <w:noProof/>
+                <w:webHidden/>
+              </w:rPr>
+            </w:r>
+            <w:r>
+              <w:rPr>
+                <w:noProof/>
+                <w:webHidden/>
+              </w:rPr>
+              <w:fldChar w:fldCharType="separate"/>
+            </w:r>
+            <w:r>
+              <w:rPr>
+                <w:noProof/>
+                <w:webHidden/>
+              </w:rPr>
+              <w:t>11</w:t>
+            </w:r>
+            <w:r>
+              <w:rPr>
+                <w:noProof/>
+                <w:webHidden/>
+              </w:rPr>
+              <w:fldChar w:fldCharType="end"/>
+            </w:r>
+          </w:hyperlink>
+        </w:p>
+        <w:p>
+          <w:pPr>
+            <w:pStyle w:val="TOC1"/>
+            <w:tabs>
+              <w:tab w:val="right" w:leader="dot" w:pos="9016"/>
+            </w:tabs>
+            <w:rPr>
+              <w:noProof/>
+            </w:rPr>
+          </w:pPr>
+          <w:hyperlink w:anchor="_Toc239857447" w:history="1">
+            <w:r>
+              <w:rPr>
+                <w:rStyle w:val="Hyperlink"/>
+                <w:noProof/>
+              </w:rPr>
+              <w:t>AI usage Register</w:t>
+            </w:r>
+            <w:r>
+              <w:rPr>
+                <w:noProof/>
+                <w:webHidden/>
+              </w:rPr>
+              <w:tab/>
+            </w:r>
+            <w:r>
+              <w:rPr>
+                <w:noProof/>
+                <w:webHidden/>
+              </w:rPr>
+              <w:fldChar w:fldCharType="begin"/>
+            </w:r>
+            <w:r>
+              <w:rPr>
+                <w:noProof/>
+                <w:webHidden/>
+              </w:rPr>
+              <w:instrText xml:space="preserve"> PAGEREF _Toc239857447 \h </w:instrText>
+            </w:r>
+            <w:r>
+              <w:rPr>
+                <w:noProof/>
+                <w:webHidden/>
+              </w:rPr>
+            </w:r>
+            <w:r>
+              <w:rPr>
+                <w:noProof/>
+                <w:webHidden/>
+              </w:rPr>
+              <w:fldChar w:fldCharType="separate"/>
+            </w:r>
+            <w:r>
+              <w:rPr>
+                <w:noProof/>
+                <w:webHidden/>
+              </w:rPr>
+              <w:t>11</w:t>
+            </w:r>
+            <w:r>
+              <w:rPr>
+                <w:noProof/>
+                <w:webHidden/>
+              </w:rPr>
+              <w:fldChar w:fldCharType="end"/>
+            </w:r>
+          </w:hyperlink>
+        </w:p>
+        <w:p>
+          <w:pPr>
+            <w:pStyle w:val="TOC1"/>
+            <w:tabs>
+              <w:tab w:val="right" w:leader="dot" w:pos="9016"/>
+            </w:tabs>
+            <w:rPr>
+              <w:noProof/>
+            </w:rPr>
+          </w:pPr>
+          <w:hyperlink w:anchor="_Toc239857448" w:history="1">
+            <w:r>
+              <w:rPr>
+                <w:rStyle w:val="Hyperlink"/>
+                <w:noProof/>
+              </w:rPr>
+              <w:t>Sign off</w:t>
+            </w:r>
+            <w:r>
+              <w:rPr>
+                <w:noProof/>
+                <w:webHidden/>
+              </w:rPr>
+              <w:tab/>
+            </w:r>
+            <w:r>
+              <w:rPr>
+                <w:noProof/>
+                <w:webHidden/>
+              </w:rPr>
+              <w:fldChar w:fldCharType="begin"/>
+            </w:r>
+            <w:r>
+              <w:rPr>
+                <w:noProof/>
+                <w:webHidden/>
+              </w:rPr>
+              <w:instrText xml:space="preserve"> PAGEREF _Toc239857448 \h </w:instrText>
+            </w:r>
+            <w:r>
+              <w:rPr>
+                <w:noProof/>
+                <w:webHidden/>
+              </w:rPr>
+            </w:r>
+            <w:r>
+              <w:rPr>
+                <w:noProof/>
+                <w:webHidden/>
+              </w:rPr>
+              <w:fldChar w:fldCharType="separate"/>
+            </w:r>
+            <w:r>
+              <w:rPr>
+                <w:noProof/>
+                <w:webHidden/>
+              </w:rPr>
+              <w:t>11</w:t>
+            </w:r>
+            <w:r>
+              <w:rPr>
+                <w:noProof/>
+                <w:webHidden/>
+              </w:rPr>
+              <w:fldChar w:fldCharType="end"/>
+            </w:r>
+          </w:hyperlink>
+        </w:p>
+        <w:p>
+          <w:r>
+            <w:rPr>
+              <w:b/>
+              <w:bCs/>
+              <w:noProof/>
+              <w:lang w:val="en-US"/>
+            </w:rPr>
+            <w:fldChar w:fldCharType="end"/>
+          </w:r>
         </w:p>
       </w:sdtContent>
     </w:sdt>
@@ -739,45 +1754,58 @@
       <w:pPr>
         <w:pStyle w:val="Heading1"/>
       </w:pPr>
+      <w:bookmarkStart w:id="0" w:name="_Toc239857434"/>
       <w:r>
         <w:lastRenderedPageBreak/>
         <w:t>Problem &amp; business need</w:t>
+      </w:r>
+      <w:bookmarkEnd w:id="0"/>
+    </w:p>
+    <w:p>
+      <w:pPr>
+        <w:pStyle w:val="Heading1"/>
+      </w:pPr>
+      <w:bookmarkStart w:id="1" w:name="_Toc239857435"/>
+      <w:r>
+        <w:t>Stakeholder analysis</w:t>
+      </w:r>
+      <w:bookmarkEnd w:id="1"/>
+      <w:r>
+        <w:t xml:space="preserve"> </w:t>
       </w:r>
     </w:p>
     <w:p>
       <w:pPr>
         <w:pStyle w:val="Heading1"/>
       </w:pPr>
+      <w:bookmarkStart w:id="2" w:name="_Toc239857436"/>
       <w:r>
-        <w:t xml:space="preserve">Stakeholder analysis </w:t>
+        <w:t>Scope baseline</w:t>
       </w:r>
+      <w:bookmarkEnd w:id="2"/>
     </w:p>
     <w:p>
       <w:pPr>
         <w:pStyle w:val="Heading1"/>
       </w:pPr>
-      <w:r>
-        <w:t>Scope baseline</w:t>
-      </w:r>
-    </w:p>
-    <w:p>
-      <w:pPr>
-        <w:pStyle w:val="Heading1"/>
-      </w:pPr>
+      <w:bookmarkStart w:id="3" w:name="_Toc239857437"/>
       <w:r>
         <w:t>Requirements &amp; acceptance criteria</w:t>
       </w:r>
+      <w:bookmarkEnd w:id="3"/>
     </w:p>
     <w:p>
       <w:pPr>
         <w:pStyle w:val="Heading2"/>
       </w:pPr>
+      <w:bookmarkStart w:id="4" w:name="_Toc239857438"/>
       <w:r>
         <w:t>Functional</w:t>
       </w:r>
       <w:r>
         <w:t xml:space="preserve"> Requirements (FRs)</w:t>
       </w:r>
+      <w:bookmarkEnd w:id="4"/>
     </w:p>
     <w:p>
       <w:r>
@@ -1822,8 +2850,13 @@
             <w:pPr>
               <w:cnfStyle w:val="000000100000" w:firstRow="0" w:lastRow="0" w:firstColumn="0" w:lastColumn="0" w:oddVBand="0" w:evenVBand="0" w:oddHBand="1" w:evenHBand="0" w:firstRowFirstColumn="0" w:firstRowLastColumn="0" w:lastRowFirstColumn="0" w:lastRowLastColumn="0"/>
             </w:pPr>
-            <w:r>
-              <w:t>In order to facilitate accountability and service-performance analysis, the system should give managers sufficient request-level and aggregated data.</w:t>
+            <w:proofErr w:type="gramStart"/>
+            <w:r>
+              <w:t>In order to</w:t>
+            </w:r>
+            <w:proofErr w:type="gramEnd"/>
+            <w:r>
+              <w:t xml:space="preserve"> facilitate accountability and service-performance analysis, the system should give managers sufficient request-level and aggregated data.</w:t>
             </w:r>
           </w:p>
         </w:tc>
@@ -1860,9 +2893,11 @@
       <w:pPr>
         <w:pStyle w:val="Heading2"/>
       </w:pPr>
+      <w:bookmarkStart w:id="5" w:name="_Toc239857439"/>
       <w:r>
         <w:t>Non-Functional Requirements (NFRs):</w:t>
       </w:r>
+      <w:bookmarkEnd w:id="5"/>
     </w:p>
     <w:p>
       <w:r>
@@ -2605,9 +3640,11 @@
       <w:pPr>
         <w:pStyle w:val="Heading2"/>
       </w:pPr>
+      <w:bookmarkStart w:id="6" w:name="_Toc239857440"/>
       <w:r>
         <w:t>Acceptance criteria:</w:t>
       </w:r>
+      <w:bookmarkEnd w:id="6"/>
     </w:p>
     <w:tbl>
       <w:tblPr>
@@ -3356,6 +4393,12 @@
             <w:r>
               <w:t>reshold and test conditions are recorded.</w:t>
             </w:r>
+            <w:r>
+              <w:rPr>
+                <w:rStyle w:val="FootnoteReference"/>
+              </w:rPr>
+              <w:footnoteReference w:id="2"/>
+            </w:r>
           </w:p>
         </w:tc>
       </w:tr>
@@ -3569,17 +4612,21 @@
       <w:pPr>
         <w:pStyle w:val="Heading1"/>
       </w:pPr>
+      <w:bookmarkStart w:id="7" w:name="_Toc239857441"/>
       <w:r>
         <w:t>Constraints</w:t>
       </w:r>
+      <w:bookmarkEnd w:id="7"/>
     </w:p>
     <w:p>
       <w:pPr>
         <w:pStyle w:val="Heading1"/>
       </w:pPr>
+      <w:bookmarkStart w:id="8" w:name="_Toc239857442"/>
       <w:r>
         <w:t>Initial RTM</w:t>
       </w:r>
+      <w:bookmarkEnd w:id="8"/>
     </w:p>
     <w:tbl>
       <w:tblPr>
@@ -3771,6 +4818,7 @@
           </w:tcPr>
           <w:p>
             <w:r>
+              <w:lastRenderedPageBreak/>
               <w:t>Requester</w:t>
             </w:r>
           </w:p>
@@ -3852,7 +4900,6 @@
           </w:tcPr>
           <w:p>
             <w:r>
-              <w:lastRenderedPageBreak/>
               <w:t>Requester</w:t>
             </w:r>
           </w:p>
@@ -5192,12 +6239,14 @@
       <w:pPr>
         <w:pStyle w:val="Heading2"/>
       </w:pPr>
+      <w:bookmarkStart w:id="9" w:name="_Toc239857443"/>
       <w:r>
         <w:t>Example of an end-to-end trace</w:t>
       </w:r>
       <w:r>
         <w:t>:</w:t>
       </w:r>
+      <w:bookmarkEnd w:id="9"/>
     </w:p>
     <w:p>
       <w:r>
@@ -5285,6 +6334,7 @@
         </w:numPr>
       </w:pPr>
       <w:r>
+        <w:lastRenderedPageBreak/>
         <w:t xml:space="preserve">Acceptance criteria: “Submitted” is the first </w:t>
       </w:r>
       <w:r>
@@ -5306,7 +6356,6 @@
         </w:numPr>
       </w:pPr>
       <w:r>
-        <w:lastRenderedPageBreak/>
         <w:t xml:space="preserve">Current M1 evidence: FR-001 is linked in the RTM </w:t>
       </w:r>
       <w:r>
@@ -5338,41 +6387,893 @@
       <w:pPr>
         <w:pStyle w:val="Heading1"/>
       </w:pPr>
+      <w:bookmarkStart w:id="10" w:name="_Toc239857444"/>
       <w:r>
         <w:t>Initial risk register</w:t>
       </w:r>
+      <w:bookmarkEnd w:id="10"/>
     </w:p>
     <w:p>
       <w:pPr>
         <w:pStyle w:val="Heading1"/>
       </w:pPr>
+      <w:bookmarkStart w:id="11" w:name="_Toc239857445"/>
       <w:r>
         <w:t>Forward engineering Considerations</w:t>
       </w:r>
+      <w:bookmarkEnd w:id="11"/>
     </w:p>
     <w:p>
       <w:pPr>
         <w:pStyle w:val="Heading1"/>
       </w:pPr>
+      <w:bookmarkStart w:id="12" w:name="_Toc239857446"/>
       <w:r>
         <w:t>Engineering decision log</w:t>
       </w:r>
+      <w:bookmarkEnd w:id="12"/>
     </w:p>
+    <w:tbl>
+      <w:tblPr>
+        <w:tblStyle w:val="GridTable2"/>
+        <w:tblW w:w="0" w:type="auto"/>
+        <w:tblLook w:val="04A0" w:firstRow="1" w:lastRow="0" w:firstColumn="1" w:lastColumn="0" w:noHBand="0" w:noVBand="1"/>
+      </w:tblPr>
+      <w:tblGrid>
+        <w:gridCol w:w="2127"/>
+        <w:gridCol w:w="6889"/>
+      </w:tblGrid>
+      <w:tr>
+        <w:trPr>
+          <w:cnfStyle w:val="100000000000" w:firstRow="1" w:lastRow="0" w:firstColumn="0" w:lastColumn="0" w:oddVBand="0" w:evenVBand="0" w:oddHBand="0" w:evenHBand="0" w:firstRowFirstColumn="0" w:firstRowLastColumn="0" w:lastRowFirstColumn="0" w:lastRowLastColumn="0"/>
+        </w:trPr>
+        <w:tc>
+          <w:tcPr>
+            <w:cnfStyle w:val="001000000000" w:firstRow="0" w:lastRow="0" w:firstColumn="1" w:lastColumn="0" w:oddVBand="0" w:evenVBand="0" w:oddHBand="0" w:evenHBand="0" w:firstRowFirstColumn="0" w:firstRowLastColumn="0" w:lastRowFirstColumn="0" w:lastRowLastColumn="0"/>
+            <w:tcW w:w="2127" w:type="dxa"/>
+          </w:tcPr>
+          <w:p>
+            <w:pPr>
+              <w:rPr>
+                <w:b w:val="0"/>
+                <w:bCs w:val="0"/>
+              </w:rPr>
+            </w:pPr>
+            <w:bookmarkStart w:id="13" w:name="_Toc239857447"/>
+            <w:r>
+              <w:rPr>
+                <w:b w:val="0"/>
+                <w:bCs w:val="0"/>
+              </w:rPr>
+              <w:t>ID</w:t>
+            </w:r>
+          </w:p>
+        </w:tc>
+        <w:tc>
+          <w:tcPr>
+            <w:tcW w:w="6889" w:type="dxa"/>
+          </w:tcPr>
+          <w:p>
+            <w:pPr>
+              <w:cnfStyle w:val="100000000000" w:firstRow="1" w:lastRow="0" w:firstColumn="0" w:lastColumn="0" w:oddVBand="0" w:evenVBand="0" w:oddHBand="0" w:evenHBand="0" w:firstRowFirstColumn="0" w:firstRowLastColumn="0" w:lastRowFirstColumn="0" w:lastRowLastColumn="0"/>
+            </w:pPr>
+            <w:r>
+              <w:t>DEC-001</w:t>
+            </w:r>
+          </w:p>
+        </w:tc>
+      </w:tr>
+      <w:tr>
+        <w:trPr>
+          <w:cnfStyle w:val="000000100000" w:firstRow="0" w:lastRow="0" w:firstColumn="0" w:lastColumn="0" w:oddVBand="0" w:evenVBand="0" w:oddHBand="1" w:evenHBand="0" w:firstRowFirstColumn="0" w:firstRowLastColumn="0" w:lastRowFirstColumn="0" w:lastRowLastColumn="0"/>
+        </w:trPr>
+        <w:tc>
+          <w:tcPr>
+            <w:cnfStyle w:val="001000000000" w:firstRow="0" w:lastRow="0" w:firstColumn="1" w:lastColumn="0" w:oddVBand="0" w:evenVBand="0" w:oddHBand="0" w:evenHBand="0" w:firstRowFirstColumn="0" w:firstRowLastColumn="0" w:lastRowFirstColumn="0" w:lastRowLastColumn="0"/>
+            <w:tcW w:w="2127" w:type="dxa"/>
+          </w:tcPr>
+          <w:p>
+            <w:pPr>
+              <w:rPr>
+                <w:b w:val="0"/>
+                <w:bCs w:val="0"/>
+              </w:rPr>
+            </w:pPr>
+            <w:r>
+              <w:rPr>
+                <w:b w:val="0"/>
+                <w:bCs w:val="0"/>
+              </w:rPr>
+              <w:t>Context</w:t>
+            </w:r>
+          </w:p>
+        </w:tc>
+        <w:tc>
+          <w:tcPr>
+            <w:tcW w:w="6889" w:type="dxa"/>
+          </w:tcPr>
+          <w:p>
+            <w:pPr>
+              <w:cnfStyle w:val="000000100000" w:firstRow="0" w:lastRow="0" w:firstColumn="0" w:lastColumn="0" w:oddVBand="0" w:evenVBand="0" w:oddHBand="1" w:evenHBand="0" w:firstRowFirstColumn="0" w:firstRowLastColumn="0" w:lastRowFirstColumn="0" w:lastRowLastColumn="0"/>
+            </w:pPr>
+            <w:r>
+              <w:t xml:space="preserve">A quantifiable criterion was required for NFR-002, although the precise figure depends on hosting and infrastructure decisions that have not yet been decided (out of scope for M1). </w:t>
+            </w:r>
+          </w:p>
+        </w:tc>
+      </w:tr>
+      <w:tr>
+        <w:tc>
+          <w:tcPr>
+            <w:cnfStyle w:val="001000000000" w:firstRow="0" w:lastRow="0" w:firstColumn="1" w:lastColumn="0" w:oddVBand="0" w:evenVBand="0" w:oddHBand="0" w:evenHBand="0" w:firstRowFirstColumn="0" w:firstRowLastColumn="0" w:lastRowFirstColumn="0" w:lastRowLastColumn="0"/>
+            <w:tcW w:w="2127" w:type="dxa"/>
+          </w:tcPr>
+          <w:p>
+            <w:pPr>
+              <w:rPr>
+                <w:b w:val="0"/>
+                <w:bCs w:val="0"/>
+              </w:rPr>
+            </w:pPr>
+            <w:r>
+              <w:rPr>
+                <w:b w:val="0"/>
+                <w:bCs w:val="0"/>
+              </w:rPr>
+              <w:t>Constraints</w:t>
+            </w:r>
+          </w:p>
+        </w:tc>
+        <w:tc>
+          <w:tcPr>
+            <w:tcW w:w="6889" w:type="dxa"/>
+          </w:tcPr>
+          <w:p>
+            <w:pPr>
+              <w:cnfStyle w:val="000000000000" w:firstRow="0" w:lastRow="0" w:firstColumn="0" w:lastColumn="0" w:oddVBand="0" w:evenVBand="0" w:oddHBand="0" w:evenHBand="0" w:firstRowFirstColumn="0" w:firstRowLastColumn="0" w:lastRowFirstColumn="0" w:lastRowLastColumn="0"/>
+            </w:pPr>
+            <w:r>
+              <w:t xml:space="preserve">Technology-stack or architecture decisions are </w:t>
+            </w:r>
+            <w:r>
+              <w:t>expressly</w:t>
+            </w:r>
+            <w:r>
+              <w:t xml:space="preserve"> prohibited under M1, </w:t>
+            </w:r>
+            <w:r>
+              <w:t>although section 15 in the Mile</w:t>
+            </w:r>
+            <w:r>
+              <w:t>stone 1 document mandates that NFRs eventually be quantifiable and supported by evidence.</w:t>
+            </w:r>
+          </w:p>
+        </w:tc>
+      </w:tr>
+      <w:tr>
+        <w:trPr>
+          <w:cnfStyle w:val="000000100000" w:firstRow="0" w:lastRow="0" w:firstColumn="0" w:lastColumn="0" w:oddVBand="0" w:evenVBand="0" w:oddHBand="1" w:evenHBand="0" w:firstRowFirstColumn="0" w:firstRowLastColumn="0" w:lastRowFirstColumn="0" w:lastRowLastColumn="0"/>
+        </w:trPr>
+        <w:tc>
+          <w:tcPr>
+            <w:cnfStyle w:val="001000000000" w:firstRow="0" w:lastRow="0" w:firstColumn="1" w:lastColumn="0" w:oddVBand="0" w:evenVBand="0" w:oddHBand="0" w:evenHBand="0" w:firstRowFirstColumn="0" w:firstRowLastColumn="0" w:lastRowFirstColumn="0" w:lastRowLastColumn="0"/>
+            <w:tcW w:w="2127" w:type="dxa"/>
+          </w:tcPr>
+          <w:p>
+            <w:pPr>
+              <w:rPr>
+                <w:b w:val="0"/>
+                <w:bCs w:val="0"/>
+              </w:rPr>
+            </w:pPr>
+            <w:r>
+              <w:rPr>
+                <w:b w:val="0"/>
+                <w:bCs w:val="0"/>
+              </w:rPr>
+              <w:t>Alternatives</w:t>
+            </w:r>
+          </w:p>
+        </w:tc>
+        <w:tc>
+          <w:tcPr>
+            <w:tcW w:w="6889" w:type="dxa"/>
+          </w:tcPr>
+          <w:p>
+            <w:pPr>
+              <w:pStyle w:val="ListParagraph"/>
+              <w:numPr>
+                <w:ilvl w:val="0"/>
+                <w:numId w:val="2"/>
+              </w:numPr>
+              <w:cnfStyle w:val="000000100000" w:firstRow="0" w:lastRow="0" w:firstColumn="0" w:lastColumn="0" w:oddVBand="0" w:evenVBand="0" w:oddHBand="1" w:evenHBand="0" w:firstRowFirstColumn="0" w:firstRowLastColumn="0" w:lastRowFirstColumn="0" w:lastRowLastColumn="0"/>
+            </w:pPr>
+            <w:r>
+              <w:t>Select a random number at this point of the project.</w:t>
+            </w:r>
+          </w:p>
+          <w:p>
+            <w:pPr>
+              <w:pStyle w:val="ListParagraph"/>
+              <w:numPr>
+                <w:ilvl w:val="0"/>
+                <w:numId w:val="2"/>
+              </w:numPr>
+              <w:cnfStyle w:val="000000100000" w:firstRow="0" w:lastRow="0" w:firstColumn="0" w:lastColumn="0" w:oddVBand="0" w:evenVBand="0" w:oddHBand="1" w:evenHBand="0" w:firstRowFirstColumn="0" w:firstRowLastColumn="0" w:lastRowFirstColumn="0" w:lastRowLastColumn="0"/>
+            </w:pPr>
+            <w:r>
+              <w:t>Wait until M2 to measure the NFR.</w:t>
+            </w:r>
+          </w:p>
+          <w:p>
+            <w:pPr>
+              <w:pStyle w:val="ListParagraph"/>
+              <w:numPr>
+                <w:ilvl w:val="0"/>
+                <w:numId w:val="2"/>
+              </w:numPr>
+              <w:cnfStyle w:val="000000100000" w:firstRow="0" w:lastRow="0" w:firstColumn="0" w:lastColumn="0" w:oddVBand="0" w:evenVBand="0" w:oddHBand="1" w:evenHBand="0" w:firstRowFirstColumn="0" w:firstRowLastColumn="0" w:lastRowFirstColumn="0" w:lastRowLastColumn="0"/>
+            </w:pPr>
+            <w:r>
+              <w:t xml:space="preserve">Establish a temporary placeholder threshold </w:t>
+            </w:r>
+            <w:r>
+              <w:t>with a clear label.</w:t>
+            </w:r>
+          </w:p>
+        </w:tc>
+      </w:tr>
+      <w:tr>
+        <w:tc>
+          <w:tcPr>
+            <w:cnfStyle w:val="001000000000" w:firstRow="0" w:lastRow="0" w:firstColumn="1" w:lastColumn="0" w:oddVBand="0" w:evenVBand="0" w:oddHBand="0" w:evenHBand="0" w:firstRowFirstColumn="0" w:firstRowLastColumn="0" w:lastRowFirstColumn="0" w:lastRowLastColumn="0"/>
+            <w:tcW w:w="2127" w:type="dxa"/>
+          </w:tcPr>
+          <w:p>
+            <w:pPr>
+              <w:rPr>
+                <w:b w:val="0"/>
+                <w:bCs w:val="0"/>
+              </w:rPr>
+            </w:pPr>
+            <w:r>
+              <w:rPr>
+                <w:b w:val="0"/>
+                <w:bCs w:val="0"/>
+              </w:rPr>
+              <w:t>Decision</w:t>
+            </w:r>
+          </w:p>
+        </w:tc>
+        <w:tc>
+          <w:tcPr>
+            <w:tcW w:w="6889" w:type="dxa"/>
+          </w:tcPr>
+          <w:p>
+            <w:pPr>
+              <w:cnfStyle w:val="000000000000" w:firstRow="0" w:lastRow="0" w:firstColumn="0" w:lastColumn="0" w:oddVBand="0" w:evenVBand="0" w:oddHBand="0" w:evenHBand="0" w:firstRowFirstColumn="0" w:firstRowLastColumn="0" w:lastRowFirstColumn="0" w:lastRowLastColumn="0"/>
+            </w:pPr>
+            <w:r>
+              <w:t>Instead of leaving it unmeasurable, set a temporary placeh</w:t>
+            </w:r>
+            <w:r>
+              <w:t>older (&lt;= 2 seconds for up to 200 requests), clearly marked as subject to adjustment once hosting/architecture is selected.</w:t>
+            </w:r>
+          </w:p>
+        </w:tc>
+      </w:tr>
+      <w:tr>
+        <w:trPr>
+          <w:cnfStyle w:val="000000100000" w:firstRow="0" w:lastRow="0" w:firstColumn="0" w:lastColumn="0" w:oddVBand="0" w:evenVBand="0" w:oddHBand="1" w:evenHBand="0" w:firstRowFirstColumn="0" w:firstRowLastColumn="0" w:lastRowFirstColumn="0" w:lastRowLastColumn="0"/>
+        </w:trPr>
+        <w:tc>
+          <w:tcPr>
+            <w:cnfStyle w:val="001000000000" w:firstRow="0" w:lastRow="0" w:firstColumn="1" w:lastColumn="0" w:oddVBand="0" w:evenVBand="0" w:oddHBand="0" w:evenHBand="0" w:firstRowFirstColumn="0" w:firstRowLastColumn="0" w:lastRowFirstColumn="0" w:lastRowLastColumn="0"/>
+            <w:tcW w:w="2127" w:type="dxa"/>
+          </w:tcPr>
+          <w:p>
+            <w:pPr>
+              <w:rPr>
+                <w:b w:val="0"/>
+                <w:bCs w:val="0"/>
+              </w:rPr>
+            </w:pPr>
+            <w:r>
+              <w:rPr>
+                <w:b w:val="0"/>
+                <w:bCs w:val="0"/>
+              </w:rPr>
+              <w:t>Rational</w:t>
+            </w:r>
+          </w:p>
+        </w:tc>
+        <w:tc>
+          <w:tcPr>
+            <w:tcW w:w="6889" w:type="dxa"/>
+          </w:tcPr>
+          <w:p>
+            <w:pPr>
+              <w:cnfStyle w:val="000000100000" w:firstRow="0" w:lastRow="0" w:firstColumn="0" w:lastColumn="0" w:oddVBand="0" w:evenVBand="0" w:oddHBand="1" w:evenHBand="0" w:firstRowFirstColumn="0" w:firstRowLastColumn="0" w:lastRowFirstColumn="0" w:lastRowLastColumn="0"/>
+            </w:pPr>
+            <w:r>
+              <w:t xml:space="preserve">A marked </w:t>
+            </w:r>
+            <w:r>
+              <w:t>placeholder</w:t>
+            </w:r>
+            <w:r>
+              <w:t xml:space="preserve"> maintains testability while truthfully indicating the number </w:t>
+            </w:r>
+            <w:r>
+              <w:t xml:space="preserve">is </w:t>
+            </w:r>
+            <w:r>
+              <w:t>not final</w:t>
+            </w:r>
+            <w:r>
+              <w:t>, an NFR with zero measurable target</w:t>
+            </w:r>
+            <w:r>
+              <w:t>s is not testable at all.</w:t>
+            </w:r>
+          </w:p>
+        </w:tc>
+      </w:tr>
+      <w:tr>
+        <w:tc>
+          <w:tcPr>
+            <w:cnfStyle w:val="001000000000" w:firstRow="0" w:lastRow="0" w:firstColumn="1" w:lastColumn="0" w:oddVBand="0" w:evenVBand="0" w:oddHBand="0" w:evenHBand="0" w:firstRowFirstColumn="0" w:firstRowLastColumn="0" w:lastRowFirstColumn="0" w:lastRowLastColumn="0"/>
+            <w:tcW w:w="2127" w:type="dxa"/>
+          </w:tcPr>
+          <w:p>
+            <w:pPr>
+              <w:rPr>
+                <w:b w:val="0"/>
+                <w:bCs w:val="0"/>
+              </w:rPr>
+            </w:pPr>
+            <w:r>
+              <w:rPr>
+                <w:b w:val="0"/>
+                <w:bCs w:val="0"/>
+              </w:rPr>
+              <w:t>Trade-offs</w:t>
+            </w:r>
+          </w:p>
+        </w:tc>
+        <w:tc>
+          <w:tcPr>
+            <w:tcW w:w="6889" w:type="dxa"/>
+          </w:tcPr>
+          <w:p>
+            <w:pPr>
+              <w:cnfStyle w:val="000000000000" w:firstRow="0" w:lastRow="0" w:firstColumn="0" w:lastColumn="0" w:oddVBand="0" w:evenVBand="0" w:oddHBand="0" w:evenHBand="0" w:firstRowFirstColumn="0" w:firstRowLastColumn="0" w:lastRowFirstColumn="0" w:lastRowLastColumn="0"/>
+            </w:pPr>
+            <w:r>
+              <w:t>Be</w:t>
+            </w:r>
+            <w:r>
+              <w:t>nefit: The NFR is still used in the RTM and defence at the time.</w:t>
+            </w:r>
+          </w:p>
+          <w:p>
+            <w:pPr>
+              <w:cnfStyle w:val="000000000000" w:firstRow="0" w:lastRow="0" w:firstColumn="0" w:lastColumn="0" w:oddVBand="0" w:evenVBand="0" w:oddHBand="0" w:evenHBand="0" w:firstRowFirstColumn="0" w:firstRowLastColumn="0" w:lastRowFirstColumn="0" w:lastRowLastColumn="0"/>
+            </w:pPr>
+            <w:r>
+              <w:t>Risk: The</w:t>
+            </w:r>
+            <w:r>
+              <w:t>re is a chance that the placeholder number will be mistakenly regarded as final if it in not reviewed.</w:t>
+            </w:r>
+          </w:p>
+        </w:tc>
+      </w:tr>
+      <w:tr>
+        <w:trPr>
+          <w:cnfStyle w:val="000000100000" w:firstRow="0" w:lastRow="0" w:firstColumn="0" w:lastColumn="0" w:oddVBand="0" w:evenVBand="0" w:oddHBand="1" w:evenHBand="0" w:firstRowFirstColumn="0" w:firstRowLastColumn="0" w:lastRowFirstColumn="0" w:lastRowLastColumn="0"/>
+        </w:trPr>
+        <w:tc>
+          <w:tcPr>
+            <w:cnfStyle w:val="001000000000" w:firstRow="0" w:lastRow="0" w:firstColumn="1" w:lastColumn="0" w:oddVBand="0" w:evenVBand="0" w:oddHBand="0" w:evenHBand="0" w:firstRowFirstColumn="0" w:firstRowLastColumn="0" w:lastRowFirstColumn="0" w:lastRowLastColumn="0"/>
+            <w:tcW w:w="2127" w:type="dxa"/>
+          </w:tcPr>
+          <w:p>
+            <w:pPr>
+              <w:rPr>
+                <w:b w:val="0"/>
+                <w:bCs w:val="0"/>
+              </w:rPr>
+            </w:pPr>
+            <w:r>
+              <w:rPr>
+                <w:b w:val="0"/>
+                <w:bCs w:val="0"/>
+              </w:rPr>
+              <w:t>Risks</w:t>
+            </w:r>
+          </w:p>
+        </w:tc>
+        <w:tc>
+          <w:tcPr>
+            <w:tcW w:w="6889" w:type="dxa"/>
+          </w:tcPr>
+          <w:p>
+            <w:pPr>
+              <w:cnfStyle w:val="000000100000" w:firstRow="0" w:lastRow="0" w:firstColumn="0" w:lastColumn="0" w:oddVBand="0" w:evenVBand="0" w:oddHBand="1" w:evenHBand="0" w:firstRowFirstColumn="0" w:firstRowLastColumn="0" w:lastRowFirstColumn="0" w:lastRowLastColumn="0"/>
+            </w:pPr>
+            <w:r>
+              <w:t xml:space="preserve">The acceptance criteria may become untestable against the actual environment </w:t>
+            </w:r>
+            <w:r>
+              <w:t>if the team neglects to check the figure after deciding on the M2 architecture and hosting.</w:t>
+            </w:r>
+          </w:p>
+        </w:tc>
+      </w:tr>
+      <w:tr>
+        <w:tc>
+          <w:tcPr>
+            <w:cnfStyle w:val="001000000000" w:firstRow="0" w:lastRow="0" w:firstColumn="1" w:lastColumn="0" w:oddVBand="0" w:evenVBand="0" w:oddHBand="0" w:evenHBand="0" w:firstRowFirstColumn="0" w:firstRowLastColumn="0" w:lastRowFirstColumn="0" w:lastRowLastColumn="0"/>
+            <w:tcW w:w="2127" w:type="dxa"/>
+          </w:tcPr>
+          <w:p>
+            <w:pPr>
+              <w:rPr>
+                <w:b w:val="0"/>
+                <w:bCs w:val="0"/>
+              </w:rPr>
+            </w:pPr>
+            <w:r>
+              <w:rPr>
+                <w:b w:val="0"/>
+                <w:bCs w:val="0"/>
+              </w:rPr>
+              <w:t>Evidence</w:t>
+            </w:r>
+          </w:p>
+        </w:tc>
+        <w:tc>
+          <w:tcPr>
+            <w:tcW w:w="6889" w:type="dxa"/>
+          </w:tcPr>
+          <w:p>
+            <w:pPr>
+              <w:cnfStyle w:val="000000000000" w:firstRow="0" w:lastRow="0" w:firstColumn="0" w:lastColumn="0" w:oddVBand="0" w:evenVBand="0" w:oddHBand="0" w:evenHBand="0" w:firstRowFirstColumn="0" w:firstRowLastColumn="0" w:lastRowFirstColumn="0" w:lastRowLastColumn="0"/>
+            </w:pPr>
+            <w:r>
+              <w:t>PED v1.0’s NFR-002 row</w:t>
+            </w:r>
+            <w:r>
+              <w:t xml:space="preserve"> in the NFR table and acceptance criteria table, this de</w:t>
+            </w:r>
+            <w:r>
+              <w:t>cision log item serves as the deferral’s record.</w:t>
+            </w:r>
+          </w:p>
+        </w:tc>
+      </w:tr>
+      <w:tr>
+        <w:trPr>
+          <w:cnfStyle w:val="000000100000" w:firstRow="0" w:lastRow="0" w:firstColumn="0" w:lastColumn="0" w:oddVBand="0" w:evenVBand="0" w:oddHBand="1" w:evenHBand="0" w:firstRowFirstColumn="0" w:firstRowLastColumn="0" w:lastRowFirstColumn="0" w:lastRowLastColumn="0"/>
+        </w:trPr>
+        <w:tc>
+          <w:tcPr>
+            <w:cnfStyle w:val="001000000000" w:firstRow="0" w:lastRow="0" w:firstColumn="1" w:lastColumn="0" w:oddVBand="0" w:evenVBand="0" w:oddHBand="0" w:evenHBand="0" w:firstRowFirstColumn="0" w:firstRowLastColumn="0" w:lastRowFirstColumn="0" w:lastRowLastColumn="0"/>
+            <w:tcW w:w="2127" w:type="dxa"/>
+          </w:tcPr>
+          <w:p>
+            <w:pPr>
+              <w:rPr>
+                <w:b w:val="0"/>
+                <w:bCs w:val="0"/>
+              </w:rPr>
+            </w:pPr>
+            <w:r>
+              <w:rPr>
+                <w:b w:val="0"/>
+                <w:bCs w:val="0"/>
+              </w:rPr>
+              <w:t>Later consequence</w:t>
+            </w:r>
+          </w:p>
+        </w:tc>
+        <w:tc>
+          <w:tcPr>
+            <w:tcW w:w="6889" w:type="dxa"/>
+          </w:tcPr>
+          <w:p>
+            <w:pPr>
+              <w:cnfStyle w:val="000000100000" w:firstRow="0" w:lastRow="0" w:firstColumn="0" w:lastColumn="0" w:oddVBand="0" w:evenVBand="0" w:oddHBand="1" w:evenHBand="0" w:firstRowFirstColumn="0" w:firstRowLastColumn="0" w:lastRowFirstColumn="0" w:lastRowLastColumn="0"/>
+            </w:pPr>
+            <w:r>
+              <w:t xml:space="preserve">Once hosting has been selected, note the actual threshold and verify if 2 seconds/200 requests </w:t>
+            </w:r>
+            <w:proofErr w:type="gramStart"/>
+            <w:r>
+              <w:t>was</w:t>
+            </w:r>
+            <w:proofErr w:type="gramEnd"/>
+            <w:r>
+              <w:t xml:space="preserve"> reasonable.</w:t>
+            </w:r>
+          </w:p>
+        </w:tc>
+      </w:tr>
+    </w:tbl>
     <w:p>
       <w:pPr>
         <w:pStyle w:val="Heading1"/>
       </w:pPr>
       <w:r>
+        <w:lastRenderedPageBreak/>
         <w:t>AI usage Register</w:t>
       </w:r>
+      <w:bookmarkEnd w:id="13"/>
     </w:p>
+    <w:tbl>
+      <w:tblPr>
+        <w:tblStyle w:val="GridTable2"/>
+        <w:tblW w:w="0" w:type="auto"/>
+        <w:tblLook w:val="04A0" w:firstRow="1" w:lastRow="0" w:firstColumn="1" w:lastColumn="0" w:noHBand="0" w:noVBand="1"/>
+      </w:tblPr>
+      <w:tblGrid>
+        <w:gridCol w:w="1013"/>
+        <w:gridCol w:w="1539"/>
+        <w:gridCol w:w="1459"/>
+        <w:gridCol w:w="1355"/>
+        <w:gridCol w:w="1667"/>
+        <w:gridCol w:w="1993"/>
+      </w:tblGrid>
+      <w:tr>
+        <w:trPr>
+          <w:cnfStyle w:val="100000000000" w:firstRow="1" w:lastRow="0" w:firstColumn="0" w:lastColumn="0" w:oddVBand="0" w:evenVBand="0" w:oddHBand="0" w:evenHBand="0" w:firstRowFirstColumn="0" w:firstRowLastColumn="0" w:lastRowFirstColumn="0" w:lastRowLastColumn="0"/>
+        </w:trPr>
+        <w:tc>
+          <w:tcPr>
+            <w:cnfStyle w:val="001000000000" w:firstRow="0" w:lastRow="0" w:firstColumn="1" w:lastColumn="0" w:oddVBand="0" w:evenVBand="0" w:oddHBand="0" w:evenHBand="0" w:firstRowFirstColumn="0" w:firstRowLastColumn="0" w:lastRowFirstColumn="0" w:lastRowLastColumn="0"/>
+            <w:tcW w:w="991" w:type="dxa"/>
+          </w:tcPr>
+          <w:p>
+            <w:r>
+              <w:t xml:space="preserve">Student </w:t>
+            </w:r>
+          </w:p>
+        </w:tc>
+        <w:tc>
+          <w:tcPr>
+            <w:tcW w:w="1578" w:type="dxa"/>
+          </w:tcPr>
+          <w:p>
+            <w:pPr>
+              <w:cnfStyle w:val="100000000000" w:firstRow="1" w:lastRow="0" w:firstColumn="0" w:lastColumn="0" w:oddVBand="0" w:evenVBand="0" w:oddHBand="0" w:evenHBand="0" w:firstRowFirstColumn="0" w:firstRowLastColumn="0" w:lastRowFirstColumn="0" w:lastRowLastColumn="0"/>
+            </w:pPr>
+            <w:r>
+              <w:t>Tool</w:t>
+            </w:r>
+          </w:p>
+        </w:tc>
+        <w:tc>
+          <w:tcPr>
+            <w:tcW w:w="1495" w:type="dxa"/>
+          </w:tcPr>
+          <w:p>
+            <w:pPr>
+              <w:cnfStyle w:val="100000000000" w:firstRow="1" w:lastRow="0" w:firstColumn="0" w:lastColumn="0" w:oddVBand="0" w:evenVBand="0" w:oddHBand="0" w:evenHBand="0" w:firstRowFirstColumn="0" w:firstRowLastColumn="0" w:lastRowFirstColumn="0" w:lastRowLastColumn="0"/>
+            </w:pPr>
+            <w:r>
+              <w:t xml:space="preserve">Purpose </w:t>
+            </w:r>
+          </w:p>
+        </w:tc>
+        <w:tc>
+          <w:tcPr>
+            <w:tcW w:w="1388" w:type="dxa"/>
+          </w:tcPr>
+          <w:p>
+            <w:pPr>
+              <w:cnfStyle w:val="100000000000" w:firstRow="1" w:lastRow="0" w:firstColumn="0" w:lastColumn="0" w:oddVBand="0" w:evenVBand="0" w:oddHBand="0" w:evenHBand="0" w:firstRowFirstColumn="0" w:firstRowLastColumn="0" w:lastRowFirstColumn="0" w:lastRowLastColumn="0"/>
+            </w:pPr>
+            <w:r>
+              <w:t>Output used</w:t>
+            </w:r>
+          </w:p>
+        </w:tc>
+        <w:tc>
+          <w:tcPr>
+            <w:tcW w:w="1622" w:type="dxa"/>
+          </w:tcPr>
+          <w:p>
+            <w:pPr>
+              <w:cnfStyle w:val="100000000000" w:firstRow="1" w:lastRow="0" w:firstColumn="0" w:lastColumn="0" w:oddVBand="0" w:evenVBand="0" w:oddHBand="0" w:evenHBand="0" w:firstRowFirstColumn="0" w:firstRowLastColumn="0" w:lastRowFirstColumn="0" w:lastRowLastColumn="0"/>
+            </w:pPr>
+            <w:r>
+              <w:t>How independently verified</w:t>
+            </w:r>
+          </w:p>
+        </w:tc>
+        <w:tc>
+          <w:tcPr>
+            <w:tcW w:w="1942" w:type="dxa"/>
+          </w:tcPr>
+          <w:p>
+            <w:pPr>
+              <w:cnfStyle w:val="100000000000" w:firstRow="1" w:lastRow="0" w:firstColumn="0" w:lastColumn="0" w:oddVBand="0" w:evenVBand="0" w:oddHBand="0" w:evenHBand="0" w:firstRowFirstColumn="0" w:firstRowLastColumn="0" w:lastRowFirstColumn="0" w:lastRowLastColumn="0"/>
+            </w:pPr>
+            <w:r>
+              <w:t>What was changed/rejected</w:t>
+            </w:r>
+          </w:p>
+        </w:tc>
+      </w:tr>
+      <w:tr>
+        <w:trPr>
+          <w:cnfStyle w:val="000000100000" w:firstRow="0" w:lastRow="0" w:firstColumn="0" w:lastColumn="0" w:oddVBand="0" w:evenVBand="0" w:oddHBand="1" w:evenHBand="0" w:firstRowFirstColumn="0" w:firstRowLastColumn="0" w:lastRowFirstColumn="0" w:lastRowLastColumn="0"/>
+        </w:trPr>
+        <w:tc>
+          <w:tcPr>
+            <w:cnfStyle w:val="001000000000" w:firstRow="0" w:lastRow="0" w:firstColumn="1" w:lastColumn="0" w:oddVBand="0" w:evenVBand="0" w:oddHBand="0" w:evenHBand="0" w:firstRowFirstColumn="0" w:firstRowLastColumn="0" w:lastRowFirstColumn="0" w:lastRowLastColumn="0"/>
+            <w:tcW w:w="991" w:type="dxa"/>
+          </w:tcPr>
+          <w:p>
+            <w:r>
+              <w:t>Freerk</w:t>
+            </w:r>
+          </w:p>
+        </w:tc>
+        <w:tc>
+          <w:tcPr>
+            <w:tcW w:w="1578" w:type="dxa"/>
+          </w:tcPr>
+          <w:p>
+            <w:pPr>
+              <w:cnfStyle w:val="000000100000" w:firstRow="0" w:lastRow="0" w:firstColumn="0" w:lastColumn="0" w:oddVBand="0" w:evenVBand="0" w:oddHBand="1" w:evenHBand="0" w:firstRowFirstColumn="0" w:firstRowLastColumn="0" w:lastRowFirstColumn="0" w:lastRowLastColumn="0"/>
+            </w:pPr>
+            <w:r>
+              <w:t>Claude (Anthropic) — brainstorming &amp; structuring assistance</w:t>
+            </w:r>
+          </w:p>
+          <w:p>
+            <w:pPr>
+              <w:cnfStyle w:val="000000100000" w:firstRow="0" w:lastRow="0" w:firstColumn="0" w:lastColumn="0" w:oddVBand="0" w:evenVBand="0" w:oddHBand="1" w:evenHBand="0" w:firstRowFirstColumn="0" w:firstRowLastColumn="0" w:lastRowFirstColumn="0" w:lastRowLastColumn="0"/>
+            </w:pPr>
+          </w:p>
+          <w:p>
+            <w:pPr>
+              <w:cnfStyle w:val="000000100000" w:firstRow="0" w:lastRow="0" w:firstColumn="0" w:lastColumn="0" w:oddVBand="0" w:evenVBand="0" w:oddHBand="1" w:evenHBand="0" w:firstRowFirstColumn="0" w:firstRowLastColumn="0" w:lastRowFirstColumn="0" w:lastRowLastColumn="0"/>
+            </w:pPr>
+            <w:proofErr w:type="spellStart"/>
+            <w:r>
+              <w:t>QuillBot</w:t>
+            </w:r>
+            <w:proofErr w:type="spellEnd"/>
+            <w:r>
+              <w:t xml:space="preserve"> Paraphraser</w:t>
+            </w:r>
+          </w:p>
+        </w:tc>
+        <w:tc>
+          <w:tcPr>
+            <w:tcW w:w="1495" w:type="dxa"/>
+          </w:tcPr>
+          <w:p>
+            <w:pPr>
+              <w:cnfStyle w:val="000000100000" w:firstRow="0" w:lastRow="0" w:firstColumn="0" w:lastColumn="0" w:oddVBand="0" w:evenVBand="0" w:oddHBand="1" w:evenHBand="0" w:firstRowFirstColumn="0" w:firstRowLastColumn="0" w:lastRowFirstColumn="0" w:lastRowLastColumn="0"/>
+            </w:pPr>
+            <w:r>
+              <w:t xml:space="preserve">Claude: </w:t>
+            </w:r>
+            <w:r>
+              <w:t xml:space="preserve">Used to generate a list of candidate real-world </w:t>
+            </w:r>
+            <w:r>
+              <w:t>technology-stack approaches.</w:t>
+            </w:r>
+          </w:p>
+          <w:p>
+            <w:pPr>
+              <w:cnfStyle w:val="000000100000" w:firstRow="0" w:lastRow="0" w:firstColumn="0" w:lastColumn="0" w:oddVBand="0" w:evenVBand="0" w:oddHBand="1" w:evenHBand="0" w:firstRowFirstColumn="0" w:firstRowLastColumn="0" w:lastRowFirstColumn="0" w:lastRowLastColumn="0"/>
+            </w:pPr>
+          </w:p>
+          <w:p>
+            <w:pPr>
+              <w:cnfStyle w:val="000000100000" w:firstRow="0" w:lastRow="0" w:firstColumn="0" w:lastColumn="0" w:oddVBand="0" w:evenVBand="0" w:oddHBand="1" w:evenHBand="0" w:firstRowFirstColumn="0" w:firstRowLastColumn="0" w:lastRowFirstColumn="0" w:lastRowLastColumn="0"/>
+            </w:pPr>
+            <w:proofErr w:type="spellStart"/>
+            <w:r>
+              <w:t>QuillBot</w:t>
+            </w:r>
+            <w:proofErr w:type="spellEnd"/>
+            <w:r>
+              <w:t xml:space="preserve"> Paraphraser: Used to assist with paraphrasing</w:t>
+            </w:r>
+          </w:p>
+        </w:tc>
+        <w:tc>
+          <w:tcPr>
+            <w:tcW w:w="1388" w:type="dxa"/>
+          </w:tcPr>
+          <w:p>
+            <w:pPr>
+              <w:cnfStyle w:val="000000100000" w:firstRow="0" w:lastRow="0" w:firstColumn="0" w:lastColumn="0" w:oddVBand="0" w:evenVBand="0" w:oddHBand="1" w:evenHBand="0" w:firstRowFirstColumn="0" w:firstRowLastColumn="0" w:lastRowFirstColumn="0" w:lastRowLastColumn="0"/>
+            </w:pPr>
+            <w:r>
+              <w:t>Partially — example list and structural suggestions used as a starting point; no AI-generated prose used in the final answer</w:t>
+            </w:r>
+          </w:p>
+        </w:tc>
+        <w:tc>
+          <w:tcPr>
+            <w:tcW w:w="1622" w:type="dxa"/>
+          </w:tcPr>
+          <w:p>
+            <w:pPr>
+              <w:cnfStyle w:val="000000100000" w:firstRow="0" w:lastRow="0" w:firstColumn="0" w:lastColumn="0" w:oddVBand="0" w:evenVBand="0" w:oddHBand="1" w:evenHBand="0" w:firstRowFirstColumn="0" w:firstRowLastColumn="0" w:lastRowFirstColumn="0" w:lastRowLastColumn="0"/>
+            </w:pPr>
+            <w:r>
+              <w:t>Each FR/NFR was checked against the Master Brief Section 3 and 4 to confirm</w:t>
+            </w:r>
+          </w:p>
+        </w:tc>
+        <w:tc>
+          <w:tcPr>
+            <w:tcW w:w="1942" w:type="dxa"/>
+          </w:tcPr>
+          <w:p>
+            <w:pPr>
+              <w:cnfStyle w:val="000000100000" w:firstRow="0" w:lastRow="0" w:firstColumn="0" w:lastColumn="0" w:oddVBand="0" w:evenVBand="0" w:oddHBand="1" w:evenHBand="0" w:firstRowFirstColumn="0" w:firstRowLastColumn="0" w:lastRowFirstColumn="0" w:lastRowLastColumn="0"/>
+            </w:pPr>
+            <w:r>
+              <w:t xml:space="preserve">Rejected AI-suggested wording/analysis; wrote the actual explanation, and </w:t>
+            </w:r>
+            <w:proofErr w:type="spellStart"/>
+            <w:r>
+              <w:t>Decision→trade-off→consequence</w:t>
+            </w:r>
+            <w:proofErr w:type="spellEnd"/>
+            <w:r>
+              <w:t xml:space="preserve"> framing myself</w:t>
+            </w:r>
+          </w:p>
+          <w:p>
+            <w:pPr>
+              <w:cnfStyle w:val="000000100000" w:firstRow="0" w:lastRow="0" w:firstColumn="0" w:lastColumn="0" w:oddVBand="0" w:evenVBand="0" w:oddHBand="1" w:evenHBand="0" w:firstRowFirstColumn="0" w:firstRowLastColumn="0" w:lastRowFirstColumn="0" w:lastRowLastColumn="0"/>
+            </w:pPr>
+          </w:p>
+        </w:tc>
+      </w:tr>
+      <w:tr>
+        <w:tc>
+          <w:tcPr>
+            <w:cnfStyle w:val="001000000000" w:firstRow="0" w:lastRow="0" w:firstColumn="1" w:lastColumn="0" w:oddVBand="0" w:evenVBand="0" w:oddHBand="0" w:evenHBand="0" w:firstRowFirstColumn="0" w:firstRowLastColumn="0" w:lastRowFirstColumn="0" w:lastRowLastColumn="0"/>
+            <w:tcW w:w="991" w:type="dxa"/>
+          </w:tcPr>
+          <w:p/>
+        </w:tc>
+        <w:tc>
+          <w:tcPr>
+            <w:tcW w:w="1578" w:type="dxa"/>
+          </w:tcPr>
+          <w:p>
+            <w:pPr>
+              <w:cnfStyle w:val="000000000000" w:firstRow="0" w:lastRow="0" w:firstColumn="0" w:lastColumn="0" w:oddVBand="0" w:evenVBand="0" w:oddHBand="0" w:evenHBand="0" w:firstRowFirstColumn="0" w:firstRowLastColumn="0" w:lastRowFirstColumn="0" w:lastRowLastColumn="0"/>
+            </w:pPr>
+          </w:p>
+        </w:tc>
+        <w:tc>
+          <w:tcPr>
+            <w:tcW w:w="1495" w:type="dxa"/>
+          </w:tcPr>
+          <w:p>
+            <w:pPr>
+              <w:cnfStyle w:val="000000000000" w:firstRow="0" w:lastRow="0" w:firstColumn="0" w:lastColumn="0" w:oddVBand="0" w:evenVBand="0" w:oddHBand="0" w:evenHBand="0" w:firstRowFirstColumn="0" w:firstRowLastColumn="0" w:lastRowFirstColumn="0" w:lastRowLastColumn="0"/>
+            </w:pPr>
+          </w:p>
+        </w:tc>
+        <w:tc>
+          <w:tcPr>
+            <w:tcW w:w="1388" w:type="dxa"/>
+          </w:tcPr>
+          <w:p>
+            <w:pPr>
+              <w:cnfStyle w:val="000000000000" w:firstRow="0" w:lastRow="0" w:firstColumn="0" w:lastColumn="0" w:oddVBand="0" w:evenVBand="0" w:oddHBand="0" w:evenHBand="0" w:firstRowFirstColumn="0" w:firstRowLastColumn="0" w:lastRowFirstColumn="0" w:lastRowLastColumn="0"/>
+            </w:pPr>
+          </w:p>
+        </w:tc>
+        <w:tc>
+          <w:tcPr>
+            <w:tcW w:w="1622" w:type="dxa"/>
+          </w:tcPr>
+          <w:p>
+            <w:pPr>
+              <w:cnfStyle w:val="000000000000" w:firstRow="0" w:lastRow="0" w:firstColumn="0" w:lastColumn="0" w:oddVBand="0" w:evenVBand="0" w:oddHBand="0" w:evenHBand="0" w:firstRowFirstColumn="0" w:firstRowLastColumn="0" w:lastRowFirstColumn="0" w:lastRowLastColumn="0"/>
+            </w:pPr>
+          </w:p>
+        </w:tc>
+        <w:tc>
+          <w:tcPr>
+            <w:tcW w:w="1942" w:type="dxa"/>
+          </w:tcPr>
+          <w:p>
+            <w:pPr>
+              <w:cnfStyle w:val="000000000000" w:firstRow="0" w:lastRow="0" w:firstColumn="0" w:lastColumn="0" w:oddVBand="0" w:evenVBand="0" w:oddHBand="0" w:evenHBand="0" w:firstRowFirstColumn="0" w:firstRowLastColumn="0" w:lastRowFirstColumn="0" w:lastRowLastColumn="0"/>
+            </w:pPr>
+          </w:p>
+        </w:tc>
+      </w:tr>
+      <w:tr>
+        <w:trPr>
+          <w:cnfStyle w:val="000000100000" w:firstRow="0" w:lastRow="0" w:firstColumn="0" w:lastColumn="0" w:oddVBand="0" w:evenVBand="0" w:oddHBand="1" w:evenHBand="0" w:firstRowFirstColumn="0" w:firstRowLastColumn="0" w:lastRowFirstColumn="0" w:lastRowLastColumn="0"/>
+        </w:trPr>
+        <w:tc>
+          <w:tcPr>
+            <w:cnfStyle w:val="001000000000" w:firstRow="0" w:lastRow="0" w:firstColumn="1" w:lastColumn="0" w:oddVBand="0" w:evenVBand="0" w:oddHBand="0" w:evenHBand="0" w:firstRowFirstColumn="0" w:firstRowLastColumn="0" w:lastRowFirstColumn="0" w:lastRowLastColumn="0"/>
+            <w:tcW w:w="991" w:type="dxa"/>
+          </w:tcPr>
+          <w:p/>
+        </w:tc>
+        <w:tc>
+          <w:tcPr>
+            <w:tcW w:w="1578" w:type="dxa"/>
+          </w:tcPr>
+          <w:p>
+            <w:pPr>
+              <w:cnfStyle w:val="000000100000" w:firstRow="0" w:lastRow="0" w:firstColumn="0" w:lastColumn="0" w:oddVBand="0" w:evenVBand="0" w:oddHBand="1" w:evenHBand="0" w:firstRowFirstColumn="0" w:firstRowLastColumn="0" w:lastRowFirstColumn="0" w:lastRowLastColumn="0"/>
+            </w:pPr>
+          </w:p>
+        </w:tc>
+        <w:tc>
+          <w:tcPr>
+            <w:tcW w:w="1495" w:type="dxa"/>
+          </w:tcPr>
+          <w:p>
+            <w:pPr>
+              <w:cnfStyle w:val="000000100000" w:firstRow="0" w:lastRow="0" w:firstColumn="0" w:lastColumn="0" w:oddVBand="0" w:evenVBand="0" w:oddHBand="1" w:evenHBand="0" w:firstRowFirstColumn="0" w:firstRowLastColumn="0" w:lastRowFirstColumn="0" w:lastRowLastColumn="0"/>
+            </w:pPr>
+          </w:p>
+        </w:tc>
+        <w:tc>
+          <w:tcPr>
+            <w:tcW w:w="1388" w:type="dxa"/>
+          </w:tcPr>
+          <w:p>
+            <w:pPr>
+              <w:cnfStyle w:val="000000100000" w:firstRow="0" w:lastRow="0" w:firstColumn="0" w:lastColumn="0" w:oddVBand="0" w:evenVBand="0" w:oddHBand="1" w:evenHBand="0" w:firstRowFirstColumn="0" w:firstRowLastColumn="0" w:lastRowFirstColumn="0" w:lastRowLastColumn="0"/>
+            </w:pPr>
+          </w:p>
+        </w:tc>
+        <w:tc>
+          <w:tcPr>
+            <w:tcW w:w="1622" w:type="dxa"/>
+          </w:tcPr>
+          <w:p>
+            <w:pPr>
+              <w:cnfStyle w:val="000000100000" w:firstRow="0" w:lastRow="0" w:firstColumn="0" w:lastColumn="0" w:oddVBand="0" w:evenVBand="0" w:oddHBand="1" w:evenHBand="0" w:firstRowFirstColumn="0" w:firstRowLastColumn="0" w:lastRowFirstColumn="0" w:lastRowLastColumn="0"/>
+            </w:pPr>
+          </w:p>
+        </w:tc>
+        <w:tc>
+          <w:tcPr>
+            <w:tcW w:w="1942" w:type="dxa"/>
+          </w:tcPr>
+          <w:p>
+            <w:pPr>
+              <w:cnfStyle w:val="000000100000" w:firstRow="0" w:lastRow="0" w:firstColumn="0" w:lastColumn="0" w:oddVBand="0" w:evenVBand="0" w:oddHBand="1" w:evenHBand="0" w:firstRowFirstColumn="0" w:firstRowLastColumn="0" w:lastRowFirstColumn="0" w:lastRowLastColumn="0"/>
+            </w:pPr>
+          </w:p>
+        </w:tc>
+      </w:tr>
+    </w:tbl>
+    <w:p/>
     <w:p>
       <w:pPr>
         <w:pStyle w:val="Heading1"/>
       </w:pPr>
+      <w:bookmarkStart w:id="14" w:name="_Toc239857448"/>
       <w:r>
         <w:t>Sign off</w:t>
       </w:r>
+      <w:bookmarkEnd w:id="14"/>
     </w:p>
     <w:p/>
     <w:sectPr>
@@ -5457,12 +7358,132 @@
       </w:r>
     </w:p>
   </w:footnote>
+  <w:footnote w:id="2">
+    <w:p>
+      <w:pPr>
+        <w:pStyle w:val="FootnoteText"/>
+        <w:rPr>
+          <w:lang w:val="en-US"/>
+        </w:rPr>
+      </w:pPr>
+      <w:r>
+        <w:rPr>
+          <w:rStyle w:val="FootnoteReference"/>
+        </w:rPr>
+        <w:footnoteRef/>
+      </w:r>
+      <w:r>
+        <w:t xml:space="preserve"> </w:t>
+      </w:r>
+      <w:r>
+        <w:rPr>
+          <w:lang w:val="en-US"/>
+        </w:rPr>
+        <w:t xml:space="preserve">Subject to </w:t>
+      </w:r>
+      <w:r>
+        <w:rPr>
+          <w:lang w:val="en-US"/>
+        </w:rPr>
+        <w:t>change once hosting/architecture is selected in later milestones.</w:t>
+      </w:r>
+    </w:p>
+  </w:footnote>
 </w:footnotes>
 </file>
 
 <file path=word/numbering.xml><?xml version="1.0" encoding="utf-8"?>
 <w:numbering xmlns:wpc="http://schemas.microsoft.com/office/word/2010/wordprocessingCanvas" xmlns:cx="http://schemas.microsoft.com/office/drawing/2014/chartex" xmlns:cx1="http://schemas.microsoft.com/office/drawing/2015/9/8/chartex" xmlns:cx2="http://schemas.microsoft.com/office/drawing/2015/10/21/chartex" xmlns:cx3="http://schemas.microsoft.com/office/drawing/2016/5/9/chartex" xmlns:cx4="http://schemas.microsoft.com/office/drawing/2016/5/10/chartex" xmlns:cx5="http://schemas.microsoft.com/office/drawing/2016/5/11/chartex" xmlns:cx6="http://schemas.microsoft.com/office/drawing/2016/5/12/chartex" xmlns:cx7="http://schemas.microsoft.com/office/drawing/2016/5/13/chartex" xmlns:cx8="http://schemas.microsoft.com/office/drawing/2016/5/14/chartex" xmlns:mc="http://schemas.openxmlformats.org/markup-compatibility/2006" xmlns:aink="http://schemas.microsoft.com/office/drawing/2016/ink" xmlns:am3d="http://schemas.microsoft.com/office/drawing/2017/model3d" xmlns:o="urn:schemas-microsoft-com:office:office" xmlns:oel="http://schemas.microsoft.com/office/2019/extlst" xmlns:r="http://schemas.openxmlformats.org/officeDocument/2006/relationships" xmlns:m="http://schemas.openxmlformats.org/officeDocument/2006/math" xmlns:v="urn:schemas-microsoft-com:vml" xmlns:wp14="http://schemas.microsoft.com/office/word/2010/wordprocessingDrawing" xmlns:wp="http://schemas.openxmlformats.org/drawingml/2006/wordprocessingDrawing" xmlns:w10="urn:schemas-microsoft-com:office:word" xmlns:w="http://schemas.openxmlformats.org/wordprocessingml/2006/main" xmlns:w14="http://schemas.microsoft.com/office/word/2010/wordml" xmlns:w15="http://schemas.microsoft.com/office/word/2012/wordml" xmlns:w16cex="http://schemas.microsoft.com/office/word/2018/wordml/cex" xmlns:w16cid="http://schemas.microsoft.com/office/word/2016/wordml/cid" xmlns:w16="http://schemas.microsoft.com/office/word/2018/wordml" xmlns:w16du="http://schemas.microsoft.com/office/word/2023/wordml/word16du" xmlns:w16sdtdh="http://schemas.microsoft.com/office/word/2020/wordml/sdtdatahash" xmlns:w16sdtfl="http://schemas.microsoft.com/office/word/2024/wordml/sdtformatlock" xmlns:w16se="http://schemas.microsoft.com/office/word/2015/wordml/symex" xmlns:wpg="http://schemas.microsoft.com/office/word/2010/wordprocessingGroup" xmlns:wpi="http://schemas.microsoft.com/office/word/2010/wordprocessingInk" xmlns:wne="http://schemas.microsoft.com/office/word/2006/wordml" xmlns:wps="http://schemas.microsoft.com/office/word/2010/wordprocessingShape" mc:Ignorable="w14 w15 w16se w16cid w16 w16cex w16sdtdh w16sdtfl w16du wp14">
   <w:abstractNum w:abstractNumId="0" w15:restartNumberingAfterBreak="0">
+    <w:nsid w:val="0F986699"/>
+    <w:multiLevelType w:val="hybridMultilevel"/>
+    <w:tmpl w:val="0772EB48"/>
+    <w:lvl w:ilvl="0" w:tplc="E2EE5FEA">
+      <w:start w:val="1"/>
+      <w:numFmt w:val="decimal"/>
+      <w:lvlText w:val="(%1)"/>
+      <w:lvlJc w:val="left"/>
+      <w:pPr>
+        <w:ind w:left="720" w:hanging="360"/>
+      </w:pPr>
+      <w:rPr>
+        <w:rFonts w:hint="default"/>
+      </w:rPr>
+    </w:lvl>
+    <w:lvl w:ilvl="1" w:tplc="04090019" w:tentative="1">
+      <w:start w:val="1"/>
+      <w:numFmt w:val="lowerLetter"/>
+      <w:lvlText w:val="%2."/>
+      <w:lvlJc w:val="left"/>
+      <w:pPr>
+        <w:ind w:left="1440" w:hanging="360"/>
+      </w:pPr>
+    </w:lvl>
+    <w:lvl w:ilvl="2" w:tplc="0409001B" w:tentative="1">
+      <w:start w:val="1"/>
+      <w:numFmt w:val="lowerRoman"/>
+      <w:lvlText w:val="%3."/>
+      <w:lvlJc w:val="right"/>
+      <w:pPr>
+        <w:ind w:left="2160" w:hanging="180"/>
+      </w:pPr>
+    </w:lvl>
+    <w:lvl w:ilvl="3" w:tplc="0409000F" w:tentative="1">
+      <w:start w:val="1"/>
+      <w:numFmt w:val="decimal"/>
+      <w:lvlText w:val="%4."/>
+      <w:lvlJc w:val="left"/>
+      <w:pPr>
+        <w:ind w:left="2880" w:hanging="360"/>
+      </w:pPr>
+    </w:lvl>
+    <w:lvl w:ilvl="4" w:tplc="04090019" w:tentative="1">
+      <w:start w:val="1"/>
+      <w:numFmt w:val="lowerLetter"/>
+      <w:lvlText w:val="%5."/>
+      <w:lvlJc w:val="left"/>
+      <w:pPr>
+        <w:ind w:left="3600" w:hanging="360"/>
+      </w:pPr>
+    </w:lvl>
+    <w:lvl w:ilvl="5" w:tplc="0409001B" w:tentative="1">
+      <w:start w:val="1"/>
+      <w:numFmt w:val="lowerRoman"/>
+      <w:lvlText w:val="%6."/>
+      <w:lvlJc w:val="right"/>
+      <w:pPr>
+        <w:ind w:left="4320" w:hanging="180"/>
+      </w:pPr>
+    </w:lvl>
+    <w:lvl w:ilvl="6" w:tplc="0409000F" w:tentative="1">
+      <w:start w:val="1"/>
+      <w:numFmt w:val="decimal"/>
+      <w:lvlText w:val="%7."/>
+      <w:lvlJc w:val="left"/>
+      <w:pPr>
+        <w:ind w:left="5040" w:hanging="360"/>
+      </w:pPr>
+    </w:lvl>
+    <w:lvl w:ilvl="7" w:tplc="04090019" w:tentative="1">
+      <w:start w:val="1"/>
+      <w:numFmt w:val="lowerLetter"/>
+      <w:lvlText w:val="%8."/>
+      <w:lvlJc w:val="left"/>
+      <w:pPr>
+        <w:ind w:left="5760" w:hanging="360"/>
+      </w:pPr>
+    </w:lvl>
+    <w:lvl w:ilvl="8" w:tplc="0409001B" w:tentative="1">
+      <w:start w:val="1"/>
+      <w:numFmt w:val="lowerRoman"/>
+      <w:lvlText w:val="%9."/>
+      <w:lvlJc w:val="right"/>
+      <w:pPr>
+        <w:ind w:left="6480" w:hanging="180"/>
+      </w:pPr>
+    </w:lvl>
+  </w:abstractNum>
+  <w:abstractNum w:abstractNumId="1" w15:restartNumberingAfterBreak="0">
     <w:nsid w:val="661A3109"/>
     <w:multiLevelType w:val="hybridMultilevel"/>
     <w:tmpl w:val="B94292DC"/>
@@ -5549,6 +7570,9 @@
     </w:lvl>
   </w:abstractNum>
   <w:num w:numId="1" w16cid:durableId="1611619726">
+    <w:abstractNumId w:val="1"/>
+  </w:num>
+  <w:num w:numId="2" w16cid:durableId="8144362">
     <w:abstractNumId w:val="0"/>
   </w:num>
 </w:numbering>
@@ -6827,6 +8851,31 @@
       </w:tcPr>
     </w:tblStylePr>
   </w:style>
+  <w:style w:type="paragraph" w:styleId="TOC1">
+    <w:name w:val="toc 1"/>
+    <w:basedOn w:val="Normal"/>
+    <w:next w:val="Normal"/>
+    <w:autoRedefine/>
+    <w:uiPriority w:val="39"/>
+    <w:unhideWhenUsed/>
+    <w:rsid w:val="006A233B"/>
+    <w:pPr>
+      <w:spacing w:after="100"/>
+    </w:pPr>
+  </w:style>
+  <w:style w:type="paragraph" w:styleId="TOC2">
+    <w:name w:val="toc 2"/>
+    <w:basedOn w:val="Normal"/>
+    <w:next w:val="Normal"/>
+    <w:autoRedefine/>
+    <w:uiPriority w:val="39"/>
+    <w:unhideWhenUsed/>
+    <w:rsid w:val="006A233B"/>
+    <w:pPr>
+      <w:spacing w:after="100"/>
+      <w:ind w:left="240"/>
+    </w:pPr>
+  </w:style>
 </w:styles>
 </file>
 
@@ -6903,18 +8952,18 @@
 
 <file path=word/glossary/fontTable.xml><?xml version="1.0" encoding="utf-8"?>
 <w:fonts xmlns:mc="http://schemas.openxmlformats.org/markup-compatibility/2006" xmlns:r="http://schemas.openxmlformats.org/officeDocument/2006/relationships" xmlns:w="http://schemas.openxmlformats.org/wordprocessingml/2006/main" xmlns:w14="http://schemas.microsoft.com/office/word/2010/wordml" xmlns:w15="http://schemas.microsoft.com/office/word/2012/wordml" xmlns:w16cex="http://schemas.microsoft.com/office/word/2018/wordml/cex" xmlns:w16cid="http://schemas.microsoft.com/office/word/2016/wordml/cid" xmlns:w16="http://schemas.microsoft.com/office/word/2018/wordml" xmlns:w16du="http://schemas.microsoft.com/office/word/2023/wordml/word16du" xmlns:w16sdtdh="http://schemas.microsoft.com/office/word/2020/wordml/sdtdatahash" xmlns:w16sdtfl="http://schemas.microsoft.com/office/word/2024/wordml/sdtformatlock" xmlns:w16se="http://schemas.microsoft.com/office/word/2015/wordml/symex" mc:Ignorable="w14 w15 w16se w16cid w16 w16cex w16sdtdh w16sdtfl w16du">
-  <w:font w:name="Aptos">
-    <w:charset w:val="00"/>
-    <w:family w:val="swiss"/>
-    <w:pitch w:val="variable"/>
-    <w:sig w:usb0="20000287" w:usb1="00000003" w:usb2="00000000" w:usb3="00000000" w:csb0="0000019F" w:csb1="00000000"/>
-  </w:font>
   <w:font w:name="Times New Roman">
     <w:panose1 w:val="02020603050405020304"/>
     <w:charset w:val="00"/>
     <w:family w:val="roman"/>
     <w:pitch w:val="variable"/>
     <w:sig w:usb0="E0002EFF" w:usb1="C000785B" w:usb2="00000009" w:usb3="00000000" w:csb0="000001FF" w:csb1="00000000"/>
+  </w:font>
+  <w:font w:name="Aptos">
+    <w:charset w:val="00"/>
+    <w:family w:val="swiss"/>
+    <w:pitch w:val="variable"/>
+    <w:sig w:usb0="20000287" w:usb1="00000003" w:usb2="00000000" w:usb3="00000000" w:csb0="0000019F" w:csb1="00000000"/>
   </w:font>
   <w:font w:name="Aptos Display">
     <w:charset w:val="00"/>
@@ -6948,7 +8997,9 @@
     <w:rsid w:val="006C106A"/>
     <w:rsid w:val="00A06FF3"/>
     <w:rsid w:val="00B13C9E"/>
+    <w:rsid w:val="00B26BF1"/>
     <w:rsid w:val="00BB3F3C"/>
+    <w:rsid w:val="00CE7E5B"/>
     <w:rsid w:val="00E3330B"/>
     <w:rsid w:val="00ED1F7E"/>
     <w:rsid w:val="00F11FC7"/>

</xml_diff>

<commit_message>
Added engineering decision and declared ai useage
</commit_message>
<xml_diff>
--- a/SEN_381_Project_Miletone_1.docx
+++ b/SEN_381_Project_Miletone_1.docx
@@ -3434,13 +3434,7 @@
     </w:p>
     <w:p>
       <w:r>
-        <w:t xml:space="preserve">The team must prefer free or low-cost services where </w:t>
-      </w:r>
-      <w:r>
-        <w:t>practical and</w:t>
-      </w:r>
-      <w:r>
-        <w:t xml:space="preserve"> must identify the limitations of those services rather than assume "free" carries </w:t>
+        <w:t xml:space="preserve">The team must prefer free or low-cost services where practical and must identify the limitations of those services rather than assume "free" carries </w:t>
       </w:r>
       <w:r>
         <w:t xml:space="preserve">and </w:t>
@@ -3566,6 +3560,173 @@
       <w:bookmarkEnd w:id="22"/>
     </w:p>
     <w:p>
+      <w:r>
+        <w:t xml:space="preserve">Decision ID: </w:t>
+      </w:r>
+      <w:r>
+        <w:t>DEC-001</w:t>
+      </w:r>
+    </w:p>
+    <w:p>
+      <w:r>
+        <w:t>Context:</w:t>
+      </w:r>
+      <w:r>
+        <w:t xml:space="preserve"> </w:t>
+      </w:r>
+      <w:r>
+        <w:t xml:space="preserve">The team needed to decide how </w:t>
+      </w:r>
+      <w:r>
+        <w:t>r</w:t>
+      </w:r>
+      <w:r>
+        <w:t xml:space="preserve">equesters would be notified when their request status changes, </w:t>
+      </w:r>
+      <w:r>
+        <w:t>to</w:t>
+      </w:r>
+      <w:r>
+        <w:t xml:space="preserve"> satisfy the </w:t>
+      </w:r>
+      <w:r>
+        <w:t>r</w:t>
+      </w:r>
+      <w:r>
+        <w:t>equester need for visibility without overloading Staff with manual update work.</w:t>
+      </w:r>
+    </w:p>
+    <w:p>
+      <w:r>
+        <w:t xml:space="preserve">Constraints: </w:t>
+      </w:r>
+      <w:r>
+        <w:t>Cost/Resources constraint (prefer free/low-cost services)</w:t>
+      </w:r>
+      <w:r>
+        <w:t xml:space="preserve">, </w:t>
+      </w:r>
+      <w:r>
+        <w:t>Scope constraint (avoid unjustified feature complexity)</w:t>
+      </w:r>
+    </w:p>
+    <w:p>
+      <w:r>
+        <w:t xml:space="preserve">Alternatives: </w:t>
+      </w:r>
+      <w:r>
+        <w:t>(1) SMS notifications via a third-party gateway (e.g. Twilio)</w:t>
+      </w:r>
+      <w:r>
+        <w:t xml:space="preserve">, </w:t>
+      </w:r>
+      <w:r>
+        <w:t xml:space="preserve">(2) In-app + email notifications </w:t>
+      </w:r>
+      <w:r>
+        <w:t>only</w:t>
+      </w:r>
+      <w:r>
+        <w:t xml:space="preserve">, </w:t>
+      </w:r>
+      <w:r>
+        <w:t>(</w:t>
+      </w:r>
+      <w:r>
+        <w:t xml:space="preserve">3) No automated </w:t>
+      </w:r>
+      <w:r>
+        <w:t>notification</w:t>
+      </w:r>
+      <w:r>
+        <w:t xml:space="preserve">, </w:t>
+      </w:r>
+      <w:r>
+        <w:t>requester</w:t>
+      </w:r>
+      <w:r>
+        <w:t xml:space="preserve"> must manually check status</w:t>
+      </w:r>
+      <w:r>
+        <w:t>.</w:t>
+      </w:r>
+    </w:p>
+    <w:p>
+      <w:r>
+        <w:t xml:space="preserve">Decision: </w:t>
+      </w:r>
+      <w:r>
+        <w:t>Use in-app and email notifications only</w:t>
+      </w:r>
+      <w:r>
+        <w:t>,</w:t>
+      </w:r>
+      <w:r>
+        <w:t xml:space="preserve"> SMS notifications excluded from scope</w:t>
+      </w:r>
+      <w:r>
+        <w:t>.</w:t>
+      </w:r>
+    </w:p>
+    <w:p>
+      <w:r>
+        <w:t xml:space="preserve">Rationale: </w:t>
+      </w:r>
+      <w:r>
+        <w:t>SMS requires a paid gateway service, which conflicts with the project's cost constraint of preferring free-tier services. Email and in-app notification satisfy the same underlying stakeholder need confirmation that a request wasn't lost without introducing a recurring operational cost or an external paid dependency. Option 3 (no automated notification) was rejected because it fails to address the core business problem of poor requester visibility identified in the problem statement.</w:t>
+      </w:r>
+    </w:p>
+    <w:p>
+      <w:r>
+        <w:t xml:space="preserve">Trade-offs: </w:t>
+      </w:r>
+      <w:r>
+        <w:t>Requesters without regular access to email/the platform may experience slower awareness of status changes compared to SMS. This is accepted as a reasonable trade-off given the cost constraint.</w:t>
+      </w:r>
+    </w:p>
+    <w:p>
+      <w:r>
+        <w:t xml:space="preserve">Risks: </w:t>
+      </w:r>
+      <w:r>
+        <w:t>Requesters who don't check email/app promptly may perceive the system as unresponsive even when status updates are occurring correctly.</w:t>
+      </w:r>
+    </w:p>
+    <w:p>
+      <w:r>
+        <w:t xml:space="preserve">Evidence: </w:t>
+      </w:r>
+      <w:r>
+        <w:t>Cost/Resources constraint (PED Constraints)</w:t>
+      </w:r>
+      <w:r>
+        <w:t xml:space="preserve">, </w:t>
+      </w:r>
+      <w:r>
+        <w:t>Scope Baseline exclusion (PED Scope, Out of Scope)</w:t>
+      </w:r>
+      <w:r>
+        <w:t xml:space="preserve">, </w:t>
+      </w:r>
+      <w:r>
+        <w:t>Stakeholder need — Requester "know it wasn't lost" (Stakeholder Analysis)</w:t>
+      </w:r>
+      <w:r>
+        <w:t>.</w:t>
+      </w:r>
+    </w:p>
+    <w:p>
+      <w:r>
+        <w:lastRenderedPageBreak/>
+        <w:t>Later consequences: T</w:t>
+      </w:r>
+      <w:r>
+        <w:t>o be revisited at M2 when notification implementation approach is selected, and at M4 if operational cost/usage evidence suggests SMS should be reconsidered.</w:t>
+      </w:r>
+    </w:p>
+    <w:p/>
+    <w:p/>
+    <w:p>
       <w:pPr>
         <w:pStyle w:val="Heading1"/>
       </w:pPr>
@@ -3574,6 +3735,11 @@
         <w:t>AI usage Register</w:t>
       </w:r>
       <w:bookmarkEnd w:id="23"/>
+    </w:p>
+    <w:p>
+      <w:r>
+        <w:t>Regardt Osler: Used Claude AI to help with formatting and structure.</w:t>
+      </w:r>
     </w:p>
     <w:p>
       <w:pPr>
@@ -5548,6 +5714,7 @@
   </w:compat>
   <w:rsids>
     <w:rsidRoot w:val="006C106A"/>
+    <w:rsid w:val="005840FD"/>
     <w:rsid w:val="005A1859"/>
     <w:rsid w:val="006B59FC"/>
     <w:rsid w:val="006C106A"/>

</xml_diff>